<commit_message>
Entrega S9 (revisión 2): documento maestro con MER, arquitectura de BD, 5 RNF, componentes de IA y prototipo
</commit_message>
<xml_diff>
--- a/docs/FaseII_y_III_Documentacion_Proyecto_Hotel_Reservas.docx
+++ b/docs/FaseII_y_III_Documentacion_Proyecto_Hotel_Reservas.docx
@@ -476,7 +476,7 @@
               <w:fldChar w:fldCharType="begin"/>
               <w:instrText xml:space="preserve"> PAGEREF _TocF3S8 \h </w:instrText>
               <w:fldChar w:fldCharType="separate"/>
-              <w:t>27</w:t>
+              <w:t>29</w:t>
               <w:fldChar w:fldCharType="end"/>
             </w:r>
           </w:hyperlink>
@@ -511,7 +511,7 @@
               <w:fldChar w:fldCharType="begin"/>
               <w:instrText xml:space="preserve"> PAGEREF _TocF3RF \h </w:instrText>
               <w:fldChar w:fldCharType="separate"/>
-              <w:t>30</w:t>
+              <w:t>33</w:t>
               <w:fldChar w:fldCharType="end"/>
             </w:r>
           </w:hyperlink>
@@ -529,7 +529,7 @@
               <w14:ligatures w14:val="standardContextual"/>
             </w:rPr>
           </w:pPr>
-          <w:hyperlink w:anchor="_TocF31002" w:history="1">
+          <w:hyperlink w:anchor="_TocF31005" w:history="1">
             <w:r>
               <w:rPr>
                 <w:rStyle w:val="Hipervnculo"/>
@@ -544,9 +544,9 @@
               </w:rPr>
               <w:tab/>
               <w:fldChar w:fldCharType="begin"/>
-              <w:instrText xml:space="preserve"> PAGEREF _TocF31002 \h </w:instrText>
+              <w:instrText xml:space="preserve"> PAGEREF _TocF31005 \h </w:instrText>
               <w:fldChar w:fldCharType="separate"/>
-              <w:t>32</w:t>
+              <w:t>35</w:t>
               <w:fldChar w:fldCharType="end"/>
             </w:r>
           </w:hyperlink>
@@ -564,7 +564,7 @@
               <w14:ligatures w14:val="standardContextual"/>
             </w:rPr>
           </w:pPr>
-          <w:hyperlink w:anchor="_TocF31003" w:history="1">
+          <w:hyperlink w:anchor="_TocF31006" w:history="1">
             <w:r>
               <w:rPr>
                 <w:rStyle w:val="Hipervnculo"/>
@@ -579,9 +579,9 @@
               </w:rPr>
               <w:tab/>
               <w:fldChar w:fldCharType="begin"/>
-              <w:instrText xml:space="preserve"> PAGEREF _TocF31003 \h </w:instrText>
+              <w:instrText xml:space="preserve"> PAGEREF _TocF31006 \h </w:instrText>
               <w:fldChar w:fldCharType="separate"/>
-              <w:t>33</w:t>
+              <w:t>36</w:t>
               <w:fldChar w:fldCharType="end"/>
             </w:r>
           </w:hyperlink>
@@ -599,7 +599,7 @@
               <w14:ligatures w14:val="standardContextual"/>
             </w:rPr>
           </w:pPr>
-          <w:hyperlink w:anchor="_TocF31008" w:history="1">
+          <w:hyperlink w:anchor="_TocF31011" w:history="1">
             <w:r>
               <w:rPr>
                 <w:rStyle w:val="Hipervnculo"/>
@@ -614,9 +614,9 @@
               </w:rPr>
               <w:tab/>
               <w:fldChar w:fldCharType="begin"/>
-              <w:instrText xml:space="preserve"> PAGEREF _TocF31008 \h </w:instrText>
+              <w:instrText xml:space="preserve"> PAGEREF _TocF31011 \h </w:instrText>
               <w:fldChar w:fldCharType="separate"/>
-              <w:t>37</w:t>
+              <w:t>40</w:t>
               <w:fldChar w:fldCharType="end"/>
             </w:r>
           </w:hyperlink>
@@ -634,7 +634,7 @@
               <w14:ligatures w14:val="standardContextual"/>
             </w:rPr>
           </w:pPr>
-          <w:hyperlink w:anchor="_TocF31015" w:history="1">
+          <w:hyperlink w:anchor="_TocF31018" w:history="1">
             <w:r>
               <w:rPr>
                 <w:rStyle w:val="Hipervnculo"/>
@@ -649,9 +649,44 @@
               </w:rPr>
               <w:tab/>
               <w:fldChar w:fldCharType="begin"/>
-              <w:instrText xml:space="preserve"> PAGEREF _TocF31015 \h </w:instrText>
+              <w:instrText xml:space="preserve"> PAGEREF _TocF31018 \h </w:instrText>
               <w:fldChar w:fldCharType="separate"/>
-              <w:t>40</w:t>
+              <w:t>43</w:t>
+              <w:fldChar w:fldCharType="end"/>
+            </w:r>
+          </w:hyperlink>
+        </w:p>
+        <w:p>
+          <w:pPr>
+            <w:pStyle w:val="TDC1"/>
+            <w:tabs>
+              <w:tab w:val="right" w:leader="dot" w:pos="9350"/>
+            </w:tabs>
+            <w:rPr>
+              <w:rFonts w:asciiTheme="minorHAnsi" w:eastAsiaTheme="minorEastAsia" w:hAnsiTheme="minorHAnsi" w:cstheme="minorBidi"/>
+              <w:noProof/>
+              <w:kern w:val="2"/>
+              <w14:ligatures w14:val="standardContextual"/>
+            </w:rPr>
+          </w:pPr>
+          <w:hyperlink w:anchor="_TocF31029" w:history="1">
+            <w:r>
+              <w:rPr>
+                <w:rStyle w:val="Hipervnculo"/>
+                <w:noProof/>
+              </w:rPr>
+              <w:t>14. PROTOTIPO</w:t>
+            </w:r>
+            <w:r>
+              <w:rPr>
+                <w:noProof/>
+                <w:webHidden/>
+              </w:rPr>
+              <w:tab/>
+              <w:fldChar w:fldCharType="begin"/>
+              <w:instrText xml:space="preserve"> PAGEREF _TocF31029 \h </w:instrText>
+              <w:fldChar w:fldCharType="separate"/>
+              <w:t>50</w:t>
               <w:fldChar w:fldCharType="end"/>
             </w:r>
           </w:hyperlink>
@@ -686,7 +721,7 @@
               <w:fldChar w:fldCharType="begin"/>
               <w:instrText xml:space="preserve"> PAGEREF _Toc240726554 \h </w:instrText>
               <w:fldChar w:fldCharType="separate"/>
-              <w:t>45</w:t>
+              <w:t>57</w:t>
               <w:fldChar w:fldCharType="end"/>
             </w:r>
           </w:hyperlink>
@@ -721,7 +756,7 @@
               <w:fldChar w:fldCharType="begin"/>
               <w:instrText xml:space="preserve"> PAGEREF _Toc240726555 \h </w:instrText>
               <w:fldChar w:fldCharType="separate"/>
-              <w:t>47</w:t>
+              <w:t>59</w:t>
               <w:fldChar w:fldCharType="end"/>
             </w:r>
           </w:hyperlink>
@@ -998,7 +1033,7 @@
         <w:pStyle w:val="APA"/>
       </w:pPr>
       <w:r>
-        <w:t xml:space="preserve">La Fase II corresponde al análisis y el diseño. Abarca la formulación de objetivos, el modelo de casos de uso, el diagrama de clases, el modelo relacional, la arquitectura de software y la relación trazable entre todos ellos. Es en esta fase donde se toman las decisiones de diseño y se justifican una a una frente a la problemática: el estilo arquitectónico en la sección 4, la plataforma móvil, el lenguaje y el motor de base de datos en la sección 4.5, y los mecanismos de control de concurrencia en la sección 7.2. En esta fase no se desarrollarán la base de datos, la API ni la aplicación operativa, pues su implementación se reserva para las etapas de construcción y pruebas.</w:t>
+        <w:t xml:space="preserve">La Fase II corresponde al análisis y el diseño. Abarca la formulación de objetivos, el modelo de casos de uso, el diagrama de clases, el modelo relacional, la arquitectura de software y la relación trazable entre todos ellos. Es en esta fase donde se toman las decisiones de diseño y se justifican una a una frente a la problemática: el estilo arquitectónico en la sección 4, la plataforma móvil, el lenguaje y el motor de base de datos en la sección 4.5, y los mecanismos de control de concurrencia en la sección 7.4. En esta fase no se desarrollarán la base de datos, la API ni la aplicación operativa, pues su implementación se reserva para las etapas de construcción y pruebas.</w:t>
       </w:r>
     </w:p>
     <w:p>
@@ -1440,7 +1475,7 @@
         <w:pStyle w:val="APA"/>
       </w:pPr>
       <w:r>
-        <w:t xml:space="preserve">Las decisiones tecnológicas se justifican de la misma manera. La interfaz se construye como aplicación móvil Android, distribuida en formato APK, porque la necesidad establece que el personal debe consultar y confirmar disponibilidad desde el lugar del hotel donde se encuentre, y porque el docente de la asignatura recomendó esta modalidad; se descartó una base de datos embebida en el dispositivo (SQLite) porque rompería el registro único y, con él, la garantía frente a la doble reserva. Se elige C# con .NET MAUI para la aplicación y C# con ASP.NET Core Web API para la lógica de negocio porque permiten usar un solo lenguaje en las capas de presentación y de servidor, cuentan con soporte del fabricante y se integran de forma nativa con el motor de datos elegido. Se elige Microsoft SQL Server porque ofrece transacciones explícitas, niveles de aislamiento configurables, bloqueos de fila y el tipo ROWVERSION, que son precisamente los mecanismos que la sección 7.2 emplea para impedir el solapamiento de reservas (Microsoft, 2024a); se descartó MySQL por decisión del equipo y se consideró PostgreSQL como alternativa equivalente, sin ventaja decisiva para este alcance. Ninguna de estas decisiones altera la contextualización de la Fase I; todas responden a ella.</w:t>
+        <w:t xml:space="preserve">Las decisiones tecnológicas se justifican de la misma manera. La interfaz se construye como aplicación móvil Android, distribuida en formato APK, porque la necesidad establece que el personal debe consultar y confirmar disponibilidad desde el lugar del hotel donde se encuentre, y porque el docente de la asignatura recomendó esta modalidad; se descartó una base de datos embebida en el dispositivo (SQLite) porque rompería el registro único y, con él, la garantía frente a la doble reserva. Se elige C# con .NET MAUI para la aplicación y C# con ASP.NET Core Web API para la lógica de negocio porque permiten usar un solo lenguaje en las capas de presentación y de servidor, cuentan con soporte del fabricante y se integran de forma nativa con el motor de datos elegido. Se elige Microsoft SQL Server porque ofrece transacciones explícitas, niveles de aislamiento configurables, bloqueos de fila y el tipo ROWVERSION, que son precisamente los mecanismos que la sección 7.4 emplea para impedir el solapamiento de reservas (Microsoft, 2024a); se descartó MySQL por decisión del equipo y se consideró PostgreSQL como alternativa equivalente, sin ventaja decisiva para este alcance. Ninguna de estas decisiones altera la contextualización de la Fase I; todas responden a ella.</w:t>
       </w:r>
     </w:p>
     <w:p>
@@ -2354,6 +2389,129 @@
     <w:p>
       <w:pPr>
         <w:pStyle w:val="APA"/>
+        <w:rPr>
+          <w:b/>
+          <w:bCs/>
+        </w:rPr>
+      </w:pPr>
+      <w:bookmarkStart w:id="1001" w:name="_TocF31001"/>
+      <w:r>
+        <w:rPr>
+          <w:b/>
+          <w:bCs/>
+        </w:rPr>
+        <w:t xml:space="preserve">7.1 MODELO ENTIDAD-RELACIÓN (MER)</w:t>
+      </w:r>
+      <w:bookmarkEnd w:id="1001"/>
+    </w:p>
+    <w:p>
+      <w:pPr>
+        <w:pStyle w:val="APA"/>
+      </w:pPr>
+      <w:r>
+        <w:t xml:space="preserve">Antes de presentar el esquema relacional conviene mostrar el modelo entidad-relación (MER), que representa el dominio en términos conceptuales, sin tipos de datos ni claves foráneas, siguiendo la notación propuesta por Chen (1976). La Figura 4 identifica nueve entidades y nueve relaciones. Reserva es la entidad central: recibe participaciones de Huésped (realiza), Habitación (se asigna) y Usuario (registra), todas con cardinalidad 1 a 0..N, y de ella dependen tres entidades débiles, Pago, Comprobante y Bitácora de reserva, cuyas relaciones se dibujan con doble borde porque son identificadoras: ningún pago, comprobante o anotación existe sin su reserva. Tipo de habitación agrupa habitaciones y tarifas con cardinalidad 1 a 1..N, y Usuario ejecuta anotaciones de bitácora, lo que permite identificar al responsable de cada cambio. Los atributos se limitan a los identificadores, subrayados, y a los más representativos de cada entidad.</w:t>
+      </w:r>
+    </w:p>
+    <w:p>
+      <w:pPr>
+        <w:pStyle w:val="APA"/>
+        <w:ind w:firstLine="0"/>
+        <w:jc w:val="center"/>
+        <w:keepNext/>
+        <w:spacing w:line="240" w:lineRule="auto"/>
+      </w:pPr>
+      <w:r>
+        <w:drawing>
+          <wp:inline distT="0" distB="0" distL="0" distR="0">
+            <wp:extent cx="5943600" cy="3698000"/>
+            <wp:effectExtent l="0" t="0" r="0" b="0"/>
+            <wp:docPr id="904" name="Figura 4 MER"/>
+            <wp:cNvGraphicFramePr>
+              <a:graphicFrameLocks xmlns:a="http://schemas.openxmlformats.org/drawingml/2006/main" noChangeAspect="1"/>
+            </wp:cNvGraphicFramePr>
+            <a:graphic xmlns:a="http://schemas.openxmlformats.org/drawingml/2006/main">
+              <a:graphicData uri="http://schemas.openxmlformats.org/drawingml/2006/picture">
+                <pic:pic xmlns:pic="http://schemas.openxmlformats.org/drawingml/2006/picture">
+                  <pic:nvPicPr>
+                    <pic:cNvPr id="0" name="Figura 4 MER"/>
+                    <pic:cNvPicPr/>
+                  </pic:nvPicPr>
+                  <pic:blipFill>
+                    <a:blip r:embed="rIdMER"/>
+                    <a:stretch>
+                      <a:fillRect/>
+                    </a:stretch>
+                  </pic:blipFill>
+                  <pic:spPr>
+                    <a:xfrm>
+                      <a:off x="0" y="0"/>
+                      <a:ext cx="5943600" cy="3698000"/>
+                    </a:xfrm>
+                    <a:prstGeom prst="rect">
+                      <a:avLst/>
+                    </a:prstGeom>
+                  </pic:spPr>
+                </pic:pic>
+              </a:graphicData>
+            </a:graphic>
+          </wp:inline>
+        </w:drawing>
+      </w:r>
+    </w:p>
+    <w:p>
+      <w:pPr>
+        <w:pStyle w:val="APA"/>
+        <w:ind w:firstLine="0"/>
+        <w:rPr>
+          <w:b/>
+          <w:bCs/>
+        </w:rPr>
+      </w:pPr>
+      <w:r>
+        <w:rPr>
+          <w:b/>
+          <w:bCs/>
+        </w:rPr>
+        <w:t xml:space="preserve">Figura 4 Modelo entidad-relación (MER) del sistema Hotel Reservas</w:t>
+      </w:r>
+    </w:p>
+    <w:p>
+      <w:pPr>
+        <w:pStyle w:val="APA"/>
+      </w:pPr>
+      <w:r>
+        <w:t xml:space="preserve">Nota. Elaboración propia con la notación de Chen (1976). Los rectángulos representan entidades, los de doble borde entidades débiles, los rombos relaciones y las elipses atributos; las cardinalidades se expresan como mínimo..máximo. Las mismas entidades y cardinalidades se trasladan al esquema relacional de la Figura 5.</w:t>
+      </w:r>
+    </w:p>
+    <w:p>
+      <w:pPr>
+        <w:pStyle w:val="APA"/>
+        <w:rPr>
+          <w:b/>
+          <w:bCs/>
+        </w:rPr>
+      </w:pPr>
+      <w:bookmarkStart w:id="1002" w:name="_TocF31002"/>
+      <w:r>
+        <w:rPr>
+          <w:b/>
+          <w:bCs/>
+        </w:rPr>
+        <w:t xml:space="preserve">7.2 ESQUEMA RELACIONAL</w:t>
+      </w:r>
+      <w:bookmarkEnd w:id="1002"/>
+    </w:p>
+    <w:p>
+      <w:pPr>
+        <w:pStyle w:val="APA"/>
+      </w:pPr>
+      <w:r>
+        <w:t xml:space="preserve">El esquema relacional de la Figura 5 es la traducción del MER al modelo lógico de Microsoft SQL Server: cada entidad se convierte en una tabla, cada atributo en una columna con tipo de dato, los identificadores en claves primarias y cada relación 1 a N en una clave foránea ubicada en la tabla del lado N. Las entidades débiles conservan la clave foránea obligatoria hacia RESERVA, y la relación 1 a 0..1 con COMPROBANTE se materializa con una restricción UNIQUE sobre id_reserva.</w:t>
+      </w:r>
+    </w:p>
+    <w:p>
+      <w:pPr>
+        <w:pStyle w:val="APA"/>
         <w:ind w:firstLine="0"/>
         <w:jc w:val="center"/>
         <w:keepNext/>
@@ -2410,7 +2568,7 @@
           <w:b/>
           <w:bCs/>
         </w:rPr>
-        <w:t xml:space="preserve">Figura 4 Modelo relacional del sistema Hotel Reservas</w:t>
+        <w:t xml:space="preserve">Figura 5 Modelo relacional del sistema Hotel Reservas</w:t>
       </w:r>
     </w:p>
     <w:p>
@@ -2440,7 +2598,7 @@
           <w:b/>
           <w:bCs/>
         </w:rPr>
-        <w:t>7.1 DESCRIPCIÓN DE LAS TABLAS</w:t>
+        <w:t>7.3 DESCRIPCIÓN DE LAS TABLAS</w:t>
       </w:r>
       <w:bookmarkEnd w:id="30"/>
     </w:p>
@@ -2474,7 +2632,7 @@
           <w:b/>
           <w:bCs/>
         </w:rPr>
-        <w:t>7.2 RESTRICCIONES QUE GARANTIZAN LA INTEGRIDAD TRANSACCIONAL</w:t>
+        <w:t>7.4 RESTRICCIONES QUE GARANTIZAN LA INTEGRIDAD TRANSACCIONAL</w:t>
       </w:r>
       <w:bookmarkEnd w:id="31"/>
     </w:p>
@@ -2557,6 +2715,111 @@
     <w:p>
       <w:pPr>
         <w:pStyle w:val="APA"/>
+        <w:rPr>
+          <w:b/>
+          <w:bCs/>
+        </w:rPr>
+      </w:pPr>
+      <w:bookmarkStart w:id="1003" w:name="_TocF31003"/>
+      <w:r>
+        <w:rPr>
+          <w:b/>
+          <w:bCs/>
+        </w:rPr>
+        <w:t xml:space="preserve">7.5 ARQUITECTURA DE LA BASE DE DATOS</w:t>
+      </w:r>
+      <w:bookmarkEnd w:id="1003"/>
+    </w:p>
+    <w:p>
+      <w:pPr>
+        <w:pStyle w:val="APA"/>
+      </w:pPr>
+      <w:r>
+        <w:t xml:space="preserve">La arquitectura de la base de datos describe cómo se organiza el almacenamiento dentro de la arquitectura en capas de la sección 4. La Figura 6 la resume. La base de datos HotelReservas reside en una instancia de Microsoft SQL Server, en la edición Express o Developer, instalada en el servidor de datos del hotel o en una máquina virtual; ningún componente de la aplicación móvil accede a ella de forma directa, pues toda operación llega a través de la capa de acceso a datos de la API, que se comunica con el motor mediante el proveedor de .NET y el protocolo TDS. Dentro de la base de datos se distinguen cinco elementos: el esquema de nueve tablas derivado del MER, las reglas de integridad declarativas (claves primarias y foráneas, restricciones UNIQUE y CHECK y la columna ROWVERSION de RESERVA), los índices que aceleran la consulta de disponibilidad, la lógica alojada en el motor, representada por el procedimiento almacenado de confirmación y la secuencia que genera los códigos de reserva, y el registro de transacciones con sus copias de seguridad diarias, que garantizan la durabilidad.</w:t>
+      </w:r>
+    </w:p>
+    <w:p>
+      <w:pPr>
+        <w:pStyle w:val="APA"/>
+      </w:pPr>
+      <w:r>
+        <w:t xml:space="preserve">Esta organización responde a tres decisiones de diseño de datos. La primera es concentrar las reglas que protegen la integridad en el propio motor, de modo que ningún cliente, ni siquiera uno mal programado, pueda producir dos reservas solapadas o un pago sin reserva. La segunda es separar los permisos: la API se conecta con un inicio de sesión dedicado que solo puede ejecutar consultas y procedimientos sobre la base HotelReservas, mientras que SQL Server Management Studio se reserva para la administración y la ejecución de los scripts de creación, de la transacción y de datos de prueba que acompañan al repositorio del proyecto. La tercera es mantener el esquema pequeño y normalizado, lo que facilita la trazabilidad y permite agregar en el futuro tablas auxiliares, como la bitácora de consultas del asistente de inteligencia artificial descrita en la sección 13, sin modificar el núcleo transaccional.</w:t>
+      </w:r>
+    </w:p>
+    <w:p>
+      <w:pPr>
+        <w:pStyle w:val="APA"/>
+        <w:ind w:firstLine="0"/>
+        <w:jc w:val="center"/>
+        <w:keepNext/>
+        <w:spacing w:line="240" w:lineRule="auto"/>
+      </w:pPr>
+      <w:r>
+        <w:drawing>
+          <wp:inline distT="0" distB="0" distL="0" distR="0">
+            <wp:extent cx="5943600" cy="3217000"/>
+            <wp:effectExtent l="0" t="0" r="0" b="0"/>
+            <wp:docPr id="905" name="Figura 6 arquitectura BD"/>
+            <wp:cNvGraphicFramePr>
+              <a:graphicFrameLocks xmlns:a="http://schemas.openxmlformats.org/drawingml/2006/main" noChangeAspect="1"/>
+            </wp:cNvGraphicFramePr>
+            <a:graphic xmlns:a="http://schemas.openxmlformats.org/drawingml/2006/main">
+              <a:graphicData uri="http://schemas.openxmlformats.org/drawingml/2006/picture">
+                <pic:pic xmlns:pic="http://schemas.openxmlformats.org/drawingml/2006/picture">
+                  <pic:nvPicPr>
+                    <pic:cNvPr id="0" name="Figura 6 arquitectura BD"/>
+                    <pic:cNvPicPr/>
+                  </pic:nvPicPr>
+                  <pic:blipFill>
+                    <a:blip r:embed="rIdBD"/>
+                    <a:stretch>
+                      <a:fillRect/>
+                    </a:stretch>
+                  </pic:blipFill>
+                  <pic:spPr>
+                    <a:xfrm>
+                      <a:off x="0" y="0"/>
+                      <a:ext cx="5943600" cy="3217000"/>
+                    </a:xfrm>
+                    <a:prstGeom prst="rect">
+                      <a:avLst/>
+                    </a:prstGeom>
+                  </pic:spPr>
+                </pic:pic>
+              </a:graphicData>
+            </a:graphic>
+          </wp:inline>
+        </w:drawing>
+      </w:r>
+    </w:p>
+    <w:p>
+      <w:pPr>
+        <w:pStyle w:val="APA"/>
+        <w:ind w:firstLine="0"/>
+        <w:rPr>
+          <w:b/>
+          <w:bCs/>
+        </w:rPr>
+      </w:pPr>
+      <w:r>
+        <w:rPr>
+          <w:b/>
+          <w:bCs/>
+        </w:rPr>
+        <w:t xml:space="preserve">Figura 6 Arquitectura de la base de datos del sistema Hotel Reservas</w:t>
+      </w:r>
+    </w:p>
+    <w:p>
+      <w:pPr>
+        <w:pStyle w:val="APA"/>
+      </w:pPr>
+      <w:r>
+        <w:t xml:space="preserve">Nota. Elaboración propia. El servidor de aplicaciones accede a la base de datos únicamente a través de la capa de acceso a datos; SSMS se usa para administración y para ejecutar los scripts del repositorio.</w:t>
+      </w:r>
+    </w:p>
+    <w:p>
+      <w:pPr>
+        <w:pStyle w:val="APA"/>
         <w:jc w:val="center"/>
         <w:rPr>
           <w:b/>
@@ -3140,15 +3403,15 @@
         <w:pStyle w:val="APA"/>
       </w:pPr>
       <w:r>
-        <w:t>La matriz confirma que los componentes fueron concebidos de forma integrada. La confirmación transaccional, respuesta principal ante las reservas dobles, se identifica como CU-04; se coordina desde ServicioReservas usando Reserva, Pago y Comprobante; se guarda en las tablas equivalentes bajo las reglas expuestas en el apartado 7.2; y se procesa en el gestor transaccional de la lógica de negocio con el respaldo del control de concurrencia del motor de datos. De manera semejante, la necesidad de seguimiento se concreta en la clase y la tabla de bitácora, mientras que el módulo de seguridad permite reconocer al usuario responsable de cada movimiento.</w:t>
-      </w:r>
-    </w:p>
-    <w:p>
-      <w:pPr>
-        <w:pStyle w:val="APA"/>
-      </w:pPr>
-      <w:r>
-        <w:t xml:space="preserve">Como cierre de la integración conviene precisar qué queda definido en esta fase y qué se traslada a la siguiente. Quedan definidos de manera estable el objetivo central y los objetivos específicos, los dos actores y los quince casos de uso, las clases del dominio con sus multiplicidades, las nueve tablas con sus claves y cardinalidades, el estilo arquitectónico en capas y la trazabilidad entre todos estos elementos. Pasan a la Fase III, que se desarrolla en las secciones 9 a 13, la especificación de los requerimientos funcionales y no funcionales que harán verificable este diseño, la fundamentación conceptual y contextual, y la propuesta del servicio de inteligencia artificial. La elección final entre bloqueo pesimista y concurrencia optimista, así como los scripts, la API y la aplicación operativa, se reservan para las etapas de construcción y pruebas.</w:t>
+        <w:t>La matriz confirma que los componentes fueron concebidos de forma integrada. La confirmación transaccional, respuesta principal ante las reservas dobles, se identifica como CU-04; se coordina desde ServicioReservas usando Reserva, Pago y Comprobante; se guarda en las tablas equivalentes bajo las reglas expuestas en el apartado 7.4; y se procesa en el gestor transaccional de la lógica de negocio con el respaldo del control de concurrencia del motor de datos. De manera semejante, la necesidad de seguimiento se concreta en la clase y la tabla de bitácora, mientras que el módulo de seguridad permite reconocer al usuario responsable de cada movimiento.</w:t>
+      </w:r>
+    </w:p>
+    <w:p>
+      <w:pPr>
+        <w:pStyle w:val="APA"/>
+      </w:pPr>
+      <w:r>
+        <w:t xml:space="preserve">Como cierre de la integración conviene precisar qué queda definido en esta fase y qué se traslada a la siguiente. Quedan definidos de manera estable el objetivo central y los objetivos específicos, los dos actores y los quince casos de uso, las clases del dominio con sus multiplicidades, el modelo entidad-relación y las nueve tablas con sus claves y cardinalidades, la arquitectura de la base de datos, el estilo arquitectónico en capas y la trazabilidad entre todos estos elementos. Pasan a la Fase III, que se desarrolla en las secciones 9 a 13, la especificación de los requerimientos funcionales y no funcionales que harán verificable este diseño, la fundamentación conceptual y contextual, y la propuesta del servicio de inteligencia artificial. La elección final entre bloqueo pesimista y concurrencia optimista, así como los scripts, la API y la aplicación operativa, se reservan para las etapas de construcción y pruebas.</w:t>
       </w:r>
     </w:p>
     <w:p>
@@ -3163,7 +3426,7 @@
       <w:r>
         <w:br w:type="page"/>
       </w:r>
-      <w:bookmarkStart w:id="1001" w:name="_TocF3RF"/>
+      <w:bookmarkStart w:id="1004" w:name="_TocF3RF"/>
       <w:r>
         <w:rPr>
           <w:b/>
@@ -3171,7 +3434,7 @@
         </w:rPr>
         <w:t xml:space="preserve">9. REQUERIMIENTOS FUNCIONALES</w:t>
       </w:r>
-      <w:bookmarkEnd w:id="1001"/>
+      <w:bookmarkEnd w:id="1004"/>
     </w:p>
     <w:p>
       <w:pPr>
@@ -4693,7 +4956,7 @@
           <w:bCs/>
         </w:rPr>
       </w:pPr>
-      <w:bookmarkStart w:id="1002" w:name="_TocF31002"/>
+      <w:bookmarkStart w:id="1005" w:name="_TocF31005"/>
       <w:r>
         <w:rPr>
           <w:b/>
@@ -4701,14 +4964,14 @@
         </w:rPr>
         <w:t xml:space="preserve">10. REQUERIMIENTOS NO FUNCIONALES</w:t>
       </w:r>
-      <w:bookmarkEnd w:id="1002"/>
-    </w:p>
-    <w:p>
-      <w:pPr>
-        <w:pStyle w:val="APA"/>
-      </w:pPr>
-      <w:r>
-        <w:t xml:space="preserve">Los requerimientos no funcionales establecen las condiciones de calidad bajo las cuales deben prestarse los servicios anteriores. Para organizarlos se toma como referencia el modelo de calidad del producto de la norma ISO/IEC 25010, que agrupa las características en seguridad, eficiencia de desempeño, usabilidad, fiabilidad, mantenibilidad, compatibilidad y portabilidad (ISO/IEC, 2011). A ellas se añade la trazabilidad, que en un sistema transaccional constituye una exigencia del negocio. Cada requerimiento de la Tabla 3 incluye un criterio verificable, de modo que pueda comprobarse en las pruebas de aceptación de las etapas siguientes.</w:t>
+      <w:bookmarkEnd w:id="1005"/>
+    </w:p>
+    <w:p>
+      <w:pPr>
+        <w:pStyle w:val="APA"/>
+      </w:pPr>
+      <w:r>
+        <w:t xml:space="preserve">Los requerimientos no funcionales establecen las condiciones de calidad bajo las cuales deben prestarse los servicios anteriores. Para organizarlos se toma como referencia el modelo de calidad del producto de la norma ISO/IEC 25010, que agrupa las características en seguridad, eficiencia de desempeño, usabilidad, fiabilidad, mantenibilidad, compatibilidad y portabilidad (ISO/IEC, 2011). A ellas se añade la trazabilidad, que en un sistema transaccional constituye una exigencia del negocio. Siguiendo la indicación del docente, se formulan solo los cinco requerimientos no funcionales que resultan determinantes para este sistema, y cada uno incluye en la Tabla 3 un criterio verificable, de modo que pueda comprobarse en las pruebas de aceptación de las etapas siguientes.</w:t>
       </w:r>
     </w:p>
     <w:p>
@@ -5079,7 +5342,7 @@
                 <w:sz w:val="20"/>
                 <w:szCs w:val="20"/>
               </w:rPr>
-              <w:t xml:space="preserve">Disponibilidad</w:t>
+              <w:t xml:space="preserve">Usabilidad</w:t>
             </w:r>
           </w:p>
         </w:tc>
@@ -5096,7 +5359,7 @@
                 <w:sz w:val="20"/>
                 <w:szCs w:val="20"/>
               </w:rPr>
-              <w:t xml:space="preserve">El servicio debe estar accesible durante el horario de operación del hotel, incluidas las noches y los fines de semana.</w:t>
+              <w:t xml:space="preserve">La aplicación móvil debe permitir completar las tareas frecuentes con pocos pasos y mensajes claros, sin capacitación extensa.</w:t>
             </w:r>
           </w:p>
         </w:tc>
@@ -5113,7 +5376,7 @@
                 <w:sz w:val="20"/>
                 <w:szCs w:val="20"/>
               </w:rPr>
-              <w:t xml:space="preserve">Disponibilidad mensual igual o superior al 99 % medida sobre la API; las ventanas de mantenimiento se programan y se anuncian con anticipación.</w:t>
+              <w:t xml:space="preserve">Un recepcionista nuevo crea una reserva completa (RF03 a RF06) en un máximo de cinco pantallas y en menos de tres minutos; los mensajes de error indican la causa y la acción sugerida.</w:t>
             </w:r>
           </w:p>
         </w:tc>
@@ -5152,225 +5415,6 @@
                 <w:sz w:val="20"/>
                 <w:szCs w:val="20"/>
               </w:rPr>
-              <w:t xml:space="preserve">Usabilidad</w:t>
-            </w:r>
-          </w:p>
-        </w:tc>
-        <w:tc>
-          <w:tcPr>
-            <w:tcW w:w="3400" w:type="dxa"/>
-          </w:tcPr>
-          <w:p>
-            <w:pPr>
-              <w:spacing w:before="40" w:after="40" w:line="240" w:lineRule="auto"/>
-            </w:pPr>
-            <w:r>
-              <w:rPr>
-                <w:sz w:val="20"/>
-                <w:szCs w:val="20"/>
-              </w:rPr>
-              <w:t xml:space="preserve">La aplicación móvil debe permitir completar las tareas frecuentes con pocos pasos y mensajes claros, sin capacitación extensa.</w:t>
-            </w:r>
-          </w:p>
-        </w:tc>
-        <w:tc>
-          <w:tcPr>
-            <w:tcW w:w="3600" w:type="dxa"/>
-          </w:tcPr>
-          <w:p>
-            <w:pPr>
-              <w:spacing w:before="40" w:after="40" w:line="240" w:lineRule="auto"/>
-            </w:pPr>
-            <w:r>
-              <w:rPr>
-                <w:sz w:val="20"/>
-                <w:szCs w:val="20"/>
-              </w:rPr>
-              <w:t xml:space="preserve">Un recepcionista nuevo crea una reserva completa (RF03 a RF06) en un máximo de cinco pantallas y en menos de tres minutos; los mensajes de error indican la causa y la acción sugerida.</w:t>
-            </w:r>
-          </w:p>
-        </w:tc>
-      </w:tr>
-      <w:tr>
-        <w:trPr>
-          <w:cantSplit/>
-        </w:trPr>
-        <w:tc>
-          <w:tcPr>
-            <w:tcW w:w="1000" w:type="dxa"/>
-          </w:tcPr>
-          <w:p>
-            <w:pPr>
-              <w:spacing w:before="40" w:after="40" w:line="240" w:lineRule="auto"/>
-            </w:pPr>
-            <w:r>
-              <w:rPr>
-                <w:sz w:val="20"/>
-                <w:szCs w:val="20"/>
-              </w:rPr>
-              <w:t xml:space="preserve">RNF06</w:t>
-            </w:r>
-          </w:p>
-        </w:tc>
-        <w:tc>
-          <w:tcPr>
-            <w:tcW w:w="1350" w:type="dxa"/>
-          </w:tcPr>
-          <w:p>
-            <w:pPr>
-              <w:spacing w:before="40" w:after="40" w:line="240" w:lineRule="auto"/>
-            </w:pPr>
-            <w:r>
-              <w:rPr>
-                <w:sz w:val="20"/>
-                <w:szCs w:val="20"/>
-              </w:rPr>
-              <w:t xml:space="preserve">Mantenibilidad</w:t>
-            </w:r>
-          </w:p>
-        </w:tc>
-        <w:tc>
-          <w:tcPr>
-            <w:tcW w:w="3400" w:type="dxa"/>
-          </w:tcPr>
-          <w:p>
-            <w:pPr>
-              <w:spacing w:before="40" w:after="40" w:line="240" w:lineRule="auto"/>
-            </w:pPr>
-            <w:r>
-              <w:rPr>
-                <w:sz w:val="20"/>
-                <w:szCs w:val="20"/>
-              </w:rPr>
-              <w:t xml:space="preserve">La solución debe conservar la separación en capas definida en la sección 4, de modo que los cambios en una capa no obliguen a modificar las demás.</w:t>
-            </w:r>
-          </w:p>
-        </w:tc>
-        <w:tc>
-          <w:tcPr>
-            <w:tcW w:w="3600" w:type="dxa"/>
-          </w:tcPr>
-          <w:p>
-            <w:pPr>
-              <w:spacing w:before="40" w:after="40" w:line="240" w:lineRule="auto"/>
-            </w:pPr>
-            <w:r>
-              <w:rPr>
-                <w:sz w:val="20"/>
-                <w:szCs w:val="20"/>
-              </w:rPr>
-              <w:t xml:space="preserve">Las reglas de negocio residen solo en la API; una modificación de la interfaz móvil no requiere cambios en la base de datos; el código cuenta con pruebas unitarias para los servicios de reservas.</w:t>
-            </w:r>
-          </w:p>
-        </w:tc>
-      </w:tr>
-      <w:tr>
-        <w:trPr>
-          <w:cantSplit/>
-        </w:trPr>
-        <w:tc>
-          <w:tcPr>
-            <w:tcW w:w="1000" w:type="dxa"/>
-          </w:tcPr>
-          <w:p>
-            <w:pPr>
-              <w:spacing w:before="40" w:after="40" w:line="240" w:lineRule="auto"/>
-            </w:pPr>
-            <w:r>
-              <w:rPr>
-                <w:sz w:val="20"/>
-                <w:szCs w:val="20"/>
-              </w:rPr>
-              <w:t xml:space="preserve">RNF07</w:t>
-            </w:r>
-          </w:p>
-        </w:tc>
-        <w:tc>
-          <w:tcPr>
-            <w:tcW w:w="1350" w:type="dxa"/>
-          </w:tcPr>
-          <w:p>
-            <w:pPr>
-              <w:spacing w:before="40" w:after="40" w:line="240" w:lineRule="auto"/>
-            </w:pPr>
-            <w:r>
-              <w:rPr>
-                <w:sz w:val="20"/>
-                <w:szCs w:val="20"/>
-              </w:rPr>
-              <w:t xml:space="preserve">Compatibilidad</w:t>
-            </w:r>
-          </w:p>
-        </w:tc>
-        <w:tc>
-          <w:tcPr>
-            <w:tcW w:w="3400" w:type="dxa"/>
-          </w:tcPr>
-          <w:p>
-            <w:pPr>
-              <w:spacing w:before="40" w:after="40" w:line="240" w:lineRule="auto"/>
-            </w:pPr>
-            <w:r>
-              <w:rPr>
-                <w:sz w:val="20"/>
-                <w:szCs w:val="20"/>
-              </w:rPr>
-              <w:t xml:space="preserve">La aplicación debe ejecutarse en los dispositivos Android del personal y la API debe poder consumirse desde otros clientes.</w:t>
-            </w:r>
-          </w:p>
-        </w:tc>
-        <w:tc>
-          <w:tcPr>
-            <w:tcW w:w="3600" w:type="dxa"/>
-          </w:tcPr>
-          <w:p>
-            <w:pPr>
-              <w:spacing w:before="40" w:after="40" w:line="240" w:lineRule="auto"/>
-            </w:pPr>
-            <w:r>
-              <w:rPr>
-                <w:sz w:val="20"/>
-                <w:szCs w:val="20"/>
-              </w:rPr>
-              <w:t xml:space="preserve">El APK funciona en Android 10 o superior; la API expone sus recursos en JSON sobre HTTPS y puede probarse desde Postman sin la aplicación.</w:t>
-            </w:r>
-          </w:p>
-        </w:tc>
-      </w:tr>
-      <w:tr>
-        <w:trPr>
-          <w:cantSplit/>
-        </w:trPr>
-        <w:tc>
-          <w:tcPr>
-            <w:tcW w:w="1000" w:type="dxa"/>
-          </w:tcPr>
-          <w:p>
-            <w:pPr>
-              <w:spacing w:before="40" w:after="40" w:line="240" w:lineRule="auto"/>
-            </w:pPr>
-            <w:r>
-              <w:rPr>
-                <w:sz w:val="20"/>
-                <w:szCs w:val="20"/>
-              </w:rPr>
-              <w:t xml:space="preserve">RNF08</w:t>
-            </w:r>
-          </w:p>
-        </w:tc>
-        <w:tc>
-          <w:tcPr>
-            <w:tcW w:w="1350" w:type="dxa"/>
-          </w:tcPr>
-          <w:p>
-            <w:pPr>
-              <w:spacing w:before="40" w:after="40" w:line="240" w:lineRule="auto"/>
-            </w:pPr>
-            <w:r>
-              <w:rPr>
-                <w:sz w:val="20"/>
-                <w:szCs w:val="20"/>
-              </w:rPr>
               <w:t xml:space="preserve">Trazabilidad</w:t>
             </w:r>
           </w:p>
@@ -5424,7 +5468,7 @@
         <w:pStyle w:val="APA"/>
       </w:pPr>
       <w:r>
-        <w:t xml:space="preserve">Los requerimientos RNF02 y RNF08 responden directamente a la problemática de la Fase I, pues son los que impiden la sobreventa y aportan la evidencia para atender reclamaciones. RNF01 protege los datos personales de los huéspedes, cuya recolección y tratamiento se rigen en Colombia por la Ley 1581 de 2012 (Congreso de la República de Colombia, 2012). Los demás requerimientos aseguran que la solución sea utilizable y sostenible en un hotel pequeño o mediano, donde no se cuenta con personal técnico permanente.</w:t>
+        <w:t xml:space="preserve">Los requerimientos RNF02 y RNF05 responden directamente a la problemática de la Fase I, pues son los que impiden la sobreventa y aportan la evidencia para atender reclamaciones. RNF01 protege los datos personales de los huéspedes, cuya recolección y tratamiento se rigen en Colombia por la Ley 1581 de 2012 (Congreso de la República de Colombia, 2012). RNF03 y RNF04 aseguran que la solución sea útil en la recepción de un hotel pequeño o mediano, donde la atención al cliente no admite esperas ni capacitación extensa. Atributos como disponibilidad, mantenibilidad y compatibilidad quedan cubiertos por las decisiones de arquitectura de la sección 4 y no se formulan como requerimientos independientes.</w:t>
       </w:r>
     </w:p>
     <w:p>
@@ -5436,7 +5480,7 @@
           <w:bCs/>
         </w:rPr>
       </w:pPr>
-      <w:bookmarkStart w:id="1003" w:name="_TocF31003"/>
+      <w:bookmarkStart w:id="1006" w:name="_TocF31006"/>
       <w:r>
         <w:rPr>
           <w:b/>
@@ -5444,7 +5488,7 @@
         </w:rPr>
         <w:t xml:space="preserve">11. MARCO CONCEPTUAL</w:t>
       </w:r>
-      <w:bookmarkEnd w:id="1003"/>
+      <w:bookmarkEnd w:id="1006"/>
     </w:p>
     <w:p>
       <w:pPr>
@@ -5462,7 +5506,7 @@
           <w:bCs/>
         </w:rPr>
       </w:pPr>
-      <w:bookmarkStart w:id="1004" w:name="_TocF31004"/>
+      <w:bookmarkStart w:id="1007" w:name="_TocF31007"/>
       <w:r>
         <w:rPr>
           <w:b/>
@@ -5470,7 +5514,7 @@
         </w:rPr>
         <w:t xml:space="preserve">11.1 CONCEPTOS FUNDAMENTALES DEL PROYECTO</w:t>
       </w:r>
-      <w:bookmarkEnd w:id="1004"/>
+      <w:bookmarkEnd w:id="1007"/>
     </w:p>
     <w:p>
       <w:pPr>
@@ -5496,7 +5540,7 @@
           <w:bCs/>
         </w:rPr>
       </w:pPr>
-      <w:bookmarkStart w:id="1005" w:name="_TocF31005"/>
+      <w:bookmarkStart w:id="1008" w:name="_TocF31008"/>
       <w:r>
         <w:rPr>
           <w:b/>
@@ -5504,7 +5548,7 @@
         </w:rPr>
         <w:t xml:space="preserve">11.2 CONCEPTOS DE SISTEMAS TRANSACCIONALES</w:t>
       </w:r>
-      <w:bookmarkEnd w:id="1005"/>
+      <w:bookmarkEnd w:id="1008"/>
     </w:p>
     <w:p>
       <w:pPr>
@@ -5530,7 +5574,7 @@
           <w:bCs/>
         </w:rPr>
       </w:pPr>
-      <w:bookmarkStart w:id="1006" w:name="_TocF31006"/>
+      <w:bookmarkStart w:id="1009" w:name="_TocF31009"/>
       <w:r>
         <w:rPr>
           <w:b/>
@@ -5538,7 +5582,7 @@
         </w:rPr>
         <w:t xml:space="preserve">11.3 CONCEPTOS TECNOLÓGICOS</w:t>
       </w:r>
-      <w:bookmarkEnd w:id="1006"/>
+      <w:bookmarkEnd w:id="1009"/>
     </w:p>
     <w:p>
       <w:pPr>
@@ -5564,7 +5608,7 @@
           <w:bCs/>
         </w:rPr>
       </w:pPr>
-      <w:bookmarkStart w:id="1007" w:name="_TocF31007"/>
+      <w:bookmarkStart w:id="1010" w:name="_TocF31010"/>
       <w:r>
         <w:rPr>
           <w:b/>
@@ -5572,7 +5616,7 @@
         </w:rPr>
         <w:t xml:space="preserve">11.4 APLICACIÓN AL PROYECTO</w:t>
       </w:r>
-      <w:bookmarkEnd w:id="1007"/>
+      <w:bookmarkEnd w:id="1010"/>
     </w:p>
     <w:p>
       <w:pPr>
@@ -5591,7 +5635,7 @@
           <w:bCs/>
         </w:rPr>
       </w:pPr>
-      <w:bookmarkStart w:id="1008" w:name="_TocF31008"/>
+      <w:bookmarkStart w:id="1011" w:name="_TocF31011"/>
       <w:r>
         <w:rPr>
           <w:b/>
@@ -5599,17 +5643,17 @@
         </w:rPr>
         <w:t xml:space="preserve">12. MARCO CONTEXTUAL</w:t>
       </w:r>
-      <w:bookmarkEnd w:id="1008"/>
-    </w:p>
-    <w:p>
-      <w:pPr>
-        <w:pStyle w:val="APA"/>
-        <w:rPr>
-          <w:b/>
-          <w:bCs/>
-        </w:rPr>
-      </w:pPr>
-      <w:bookmarkStart w:id="1009" w:name="_TocF31009"/>
+      <w:bookmarkEnd w:id="1011"/>
+    </w:p>
+    <w:p>
+      <w:pPr>
+        <w:pStyle w:val="APA"/>
+        <w:rPr>
+          <w:b/>
+          <w:bCs/>
+        </w:rPr>
+      </w:pPr>
+      <w:bookmarkStart w:id="1012" w:name="_TocF31012"/>
       <w:r>
         <w:rPr>
           <w:b/>
@@ -5617,7 +5661,7 @@
         </w:rPr>
         <w:t xml:space="preserve">12.1 CONTEXTO DEL PROYECTO</w:t>
       </w:r>
-      <w:bookmarkEnd w:id="1009"/>
+      <w:bookmarkEnd w:id="1012"/>
     </w:p>
     <w:p>
       <w:pPr>
@@ -5635,7 +5679,7 @@
           <w:bCs/>
         </w:rPr>
       </w:pPr>
-      <w:bookmarkStart w:id="1010" w:name="_TocF31010"/>
+      <w:bookmarkStart w:id="1013" w:name="_TocF31013"/>
       <w:r>
         <w:rPr>
           <w:b/>
@@ -5643,7 +5687,7 @@
         </w:rPr>
         <w:t xml:space="preserve">12.2 PROBLEMÁTICA IDENTIFICADA</w:t>
       </w:r>
-      <w:bookmarkEnd w:id="1010"/>
+      <w:bookmarkEnd w:id="1013"/>
     </w:p>
     <w:p>
       <w:pPr>
@@ -5661,7 +5705,7 @@
           <w:bCs/>
         </w:rPr>
       </w:pPr>
-      <w:bookmarkStart w:id="1011" w:name="_TocF31011"/>
+      <w:bookmarkStart w:id="1014" w:name="_TocF31014"/>
       <w:r>
         <w:rPr>
           <w:b/>
@@ -5669,7 +5713,7 @@
         </w:rPr>
         <w:t xml:space="preserve">12.3 USUARIOS O BENEFICIARIOS</w:t>
       </w:r>
-      <w:bookmarkEnd w:id="1011"/>
+      <w:bookmarkEnd w:id="1014"/>
     </w:p>
     <w:p>
       <w:pPr>
@@ -5687,7 +5731,7 @@
           <w:bCs/>
         </w:rPr>
       </w:pPr>
-      <w:bookmarkStart w:id="1012" w:name="_TocF31012"/>
+      <w:bookmarkStart w:id="1015" w:name="_TocF31015"/>
       <w:r>
         <w:rPr>
           <w:b/>
@@ -5695,7 +5739,7 @@
         </w:rPr>
         <w:t xml:space="preserve">12.4 NECESIDAD QUE SE PRETENDE ATENDER</w:t>
       </w:r>
-      <w:bookmarkEnd w:id="1012"/>
+      <w:bookmarkEnd w:id="1015"/>
     </w:p>
     <w:p>
       <w:pPr>
@@ -5713,7 +5757,7 @@
           <w:bCs/>
         </w:rPr>
       </w:pPr>
-      <w:bookmarkStart w:id="1013" w:name="_TocF31013"/>
+      <w:bookmarkStart w:id="1016" w:name="_TocF31016"/>
       <w:r>
         <w:rPr>
           <w:b/>
@@ -5721,7 +5765,7 @@
         </w:rPr>
         <w:t xml:space="preserve">12.5 DESCRIPCIÓN DEL PRODUCTO O PROTOTIPO</w:t>
       </w:r>
-      <w:bookmarkEnd w:id="1013"/>
+      <w:bookmarkEnd w:id="1016"/>
     </w:p>
     <w:p>
       <w:pPr>
@@ -5739,7 +5783,7 @@
           <w:bCs/>
         </w:rPr>
       </w:pPr>
-      <w:bookmarkStart w:id="1014" w:name="_TocF31014"/>
+      <w:bookmarkStart w:id="1017" w:name="_TocF31017"/>
       <w:r>
         <w:rPr>
           <w:b/>
@@ -5747,7 +5791,7 @@
         </w:rPr>
         <w:t xml:space="preserve">12.6 ALCANCE DEL PROYECTO</w:t>
       </w:r>
-      <w:bookmarkEnd w:id="1014"/>
+      <w:bookmarkEnd w:id="1017"/>
     </w:p>
     <w:p>
       <w:pPr>
@@ -5766,7 +5810,7 @@
           <w:bCs/>
         </w:rPr>
       </w:pPr>
-      <w:bookmarkStart w:id="1015" w:name="_TocF31015"/>
+      <w:bookmarkStart w:id="1018" w:name="_TocF31018"/>
       <w:r>
         <w:rPr>
           <w:b/>
@@ -5774,17 +5818,17 @@
         </w:rPr>
         <w:t xml:space="preserve">13. MARCO INTEGRADOR: INCORPORACIÓN DEL SERVICIO DE INTELIGENCIA ARTIFICIAL</w:t>
       </w:r>
-      <w:bookmarkEnd w:id="1015"/>
-    </w:p>
-    <w:p>
-      <w:pPr>
-        <w:pStyle w:val="APA"/>
-        <w:rPr>
-          <w:b/>
-          <w:bCs/>
-        </w:rPr>
-      </w:pPr>
-      <w:bookmarkStart w:id="1016" w:name="_TocF31016"/>
+      <w:bookmarkEnd w:id="1018"/>
+    </w:p>
+    <w:p>
+      <w:pPr>
+        <w:pStyle w:val="APA"/>
+        <w:rPr>
+          <w:b/>
+          <w:bCs/>
+        </w:rPr>
+      </w:pPr>
+      <w:bookmarkStart w:id="1019" w:name="_TocF31019"/>
       <w:r>
         <w:rPr>
           <w:b/>
@@ -5792,7 +5836,7 @@
         </w:rPr>
         <w:t xml:space="preserve">13.1 SERVICIO DE INTELIGENCIA ARTIFICIAL PROPUESTO</w:t>
       </w:r>
-      <w:bookmarkEnd w:id="1016"/>
+      <w:bookmarkEnd w:id="1019"/>
     </w:p>
     <w:p>
       <w:pPr>
@@ -5810,7 +5854,7 @@
           <w:bCs/>
         </w:rPr>
       </w:pPr>
-      <w:bookmarkStart w:id="1017" w:name="_TocF31017"/>
+      <w:bookmarkStart w:id="1020" w:name="_TocF31020"/>
       <w:r>
         <w:rPr>
           <w:b/>
@@ -5818,7 +5862,7 @@
         </w:rPr>
         <w:t xml:space="preserve">13.2 FUNCIÓN DENTRO DEL PROYECTO</w:t>
       </w:r>
-      <w:bookmarkEnd w:id="1017"/>
+      <w:bookmarkEnd w:id="1020"/>
     </w:p>
     <w:p>
       <w:pPr>
@@ -5836,22 +5880,22 @@
           <w:bCs/>
         </w:rPr>
       </w:pPr>
-      <w:bookmarkStart w:id="1018" w:name="_TocF31018"/>
-      <w:r>
-        <w:rPr>
-          <w:b/>
-          <w:bCs/>
-        </w:rPr>
-        <w:t xml:space="preserve">13.3 INTEGRACIÓN CON EL SISTEMA</w:t>
-      </w:r>
-      <w:bookmarkEnd w:id="1018"/>
-    </w:p>
-    <w:p>
-      <w:pPr>
-        <w:pStyle w:val="APA"/>
-      </w:pPr>
-      <w:r>
-        <w:t xml:space="preserve">El servicio se ubica en la capa de lógica de negocio, como un componente adicional de la API, de modo que la aplicación móvil solo agrega una pantalla de conversación y la base de datos no sufre cambios. La Figura 5 muestra el flujo conceptual. El recepcionista escribe la consulta, la aplicación la envía a la API con su token JWT, la API la remite al servicio de inteligencia artificial junto con la descripción de las funciones permitidas, el servicio devuelve la función y los parámetros que considera adecuados, la API ejecuta esa función reutilizando los mismos servicios del negocio de los casos de uso CU-03 y CU-12, y el resultado se envía de nuevo al servicio para que redacte la respuesta. Tres reglas de diseño delimitan la integración: el asistente solo accede a funciones de lectura, de manera que nunca crea, modifica ni cancela reservas; la confirmación (CU-04) se realiza siempre desde la pantalla transaccional habitual, con la verificación y el bloqueo descritos en la sección 7.2; y a la API externa se envían únicamente los datos necesarios para la consulta, sin documentos de identidad ni datos de contacto de los huéspedes.</w:t>
+      <w:bookmarkStart w:id="1021" w:name="_TocF31021"/>
+      <w:r>
+        <w:rPr>
+          <w:b/>
+          <w:bCs/>
+        </w:rPr>
+        <w:t xml:space="preserve">13.3 COMPONENTES DE LA INTEGRACIÓN</w:t>
+      </w:r>
+      <w:bookmarkEnd w:id="1021"/>
+    </w:p>
+    <w:p>
+      <w:pPr>
+        <w:pStyle w:val="APA"/>
+      </w:pPr>
+      <w:r>
+        <w:t xml:space="preserve">La integración del servicio se describe a partir de los cinco componentes que intervienen: el modelo de datos, el modelo de inteligencia artificial, la lógica de integración, la interfaz de usuario y la infraestructura. La Figura 7 los sitúa sobre la arquitectura en capas del prototipo, de modo que puede verse qué elementos ya existen y cuáles se agregan. En síntesis, el servicio se incorpora en la capa de lógica de negocio como un componente adicional de la API, la aplicación móvil solo suma una pantalla de conversación y la base de datos conserva intacto su núcleo transaccional.</w:t>
       </w:r>
     </w:p>
     <w:p>
@@ -5865,9 +5909,9 @@
       <w:r>
         <w:drawing>
           <wp:inline distT="0" distB="0" distL="0" distR="0">
-            <wp:extent cx="5943600" cy="3150000"/>
+            <wp:extent cx="5943600" cy="3472000"/>
             <wp:effectExtent l="0" t="0" r="0" b="0"/>
-            <wp:docPr id="901" name="Figura 5 asistente IA"/>
+            <wp:docPr id="906" name="Figura 7 componentes IA"/>
             <wp:cNvGraphicFramePr>
               <a:graphicFrameLocks xmlns:a="http://schemas.openxmlformats.org/drawingml/2006/main" noChangeAspect="1"/>
             </wp:cNvGraphicFramePr>
@@ -5875,7 +5919,156 @@
               <a:graphicData uri="http://schemas.openxmlformats.org/drawingml/2006/picture">
                 <pic:pic xmlns:pic="http://schemas.openxmlformats.org/drawingml/2006/picture">
                   <pic:nvPicPr>
-                    <pic:cNvPr id="0" name="Figura 5 asistente IA"/>
+                    <pic:cNvPr id="0" name="Figura 7 componentes IA"/>
+                    <pic:cNvPicPr/>
+                  </pic:nvPicPr>
+                  <pic:blipFill>
+                    <a:blip r:embed="rIdIAC"/>
+                    <a:stretch>
+                      <a:fillRect/>
+                    </a:stretch>
+                  </pic:blipFill>
+                  <pic:spPr>
+                    <a:xfrm>
+                      <a:off x="0" y="0"/>
+                      <a:ext cx="5943600" cy="3472000"/>
+                    </a:xfrm>
+                    <a:prstGeom prst="rect">
+                      <a:avLst/>
+                    </a:prstGeom>
+                  </pic:spPr>
+                </pic:pic>
+              </a:graphicData>
+            </a:graphic>
+          </wp:inline>
+        </w:drawing>
+      </w:r>
+    </w:p>
+    <w:p>
+      <w:pPr>
+        <w:pStyle w:val="APA"/>
+        <w:ind w:firstLine="0"/>
+        <w:rPr>
+          <w:b/>
+          <w:bCs/>
+        </w:rPr>
+      </w:pPr>
+      <w:r>
+        <w:rPr>
+          <w:b/>
+          <w:bCs/>
+        </w:rPr>
+        <w:t xml:space="preserve">Figura 7 Componentes de la integración del servicio de inteligencia artificial sobre la arquitectura del prototipo</w:t>
+      </w:r>
+    </w:p>
+    <w:p>
+      <w:pPr>
+        <w:pStyle w:val="APA"/>
+      </w:pPr>
+      <w:r>
+        <w:t xml:space="preserve">Nota. Elaboración propia. Los elementos marcados como nuevos son los únicos que se agregan a la arquitectura de la Fase II; los demás se reutilizan.</w:t>
+      </w:r>
+    </w:p>
+    <w:p>
+      <w:pPr>
+        <w:pStyle w:val="APA"/>
+        <w:rPr>
+          <w:b/>
+          <w:bCs/>
+        </w:rPr>
+      </w:pPr>
+      <w:bookmarkStart w:id="1022" w:name="_TocF31022"/>
+      <w:r>
+        <w:rPr>
+          <w:b/>
+          <w:bCs/>
+        </w:rPr>
+        <w:t xml:space="preserve">13.3.1 MODELO DE DATOS</w:t>
+      </w:r>
+      <w:bookmarkEnd w:id="1022"/>
+    </w:p>
+    <w:p>
+      <w:pPr>
+        <w:pStyle w:val="APA"/>
+      </w:pPr>
+      <w:r>
+        <w:t xml:space="preserve">El asistente no modifica las nueve tablas del esquema relacional, pues únicamente las consulta a través de las funciones de lectura. El único cambio en el diseño de datos es una tabla auxiliar, CONSULTA_ASISTENTE, que registra cada consulta realizada: identificador, usuario que la hizo, fecha y hora, texto escrito, función invocada, parámetros interpretados y si la respuesta fue exitosa. Esta tabla cumple dos propósitos: ofrece trazabilidad del uso del servicio, en coherencia con el requerimiento RNF05, y permite medir el resultado esperado de la sección 13.4. Se relaciona con USUARIO mediante una clave foránea y no tiene relación con RESERVA, porque el asistente nunca crea ni altera reservas. Las funciones de lectura devuelven estructuras derivadas de las tablas HABITACION, TIPO_HABITACION, TARIFA y RESERVA, y en ningún caso incluyen columnas de identificación o contacto de HUESPED.</w:t>
+      </w:r>
+    </w:p>
+    <w:p>
+      <w:pPr>
+        <w:pStyle w:val="APA"/>
+        <w:rPr>
+          <w:b/>
+          <w:bCs/>
+        </w:rPr>
+      </w:pPr>
+      <w:bookmarkStart w:id="1023" w:name="_TocF31023"/>
+      <w:r>
+        <w:rPr>
+          <w:b/>
+          <w:bCs/>
+        </w:rPr>
+        <w:t xml:space="preserve">13.3.2 MODELO DE INTELIGENCIA ARTIFICIAL</w:t>
+      </w:r>
+      <w:bookmarkEnd w:id="1023"/>
+    </w:p>
+    <w:p>
+      <w:pPr>
+        <w:pStyle w:val="APA"/>
+      </w:pPr>
+      <w:r>
+        <w:t xml:space="preserve">El modelo es un modelo de lenguaje de gran tamaño de la familia GPT-4o, consumido como servicio a través de Azure OpenAI Service (Microsoft, 2024g). No se entrena ni se ajusta con datos del hotel; se utiliza en modo de llamada a funciones, en el que la API le entrega la pregunta del usuario junto con la descripción de las funciones disponibles y el modelo responde con el nombre de la función y sus parámetros en formato estructurado (Microsoft, 2024h). Después de que la API ejecuta la función, el modelo recibe el resultado y redacta la respuesta final en español. Un mensaje de sistema fijo le indica que solo puede responder con base en los resultados entregados, que debe pedir aclaración cuando falten fechas o tipo de habitación, y que debe remitir a la pantalla transaccional cualquier solicitud de crear, modificar o cancelar reservas.</w:t>
+      </w:r>
+    </w:p>
+    <w:p>
+      <w:pPr>
+        <w:pStyle w:val="APA"/>
+        <w:rPr>
+          <w:b/>
+          <w:bCs/>
+        </w:rPr>
+      </w:pPr>
+      <w:bookmarkStart w:id="1024" w:name="_TocF31024"/>
+      <w:r>
+        <w:rPr>
+          <w:b/>
+          <w:bCs/>
+        </w:rPr>
+        <w:t xml:space="preserve">13.3.3 LÓGICA DE INTEGRACIÓN</w:t>
+      </w:r>
+      <w:bookmarkEnd w:id="1024"/>
+    </w:p>
+    <w:p>
+      <w:pPr>
+        <w:pStyle w:val="APA"/>
+      </w:pPr>
+      <w:r>
+        <w:t xml:space="preserve">La lógica de integración reside en la API REST, en el backend del prototipo, y se compone de tres piezas. El controlador /asistente recibe la consulta de la aplicación con el token JWT del usuario y la entrega al orquestador. El orquestador aplica el filtro de datos personales, envía la pregunta al modelo, valida que la función devuelta pertenezca al catálogo de funciones de solo lectura (consultarDisponibilidad, consultarReserva, consultarLlegadas y consultarTarifa), la ejecuta reutilizando los mismos servicios del negocio de los casos de uso CU-03 y CU-12, registra la consulta en CONSULTA_ASISTENTE y devuelve a la aplicación la respuesta redactada junto con los datos estructurados. La Figura 8 muestra la secuencia completa. Tres reglas delimitan esta lógica: el asistente solo accede a funciones de lectura, de manera que nunca crea, modifica ni cancela reservas; la confirmación (CU-04) se realiza siempre desde la pantalla transaccional habitual, con la verificación y el bloqueo descritos en la sección 7.4; y a la API externa se envían únicamente los datos necesarios para la consulta, sin documentos de identidad ni datos de contacto de los huéspedes.</w:t>
+      </w:r>
+    </w:p>
+    <w:p>
+      <w:pPr>
+        <w:pStyle w:val="APA"/>
+        <w:ind w:firstLine="0"/>
+        <w:jc w:val="center"/>
+        <w:keepNext/>
+        <w:spacing w:line="240" w:lineRule="auto"/>
+      </w:pPr>
+      <w:r>
+        <w:drawing>
+          <wp:inline distT="0" distB="0" distL="0" distR="0">
+            <wp:extent cx="5943600" cy="3150000"/>
+            <wp:effectExtent l="0" t="0" r="0" b="0"/>
+            <wp:docPr id="901" name="Figura 8 asistente IA"/>
+            <wp:cNvGraphicFramePr>
+              <a:graphicFrameLocks xmlns:a="http://schemas.openxmlformats.org/drawingml/2006/main" noChangeAspect="1"/>
+            </wp:cNvGraphicFramePr>
+            <a:graphic xmlns:a="http://schemas.openxmlformats.org/drawingml/2006/main">
+              <a:graphicData uri="http://schemas.openxmlformats.org/drawingml/2006/picture">
+                <pic:pic xmlns:pic="http://schemas.openxmlformats.org/drawingml/2006/picture">
+                  <pic:nvPicPr>
+                    <pic:cNvPr id="0" name="Figura 8 asistente IA"/>
                     <pic:cNvPicPr/>
                   </pic:nvPicPr>
                   <pic:blipFill>
@@ -5914,7 +6107,7 @@
           <w:b/>
           <w:bCs/>
         </w:rPr>
-        <w:t xml:space="preserve">Figura 5 Flujo conceptual del asistente de consultas en lenguaje natural</w:t>
+        <w:t xml:space="preserve">Figura 8 Flujo conceptual del asistente de consultas en lenguaje natural</w:t>
       </w:r>
     </w:p>
     <w:p>
@@ -6422,7 +6615,59 @@
           <w:bCs/>
         </w:rPr>
       </w:pPr>
-      <w:bookmarkStart w:id="1019" w:name="_TocF31019"/>
+      <w:bookmarkStart w:id="1025" w:name="_TocF31025"/>
+      <w:r>
+        <w:rPr>
+          <w:b/>
+          <w:bCs/>
+        </w:rPr>
+        <w:t xml:space="preserve">13.3.4 INTERFAZ DE USUARIO</w:t>
+      </w:r>
+      <w:bookmarkEnd w:id="1025"/>
+    </w:p>
+    <w:p>
+      <w:pPr>
+        <w:pStyle w:val="APA"/>
+      </w:pPr>
+      <w:r>
+        <w:t xml:space="preserve">En la aplicación móvil se agrega una pantalla Asistente, accesible desde la barra de pestañas, con un campo de texto, el historial de la conversación y, cuando la respuesta incluye habitaciones, tarjetas con las opciones sugeridas y un botón que conduce a la pantalla de reservas con los datos ya diligenciados. Cada respuesta muestra en letra pequeña la función consultada y la fecha de los datos, para que el recepcionista sepa que la información proviene del repositorio central. La pantalla sigue el patrón MVVM del resto de la aplicación y consume el nuevo recurso de la API por HTTPS. La sección 14 presenta el prototipo de esta pantalla junto con las pantallas transaccionales.</w:t>
+      </w:r>
+    </w:p>
+    <w:p>
+      <w:pPr>
+        <w:pStyle w:val="APA"/>
+        <w:rPr>
+          <w:b/>
+          <w:bCs/>
+        </w:rPr>
+      </w:pPr>
+      <w:bookmarkStart w:id="1026" w:name="_TocF31026"/>
+      <w:r>
+        <w:rPr>
+          <w:b/>
+          <w:bCs/>
+        </w:rPr>
+        <w:t xml:space="preserve">13.3.5 INFRAESTRUCTURA</w:t>
+      </w:r>
+      <w:bookmarkEnd w:id="1026"/>
+    </w:p>
+    <w:p>
+      <w:pPr>
+        <w:pStyle w:val="APA"/>
+      </w:pPr>
+      <w:r>
+        <w:t xml:space="preserve">La infraestructura necesaria es mínima respecto de la del prototipo. La API conserva su despliegue habitual y agrega, en su configuración segura, la clave y el punto de conexión del recurso de Azure OpenAI, que nunca se incluyen en la aplicación móvil. El recurso se crea en una región de Azure con disponibilidad del modelo, con límites de consumo mensuales y registro de costos, y la comunicación entre la API y el servicio se realiza por HTTPS. La aplicación móvil no requiere cambios de infraestructura, pues sigue hablando únicamente con la API mediante HTTPS y JWT. La base de datos no necesita recursos adicionales, salvo el espacio de la tabla de consultas.</w:t>
+      </w:r>
+    </w:p>
+    <w:p>
+      <w:pPr>
+        <w:pStyle w:val="APA"/>
+        <w:rPr>
+          <w:b/>
+          <w:bCs/>
+        </w:rPr>
+      </w:pPr>
+      <w:bookmarkStart w:id="1027" w:name="_TocF31027"/>
       <w:r>
         <w:rPr>
           <w:b/>
@@ -6430,7 +6675,7 @@
         </w:rPr>
         <w:t xml:space="preserve">13.4 RESULTADO ESPERADO</w:t>
       </w:r>
-      <w:bookmarkEnd w:id="1019"/>
+      <w:bookmarkEnd w:id="1027"/>
     </w:p>
     <w:p>
       <w:pPr>
@@ -6448,7 +6693,7 @@
           <w:bCs/>
         </w:rPr>
       </w:pPr>
-      <w:bookmarkStart w:id="1020" w:name="_TocF31020"/>
+      <w:bookmarkStart w:id="1028" w:name="_TocF31028"/>
       <w:r>
         <w:rPr>
           <w:b/>
@@ -6456,7 +6701,7 @@
         </w:rPr>
         <w:t xml:space="preserve">13.5 CONSIDERACIONES Y LÍMITES</w:t>
       </w:r>
-      <w:bookmarkEnd w:id="1020"/>
+      <w:bookmarkEnd w:id="1028"/>
     </w:p>
     <w:p>
       <w:pPr>
@@ -6464,6 +6709,349 @@
       </w:pPr>
       <w:r>
         <w:t xml:space="preserve">La propuesta reconoce tres riesgos y la manera de mitigarlos. El primero es que el modelo produzca respuestas no fundamentadas; se mitiga al obligarlo a responder únicamente a partir del resultado de las funciones, sin acceso directo a la base de datos. El segundo es la protección de los datos personales de los huéspedes, atendida con la regla de enviar solo la información indispensable y con la política de no entrenamiento del servicio (Microsoft, 2024i), en coherencia con la Ley 1581 de 2012. El tercero es el costo por consumo del servicio, que se controla limitando el uso al personal autenticado y registrando cada consulta en la bitácora del sistema. Conforme a la guía de esta actividad, en la presente fase el servicio se documenta y se diseña conceptualmente; su conexión efectiva con la API se evaluará una vez construido el núcleo transaccional.</w:t>
+      </w:r>
+    </w:p>
+    <w:p>
+      <w:pPr>
+        <w:pStyle w:val="APA"/>
+        <w:jc w:val="center"/>
+        <w:rPr>
+          <w:b/>
+          <w:bCs/>
+        </w:rPr>
+      </w:pPr>
+      <w:bookmarkStart w:id="1029" w:name="_TocF31029"/>
+      <w:r>
+        <w:rPr>
+          <w:b/>
+          <w:bCs/>
+        </w:rPr>
+        <w:t xml:space="preserve">14. PROTOTIPO</w:t>
+      </w:r>
+      <w:bookmarkEnd w:id="1029"/>
+    </w:p>
+    <w:p>
+      <w:pPr>
+        <w:pStyle w:val="APA"/>
+      </w:pPr>
+      <w:r>
+        <w:t xml:space="preserve">Esta sección presenta el prototipo de la aplicación móvil y lo relaciona con la arquitectura, el backend y el diseño de datos descritos en las secciones anteriores. El prototipo tiene dos componentes: la pantalla de inicio, construida en .NET MAUI y publicada en el repositorio del proyecto en la entrega S7, y las pantallas de alta fidelidad de las funciones transaccionales y del asistente, elaboradas en esta fase como especificación visual de lo que se construirá en las etapas siguientes. Todas las pantallas comparten la paleta institucional, la barra de pestañas con cinco destinos y la regla de que la aplicación solo muestra datos obtenidos de la API.</w:t>
+      </w:r>
+    </w:p>
+    <w:p>
+      <w:pPr>
+        <w:pStyle w:val="APA"/>
+        <w:ind w:firstLine="0"/>
+        <w:jc w:val="center"/>
+        <w:keepNext/>
+        <w:spacing w:line="240" w:lineRule="auto"/>
+      </w:pPr>
+      <w:r>
+        <w:drawing>
+          <wp:inline distT="0" distB="0" distL="0" distR="0">
+            <wp:extent cx="2600000" cy="5504000"/>
+            <wp:effectExtent l="0" t="0" r="0" b="0"/>
+            <wp:docPr id="907" name="Figura 9 inicio"/>
+            <wp:cNvGraphicFramePr>
+              <a:graphicFrameLocks xmlns:a="http://schemas.openxmlformats.org/drawingml/2006/main" noChangeAspect="1"/>
+            </wp:cNvGraphicFramePr>
+            <a:graphic xmlns:a="http://schemas.openxmlformats.org/drawingml/2006/main">
+              <a:graphicData uri="http://schemas.openxmlformats.org/drawingml/2006/picture">
+                <pic:pic xmlns:pic="http://schemas.openxmlformats.org/drawingml/2006/picture">
+                  <pic:nvPicPr>
+                    <pic:cNvPr id="0" name="Figura 9 inicio"/>
+                    <pic:cNvPicPr/>
+                  </pic:nvPicPr>
+                  <pic:blipFill>
+                    <a:blip r:embed="rIdP0"/>
+                    <a:stretch>
+                      <a:fillRect/>
+                    </a:stretch>
+                  </pic:blipFill>
+                  <pic:spPr>
+                    <a:xfrm>
+                      <a:off x="0" y="0"/>
+                      <a:ext cx="2600000" cy="5504000"/>
+                    </a:xfrm>
+                    <a:prstGeom prst="rect">
+                      <a:avLst/>
+                    </a:prstGeom>
+                  </pic:spPr>
+                </pic:pic>
+              </a:graphicData>
+            </a:graphic>
+          </wp:inline>
+        </w:drawing>
+      </w:r>
+    </w:p>
+    <w:p>
+      <w:pPr>
+        <w:pStyle w:val="APA"/>
+        <w:ind w:firstLine="0"/>
+        <w:rPr>
+          <w:b/>
+          <w:bCs/>
+        </w:rPr>
+      </w:pPr>
+      <w:r>
+        <w:rPr>
+          <w:b/>
+          <w:bCs/>
+        </w:rPr>
+        <w:t xml:space="preserve">Figura 9 Pantalla de inicio del prototipo (.NET MAUI, entrega S7)</w:t>
+      </w:r>
+    </w:p>
+    <w:p>
+      <w:pPr>
+        <w:pStyle w:val="APA"/>
+      </w:pPr>
+      <w:r>
+        <w:t xml:space="preserve">Nota. Captura de la aplicación Android construida con .NET MAUI, disponible en el repositorio https://github.com/gustavo8015/HotelReservas. Los indicadores de estado de hoy son datos de ejemplo mientras no exista conexión con la API.</w:t>
+      </w:r>
+    </w:p>
+    <w:p>
+      <w:pPr>
+        <w:pStyle w:val="APA"/>
+      </w:pPr>
+      <w:r>
+        <w:t xml:space="preserve">La Figura 9 corresponde a la pantalla de inicio: presenta el propósito del sistema, los módulos de reservas, habitaciones, huéspedes y reportes, y las acciones principales. En la arquitectura de la sección 4 pertenece por completo a la capa de presentación; sus tarjetas de módulo navegan por rutas del Shell y, una vez conectada, el resumen de estado de hoy se obtendrá de la API mediante el recurso de reportes.</w:t>
+      </w:r>
+    </w:p>
+    <w:p>
+      <w:pPr>
+        <w:pStyle w:val="APA"/>
+        <w:ind w:firstLine="0"/>
+        <w:jc w:val="center"/>
+        <w:keepNext/>
+        <w:spacing w:line="240" w:lineRule="auto"/>
+      </w:pPr>
+      <w:r>
+        <w:drawing>
+          <wp:inline distT="0" distB="0" distL="0" distR="0">
+            <wp:extent cx="2600000" cy="5631000"/>
+            <wp:effectExtent l="0" t="0" r="0" b="0"/>
+            <wp:docPr id="908" name="Figura 10 disponibilidad"/>
+            <wp:cNvGraphicFramePr>
+              <a:graphicFrameLocks xmlns:a="http://schemas.openxmlformats.org/drawingml/2006/main" noChangeAspect="1"/>
+            </wp:cNvGraphicFramePr>
+            <a:graphic xmlns:a="http://schemas.openxmlformats.org/drawingml/2006/main">
+              <a:graphicData uri="http://schemas.openxmlformats.org/drawingml/2006/picture">
+                <pic:pic xmlns:pic="http://schemas.openxmlformats.org/drawingml/2006/picture">
+                  <pic:nvPicPr>
+                    <pic:cNvPr id="0" name="Figura 10 disponibilidad"/>
+                    <pic:cNvPicPr/>
+                  </pic:nvPicPr>
+                  <pic:blipFill>
+                    <a:blip r:embed="rIdP1"/>
+                    <a:stretch>
+                      <a:fillRect/>
+                    </a:stretch>
+                  </pic:blipFill>
+                  <pic:spPr>
+                    <a:xfrm>
+                      <a:off x="0" y="0"/>
+                      <a:ext cx="2600000" cy="5631000"/>
+                    </a:xfrm>
+                    <a:prstGeom prst="rect">
+                      <a:avLst/>
+                    </a:prstGeom>
+                  </pic:spPr>
+                </pic:pic>
+              </a:graphicData>
+            </a:graphic>
+          </wp:inline>
+        </w:drawing>
+      </w:r>
+    </w:p>
+    <w:p>
+      <w:pPr>
+        <w:pStyle w:val="APA"/>
+        <w:ind w:firstLine="0"/>
+        <w:rPr>
+          <w:b/>
+          <w:bCs/>
+        </w:rPr>
+      </w:pPr>
+      <w:r>
+        <w:rPr>
+          <w:b/>
+          <w:bCs/>
+        </w:rPr>
+        <w:t xml:space="preserve">Figura 10 Prototipo de la pantalla Consultar disponibilidad (CU-03, RF03)</w:t>
+      </w:r>
+    </w:p>
+    <w:p>
+      <w:pPr>
+        <w:pStyle w:val="APA"/>
+      </w:pPr>
+      <w:r>
+        <w:t xml:space="preserve">Nota. Elaboración propia. Pantalla de alta fidelidad que especifica la interfaz de la Fase III; los datos corresponden a los registros de prueba del script 03 del repositorio.</w:t>
+      </w:r>
+    </w:p>
+    <w:p>
+      <w:pPr>
+        <w:pStyle w:val="APA"/>
+      </w:pPr>
+      <w:r>
+        <w:t xml:space="preserve">La Figura 10 muestra la consulta de disponibilidad. El recepcionista selecciona tipo, número de personas y fechas; la aplicación envía la solicitud a la API, que ejecuta la consulta sobre HABITACION, TIPO_HABITACION, TARIFA y RESERVA con el índice de la sección 7.5 y devuelve las habitaciones libres, las reservadas en el periodo y las que están en mantenimiento, junto con la tarifa vigente y el valor estimado. El cálculo nunca se hace en el dispositivo, lo que garantiza que todos los usuarios vean el mismo estado del inventario.</w:t>
+      </w:r>
+    </w:p>
+    <w:p>
+      <w:pPr>
+        <w:pStyle w:val="APA"/>
+        <w:ind w:firstLine="0"/>
+        <w:jc w:val="center"/>
+        <w:keepNext/>
+        <w:spacing w:line="240" w:lineRule="auto"/>
+      </w:pPr>
+      <w:r>
+        <w:drawing>
+          <wp:inline distT="0" distB="0" distL="0" distR="0">
+            <wp:extent cx="2600000" cy="5631000"/>
+            <wp:effectExtent l="0" t="0" r="0" b="0"/>
+            <wp:docPr id="909" name="Figura 11 confirmación"/>
+            <wp:cNvGraphicFramePr>
+              <a:graphicFrameLocks xmlns:a="http://schemas.openxmlformats.org/drawingml/2006/main" noChangeAspect="1"/>
+            </wp:cNvGraphicFramePr>
+            <a:graphic xmlns:a="http://schemas.openxmlformats.org/drawingml/2006/main">
+              <a:graphicData uri="http://schemas.openxmlformats.org/drawingml/2006/picture">
+                <pic:pic xmlns:pic="http://schemas.openxmlformats.org/drawingml/2006/picture">
+                  <pic:nvPicPr>
+                    <pic:cNvPr id="0" name="Figura 11 confirmación"/>
+                    <pic:cNvPicPr/>
+                  </pic:nvPicPr>
+                  <pic:blipFill>
+                    <a:blip r:embed="rIdP2"/>
+                    <a:stretch>
+                      <a:fillRect/>
+                    </a:stretch>
+                  </pic:blipFill>
+                  <pic:spPr>
+                    <a:xfrm>
+                      <a:off x="0" y="0"/>
+                      <a:ext cx="2600000" cy="5631000"/>
+                    </a:xfrm>
+                    <a:prstGeom prst="rect">
+                      <a:avLst/>
+                    </a:prstGeom>
+                  </pic:spPr>
+                </pic:pic>
+              </a:graphicData>
+            </a:graphic>
+          </wp:inline>
+        </w:drawing>
+      </w:r>
+    </w:p>
+    <w:p>
+      <w:pPr>
+        <w:pStyle w:val="APA"/>
+        <w:ind w:firstLine="0"/>
+        <w:rPr>
+          <w:b/>
+          <w:bCs/>
+        </w:rPr>
+      </w:pPr>
+      <w:r>
+        <w:rPr>
+          <w:b/>
+          <w:bCs/>
+        </w:rPr>
+        <w:t xml:space="preserve">Figura 11 Prototipo de la pantalla Nueva reserva, confirmación (CU-04, CU-05 y CU-06; RF04 y RF05)</w:t>
+      </w:r>
+    </w:p>
+    <w:p>
+      <w:pPr>
+        <w:pStyle w:val="APA"/>
+      </w:pPr>
+      <w:r>
+        <w:t xml:space="preserve">Nota. Elaboración propia. El mensaje inferior representa la respuesta de la API tras ejecutar la transacción de confirmación.</w:t>
+      </w:r>
+    </w:p>
+    <w:p>
+      <w:pPr>
+        <w:pStyle w:val="APA"/>
+      </w:pPr>
+      <w:r>
+        <w:t xml:space="preserve">La Figura 11 corresponde a la confirmación de la reserva, la transacción crítica del sistema. La pantalla reúne al huésped, la habitación, las fechas, el valor calculado con la tarifa vigente y el pago; al pulsar Confirmar reserva, la API ejecuta en el motor de datos el procedimiento de confirmación descrito en la sección 7.4, que vuelve a verificar la disponibilidad con bloqueo y registra en una sola unidad de trabajo la reserva, el pago, el comprobante y la anotación de bitácora. Si otra sesión tomó la habitación, la API responde con el código 409 y la pantalla informa que la habitación ya no está disponible, sin que quede ningún dato parcial. El código de reserva y el número de comprobante que se muestran provienen de la secuencia y de la tabla COMPROBANTE.</w:t>
+      </w:r>
+    </w:p>
+    <w:p>
+      <w:pPr>
+        <w:pStyle w:val="APA"/>
+        <w:ind w:firstLine="0"/>
+        <w:jc w:val="center"/>
+        <w:keepNext/>
+        <w:spacing w:line="240" w:lineRule="auto"/>
+      </w:pPr>
+      <w:r>
+        <w:drawing>
+          <wp:inline distT="0" distB="0" distL="0" distR="0">
+            <wp:extent cx="2600000" cy="5631000"/>
+            <wp:effectExtent l="0" t="0" r="0" b="0"/>
+            <wp:docPr id="910" name="Figura 12 asistente"/>
+            <wp:cNvGraphicFramePr>
+              <a:graphicFrameLocks xmlns:a="http://schemas.openxmlformats.org/drawingml/2006/main" noChangeAspect="1"/>
+            </wp:cNvGraphicFramePr>
+            <a:graphic xmlns:a="http://schemas.openxmlformats.org/drawingml/2006/main">
+              <a:graphicData uri="http://schemas.openxmlformats.org/drawingml/2006/picture">
+                <pic:pic xmlns:pic="http://schemas.openxmlformats.org/drawingml/2006/picture">
+                  <pic:nvPicPr>
+                    <pic:cNvPr id="0" name="Figura 12 asistente"/>
+                    <pic:cNvPicPr/>
+                  </pic:nvPicPr>
+                  <pic:blipFill>
+                    <a:blip r:embed="rIdP3"/>
+                    <a:stretch>
+                      <a:fillRect/>
+                    </a:stretch>
+                  </pic:blipFill>
+                  <pic:spPr>
+                    <a:xfrm>
+                      <a:off x="0" y="0"/>
+                      <a:ext cx="2600000" cy="5631000"/>
+                    </a:xfrm>
+                    <a:prstGeom prst="rect">
+                      <a:avLst/>
+                    </a:prstGeom>
+                  </pic:spPr>
+                </pic:pic>
+              </a:graphicData>
+            </a:graphic>
+          </wp:inline>
+        </w:drawing>
+      </w:r>
+    </w:p>
+    <w:p>
+      <w:pPr>
+        <w:pStyle w:val="APA"/>
+        <w:ind w:firstLine="0"/>
+        <w:rPr>
+          <w:b/>
+          <w:bCs/>
+        </w:rPr>
+      </w:pPr>
+      <w:r>
+        <w:rPr>
+          <w:b/>
+          <w:bCs/>
+        </w:rPr>
+        <w:t xml:space="preserve">Figura 12 Prototipo de la pantalla Asistente de consultas en lenguaje natural</w:t>
+      </w:r>
+    </w:p>
+    <w:p>
+      <w:pPr>
+        <w:pStyle w:val="APA"/>
+      </w:pPr>
+      <w:r>
+        <w:t xml:space="preserve">Nota. Elaboración propia. Cada respuesta indica la función de la API consultada; la última interacción ilustra que el asistente remite la creación de reservas a la pantalla transaccional.</w:t>
+      </w:r>
+    </w:p>
+    <w:p>
+      <w:pPr>
+        <w:pStyle w:val="APA"/>
+      </w:pPr>
+      <w:r>
+        <w:t xml:space="preserve">La Figura 12 presenta la pantalla del asistente descrita en la sección 13.3.4. Las preguntas del recepcionista viajan a la API, que las procesa con la lógica de integración de la sección 13.3.3 y responde con texto y datos estructurados; cada respuesta cita la función consultada para que el usuario conozca el origen de la información. La tercera interacción muestra el límite de diseño más importante: ante una solicitud de reservar, el asistente no ejecuta ninguna transacción y orienta al usuario hacia la pantalla de confirmación, de modo que la integridad del núcleo transaccional no depende del modelo de inteligencia artificial.</w:t>
       </w:r>
     </w:p>
     <w:p>
@@ -6504,7 +7092,7 @@
         <w:pStyle w:val="APA"/>
       </w:pPr>
       <w:r>
-        <w:t xml:space="preserve">La Fase III completó esa base con los elementos que hacen verificable el diseño. Los quince requerimientos funcionales reproducen uno a uno los casos de uso, los ocho requerimientos no funcionales fijan criterios comprobables de seguridad, integridad, rendimiento, disponibilidad, usabilidad, mantenibilidad, compatibilidad y trazabilidad, y los marcos conceptual y contextual explican los fundamentos transaccionales y el entorno hotelero en que se usará la aplicación. El marco integrador propone un asistente de consultas en lenguaje natural con Azure OpenAI Service, limitado a funciones de lectura, de modo que agiliza la atención sin intervenir en la transacción crítica. Las etapas siguientes deberán implementar la base de datos con sus scripts, construir la API con la transacción de confirmación y decidir con pruebas entre el bloqueo pesimista y la concurrencia optimista, conectar la aplicación móvil comenzando por CU-01, CU-03 y CU-04, verificar los criterios de la Tabla 3 mediante pruebas de aceptación y, por último, evaluar la conexión del asistente de inteligencia artificial.</w:t>
+        <w:t xml:space="preserve">La Fase III completó esa base con los elementos que hacen verificable el diseño. Los quince requerimientos funcionales reproducen uno a uno los casos de uso, los cinco requerimientos no funcionales fijan criterios comprobables de seguridad, integridad, rendimiento, usabilidad y trazabilidad, y los marcos conceptual y contextual explican los fundamentos transaccionales y el entorno hotelero en que se usará la aplicación. El diseño de datos se completó con el modelo entidad-relación y la arquitectura de la base de datos, que concentra en el motor las reglas de integridad. El marco integrador propone un asistente de consultas en lenguaje natural con Azure OpenAI Service, descrito por sus cinco componentes (modelo de datos, modelo de inteligencia artificial, lógica de integración, interfaz de usuario e infraestructura) y limitado a funciones de lectura, de modo que agiliza la atención sin intervenir en la transacción crítica; el prototipo de pantallas muestra cómo se verán la consulta de disponibilidad, la confirmación de la reserva y el asistente. Las etapas siguientes deberán implementar la base de datos con sus scripts, construir la API con la transacción de confirmación y decidir con pruebas entre el bloqueo pesimista y la concurrencia optimista, conectar la aplicación móvil comenzando por CU-01, CU-03 y CU-04, verificar los criterios de la Tabla 3 mediante pruebas de aceptación y, por último, evaluar la conexión del asistente de inteligencia artificial.</w:t>
       </w:r>
     </w:p>
     <w:p>
@@ -6553,6 +7141,24 @@
       </w:r>
       <w:r>
         <w:t xml:space="preserve"> (4.ª ed.). Addison-Wesley.</w:t>
+      </w:r>
+    </w:p>
+    <w:p>
+      <w:pPr>
+        <w:pStyle w:val="APA"/>
+      </w:pPr>
+      <w:r>
+        <w:t xml:space="preserve">Chen, P. P. (1976). The entity-relationship model: Toward a unified view of data. </w:t>
+      </w:r>
+      <w:r>
+        <w:rPr>
+          <w:i/>
+          <w:iCs/>
+        </w:rPr>
+        <w:t xml:space="preserve">ACM Transactions on Database Systems, 1</w:t>
+      </w:r>
+      <w:r>
+        <w:t xml:space="preserve">(1), 9-36. https://doi.org/10.1145/320434.320440</w:t>
       </w:r>
     </w:p>
     <w:p>

</xml_diff>

<commit_message>
Documento maestro: RF16-RF18, desglose de impuestos en RESERVA, Figuras 10-14 del prototipo funcional
</commit_message>
<xml_diff>
--- a/docs/FaseII_y_III_Documentacion_Proyecto_Hotel_Reservas.docx
+++ b/docs/FaseII_y_III_Documentacion_Proyecto_Hotel_Reservas.docx
@@ -476,7 +476,7 @@
               <w:fldChar w:fldCharType="begin"/>
               <w:instrText xml:space="preserve"> PAGEREF _TocF3S8 \h </w:instrText>
               <w:fldChar w:fldCharType="separate"/>
-              <w:t>29</w:t>
+              <w:t>30</w:t>
               <w:fldChar w:fldCharType="end"/>
             </w:r>
           </w:hyperlink>
@@ -511,7 +511,7 @@
               <w:fldChar w:fldCharType="begin"/>
               <w:instrText xml:space="preserve"> PAGEREF _TocF3RF \h </w:instrText>
               <w:fldChar w:fldCharType="separate"/>
-              <w:t>33</w:t>
+              <w:t>34</w:t>
               <w:fldChar w:fldCharType="end"/>
             </w:r>
           </w:hyperlink>
@@ -546,7 +546,7 @@
               <w:fldChar w:fldCharType="begin"/>
               <w:instrText xml:space="preserve"> PAGEREF _TocF31005 \h </w:instrText>
               <w:fldChar w:fldCharType="separate"/>
-              <w:t>35</w:t>
+              <w:t>36</w:t>
               <w:fldChar w:fldCharType="end"/>
             </w:r>
           </w:hyperlink>
@@ -581,7 +581,7 @@
               <w:fldChar w:fldCharType="begin"/>
               <w:instrText xml:space="preserve"> PAGEREF _TocF31006 \h </w:instrText>
               <w:fldChar w:fldCharType="separate"/>
-              <w:t>36</w:t>
+              <w:t>38</w:t>
               <w:fldChar w:fldCharType="end"/>
             </w:r>
           </w:hyperlink>
@@ -616,7 +616,7 @@
               <w:fldChar w:fldCharType="begin"/>
               <w:instrText xml:space="preserve"> PAGEREF _TocF31011 \h </w:instrText>
               <w:fldChar w:fldCharType="separate"/>
-              <w:t>40</w:t>
+              <w:t>42</w:t>
               <w:fldChar w:fldCharType="end"/>
             </w:r>
           </w:hyperlink>
@@ -651,7 +651,7 @@
               <w:fldChar w:fldCharType="begin"/>
               <w:instrText xml:space="preserve"> PAGEREF _TocF31018 \h </w:instrText>
               <w:fldChar w:fldCharType="separate"/>
-              <w:t>43</w:t>
+              <w:t>45</w:t>
               <w:fldChar w:fldCharType="end"/>
             </w:r>
           </w:hyperlink>
@@ -686,7 +686,7 @@
               <w:fldChar w:fldCharType="begin"/>
               <w:instrText xml:space="preserve"> PAGEREF _TocF31029 \h </w:instrText>
               <w:fldChar w:fldCharType="separate"/>
-              <w:t>50</w:t>
+              <w:t>52</w:t>
               <w:fldChar w:fldCharType="end"/>
             </w:r>
           </w:hyperlink>
@@ -721,7 +721,7 @@
               <w:fldChar w:fldCharType="begin"/>
               <w:instrText xml:space="preserve"> PAGEREF _Toc240726554 \h </w:instrText>
               <w:fldChar w:fldCharType="separate"/>
-              <w:t>57</w:t>
+              <w:t>63</w:t>
               <w:fldChar w:fldCharType="end"/>
             </w:r>
           </w:hyperlink>
@@ -756,7 +756,7 @@
               <w:fldChar w:fldCharType="begin"/>
               <w:instrText xml:space="preserve"> PAGEREF _Toc240726555 \h </w:instrText>
               <w:fldChar w:fldCharType="separate"/>
-              <w:t>59</w:t>
+              <w:t>65</w:t>
               <w:fldChar w:fldCharType="end"/>
             </w:r>
           </w:hyperlink>
@@ -2621,6 +2621,14 @@
     <w:p>
       <w:pPr>
         <w:pStyle w:val="APA"/>
+      </w:pPr>
+      <w:r>
+        <w:t xml:space="preserve">Ajuste del diseño de datos en la Fase III. Para atender el requerimiento RF16, la tabla RESERVA desglosa el precio en cuatro columnas adicionales: subtotal, que es el producto de las noches por la tarifa vigente; tasa_iva, con el valor 0,19 de la tarifa general del impuesto sobre las ventas o 0 cuando aplica la exención; impuesto, igual al subtotal multiplicado por la tasa; y exento_iva, un indicador que se activa para el huésped extranjero no residente, cuyo servicio de alojamiento está exento del IVA conforme al artículo 481 del Estatuto Tributario (Presidencia de la República de Colombia, 1989). La columna valor_total pasa a representar el precio neto y una restricción CHECK garantiza que valor_total sea igual a subtotal más impuesto, de manera que el desglose que se muestra al huésped y el que se registra en PAGO y en COMPROBANTE sean siempre coherentes. La tabla HUESPED añade el indicador extranjero_no_residente, del que se toma el valor por defecto de la exención, y el campo telefono, ya existente, es el destino del comprobante compartible por WhatsApp (RF17). La reserva rápida para huésped frecuente (RF18) no requiere columnas nuevas: se calcula sobre las reservas del huésped en estado confirmada, en casa o finalizada. Estos ajustes se implementan en el script 05 del repositorio, que también actualiza el procedimiento de confirmación para calcular el impuesto dentro de la misma transacción.</w:t>
+      </w:r>
+    </w:p>
+    <w:p>
+      <w:pPr>
+        <w:pStyle w:val="APA"/>
         <w:rPr>
           <w:b/>
           <w:bCs/>
@@ -3441,7 +3449,7 @@
         <w:pStyle w:val="APA"/>
       </w:pPr>
       <w:r>
-        <w:t xml:space="preserve">Los requerimientos funcionales describen las acciones que el sistema transaccional debe permitir a sus usuarios. Siguiendo a Sommerville (2011), se formulan como declaraciones de servicios que el sistema ofrece, con el actor que las solicita y el resultado observable que producen, de manera que cada una pueda convertirse después en un caso de prueba. La Tabla 2 presenta los quince requerimientos funcionales del proyecto. Su numeración se corresponde uno a uno con los casos de uso de la sección 5, lo que conserva la trazabilidad construida en la Fase II y evita que aparezcan funciones no respaldadas por el diseño.</w:t>
+        <w:t xml:space="preserve">Los requerimientos funcionales describen las acciones que el sistema transaccional debe permitir a sus usuarios. Siguiendo a Sommerville (2011), se formulan como declaraciones de servicios que el sistema ofrece, con el actor que las solicita y el resultado observable que producen, de manera que cada una pueda convertirse después en un caso de prueba. La Tabla 2 presenta los dieciocho requerimientos funcionales del proyecto. Los quince primeros se corresponden uno a uno con los casos de uso de la sección 5, lo que conserva la trazabilidad construida en la Fase II y evita que aparezcan funciones no respaldadas por el diseño; los tres últimos (RF16 a RF18) se incorporan en esta fase a partir de la revisión del prototipo: el cálculo de impuestos para informar el precio neto y dos funciones diferenciadoras, el comprobante compartible por WhatsApp y la reserva rápida para el huésped frecuente, que simplifican el uso de la aplicación frente a otras soluciones de reservas.</w:t>
       </w:r>
     </w:p>
     <w:p>
@@ -4930,6 +4938,276 @@
           </w:p>
         </w:tc>
       </w:tr>
+      <w:tr>
+        <w:trPr>
+          <w:cantSplit/>
+        </w:trPr>
+        <w:tc>
+          <w:tcPr>
+            <w:tcW w:w="1000" w:type="dxa"/>
+          </w:tcPr>
+          <w:p>
+            <w:pPr>
+              <w:spacing w:before="40" w:after="40" w:line="240" w:lineRule="auto"/>
+            </w:pPr>
+            <w:r>
+              <w:rPr>
+                <w:sz w:val="20"/>
+                <w:szCs w:val="20"/>
+              </w:rPr>
+              <w:t xml:space="preserve">RF16</w:t>
+            </w:r>
+          </w:p>
+        </w:tc>
+        <w:tc>
+          <w:tcPr>
+            <w:tcW w:w="1450" w:type="dxa"/>
+          </w:tcPr>
+          <w:p>
+            <w:pPr>
+              <w:spacing w:before="40" w:after="40" w:line="240" w:lineRule="auto"/>
+            </w:pPr>
+            <w:r>
+              <w:rPr>
+                <w:sz w:val="20"/>
+                <w:szCs w:val="20"/>
+              </w:rPr>
+              <w:t xml:space="preserve">Calcular impuestos y precio neto</w:t>
+            </w:r>
+          </w:p>
+        </w:tc>
+        <w:tc>
+          <w:tcPr>
+            <w:tcW w:w="3250" w:type="dxa"/>
+          </w:tcPr>
+          <w:p>
+            <w:pPr>
+              <w:spacing w:before="40" w:after="40" w:line="240" w:lineRule="auto"/>
+            </w:pPr>
+            <w:r>
+              <w:rPr>
+                <w:sz w:val="20"/>
+                <w:szCs w:val="20"/>
+              </w:rPr>
+              <w:t xml:space="preserve">Desglosar el valor de la reserva en subtotal de alojamiento, IVA del 19 % y precio neto, aplicando la exención del IVA cuando el huésped es extranjero no residente, y registrar el desglose en la reserva, el pago y el comprobante.</w:t>
+            </w:r>
+          </w:p>
+        </w:tc>
+        <w:tc>
+          <w:tcPr>
+            <w:tcW w:w="1300" w:type="dxa"/>
+          </w:tcPr>
+          <w:p>
+            <w:pPr>
+              <w:spacing w:before="40" w:after="40" w:line="240" w:lineRule="auto"/>
+            </w:pPr>
+            <w:r>
+              <w:rPr>
+                <w:sz w:val="20"/>
+                <w:szCs w:val="20"/>
+              </w:rPr>
+              <w:t xml:space="preserve">Recepcionista</w:t>
+            </w:r>
+          </w:p>
+        </w:tc>
+        <w:tc>
+          <w:tcPr>
+            <w:tcW w:w="2350" w:type="dxa"/>
+          </w:tcPr>
+          <w:p>
+            <w:pPr>
+              <w:spacing w:before="40" w:after="40" w:line="240" w:lineRule="auto"/>
+            </w:pPr>
+            <w:r>
+              <w:rPr>
+                <w:sz w:val="20"/>
+                <w:szCs w:val="20"/>
+              </w:rPr>
+              <w:t xml:space="preserve">Reserva con subtotal, impuesto y precio neto coherentes (valor_total = subtotal + impuesto); el huésped conoce el valor final antes de confirmar (extiende CU-04 y CU-06).</w:t>
+            </w:r>
+          </w:p>
+        </w:tc>
+      </w:tr>
+      <w:tr>
+        <w:trPr>
+          <w:cantSplit/>
+        </w:trPr>
+        <w:tc>
+          <w:tcPr>
+            <w:tcW w:w="1000" w:type="dxa"/>
+          </w:tcPr>
+          <w:p>
+            <w:pPr>
+              <w:spacing w:before="40" w:after="40" w:line="240" w:lineRule="auto"/>
+            </w:pPr>
+            <w:r>
+              <w:rPr>
+                <w:sz w:val="20"/>
+                <w:szCs w:val="20"/>
+              </w:rPr>
+              <w:t xml:space="preserve">RF17</w:t>
+            </w:r>
+          </w:p>
+        </w:tc>
+        <w:tc>
+          <w:tcPr>
+            <w:tcW w:w="1450" w:type="dxa"/>
+          </w:tcPr>
+          <w:p>
+            <w:pPr>
+              <w:spacing w:before="40" w:after="40" w:line="240" w:lineRule="auto"/>
+            </w:pPr>
+            <w:r>
+              <w:rPr>
+                <w:sz w:val="20"/>
+                <w:szCs w:val="20"/>
+              </w:rPr>
+              <w:t xml:space="preserve">Compartir comprobante por WhatsApp</w:t>
+            </w:r>
+          </w:p>
+        </w:tc>
+        <w:tc>
+          <w:tcPr>
+            <w:tcW w:w="3250" w:type="dxa"/>
+          </w:tcPr>
+          <w:p>
+            <w:pPr>
+              <w:spacing w:before="40" w:after="40" w:line="240" w:lineRule="auto"/>
+            </w:pPr>
+            <w:r>
+              <w:rPr>
+                <w:sz w:val="20"/>
+                <w:szCs w:val="20"/>
+              </w:rPr>
+              <w:t xml:space="preserve">Generar, a partir del comprobante, un mensaje con el código de reserva, el huésped, la habitación, las fechas y el desglose del precio, y enviarlo al teléfono del huésped por WhatsApp o copiarlo al portapapeles.</w:t>
+            </w:r>
+          </w:p>
+        </w:tc>
+        <w:tc>
+          <w:tcPr>
+            <w:tcW w:w="1300" w:type="dxa"/>
+          </w:tcPr>
+          <w:p>
+            <w:pPr>
+              <w:spacing w:before="40" w:after="40" w:line="240" w:lineRule="auto"/>
+            </w:pPr>
+            <w:r>
+              <w:rPr>
+                <w:sz w:val="20"/>
+                <w:szCs w:val="20"/>
+              </w:rPr>
+              <w:t xml:space="preserve">Recepcionista</w:t>
+            </w:r>
+          </w:p>
+        </w:tc>
+        <w:tc>
+          <w:tcPr>
+            <w:tcW w:w="2350" w:type="dxa"/>
+          </w:tcPr>
+          <w:p>
+            <w:pPr>
+              <w:spacing w:before="40" w:after="40" w:line="240" w:lineRule="auto"/>
+            </w:pPr>
+            <w:r>
+              <w:rPr>
+                <w:sz w:val="20"/>
+                <w:szCs w:val="20"/>
+              </w:rPr>
+              <w:t xml:space="preserve">Mensaje enviado al número registrado del huésped en un toque, sin transcribir datos; disponible también desde el historial (extiende CU-06).</w:t>
+            </w:r>
+          </w:p>
+        </w:tc>
+      </w:tr>
+      <w:tr>
+        <w:trPr>
+          <w:cantSplit/>
+        </w:trPr>
+        <w:tc>
+          <w:tcPr>
+            <w:tcW w:w="1000" w:type="dxa"/>
+          </w:tcPr>
+          <w:p>
+            <w:pPr>
+              <w:spacing w:before="40" w:after="40" w:line="240" w:lineRule="auto"/>
+            </w:pPr>
+            <w:r>
+              <w:rPr>
+                <w:sz w:val="20"/>
+                <w:szCs w:val="20"/>
+              </w:rPr>
+              <w:t xml:space="preserve">RF18</w:t>
+            </w:r>
+          </w:p>
+        </w:tc>
+        <w:tc>
+          <w:tcPr>
+            <w:tcW w:w="1450" w:type="dxa"/>
+          </w:tcPr>
+          <w:p>
+            <w:pPr>
+              <w:spacing w:before="40" w:after="40" w:line="240" w:lineRule="auto"/>
+            </w:pPr>
+            <w:r>
+              <w:rPr>
+                <w:sz w:val="20"/>
+                <w:szCs w:val="20"/>
+              </w:rPr>
+              <w:t xml:space="preserve">Reserva rápida para huésped frecuente</w:t>
+            </w:r>
+          </w:p>
+        </w:tc>
+        <w:tc>
+          <w:tcPr>
+            <w:tcW w:w="3250" w:type="dxa"/>
+          </w:tcPr>
+          <w:p>
+            <w:pPr>
+              <w:spacing w:before="40" w:after="40" w:line="240" w:lineRule="auto"/>
+            </w:pPr>
+            <w:r>
+              <w:rPr>
+                <w:sz w:val="20"/>
+                <w:szCs w:val="20"/>
+              </w:rPr>
+              <w:t xml:space="preserve">Reconocer al huésped por su número de documento, mostrar su número de estadías y las preferencias de la última (tipo de habitación, personas, noches y medio de pago) y precargar con ellas la consulta de disponibilidad y la confirmación.</w:t>
+            </w:r>
+          </w:p>
+        </w:tc>
+        <w:tc>
+          <w:tcPr>
+            <w:tcW w:w="1300" w:type="dxa"/>
+          </w:tcPr>
+          <w:p>
+            <w:pPr>
+              <w:spacing w:before="40" w:after="40" w:line="240" w:lineRule="auto"/>
+            </w:pPr>
+            <w:r>
+              <w:rPr>
+                <w:sz w:val="20"/>
+                <w:szCs w:val="20"/>
+              </w:rPr>
+              <w:t xml:space="preserve">Recepcionista</w:t>
+            </w:r>
+          </w:p>
+        </w:tc>
+        <w:tc>
+          <w:tcPr>
+            <w:tcW w:w="2350" w:type="dxa"/>
+          </w:tcPr>
+          <w:p>
+            <w:pPr>
+              <w:spacing w:before="40" w:after="40" w:line="240" w:lineRule="auto"/>
+            </w:pPr>
+            <w:r>
+              <w:rPr>
+                <w:sz w:val="20"/>
+                <w:szCs w:val="20"/>
+              </w:rPr>
+              <w:t xml:space="preserve">Huésped con dos o más estadías identificado y reserva precargada en un toque; el recepcionista solo elige la habitación y confirma (extiende CU-03 y CU-04).</w:t>
+            </w:r>
+          </w:p>
+        </w:tc>
+      </w:tr>
     </w:tbl>
     <w:p>
       <w:pPr>
@@ -4944,7 +5222,7 @@
         <w:pStyle w:val="APA"/>
       </w:pPr>
       <w:r>
-        <w:t xml:space="preserve">Los requerimientos RF03, RF04, RF05 y RF06 forman el núcleo transaccional del sistema: la consulta de disponibilidad alimenta la creación de la reserva, y esta solo se considera completa cuando el pago y el comprobante quedan registrados en la misma unidad de trabajo. Los requerimientos RF07 a RF10 cubren los cambios de estado posteriores y, junto con RF12, dependen de la bitácora para dejar evidencia de cada operación. Los requerimientos RF11 y RF14 corresponden a la administración del inventario y de las cuentas, y RF13 explota los datos registrados para apoyar las decisiones del administrador.</w:t>
+        <w:t xml:space="preserve">Los requerimientos RF03, RF04, RF05 y RF06 forman el núcleo transaccional del sistema: la consulta de disponibilidad alimenta la creación de la reserva, y esta solo se considera completa cuando el pago y el comprobante quedan registrados en la misma unidad de trabajo. Los requerimientos RF07 a RF10 cubren los cambios de estado posteriores y, junto con RF12, dependen de la bitácora para dejar evidencia de cada operación. Los requerimientos RF11 y RF14 corresponden a la administración del inventario y de las cuentas, y RF13 explota los datos registrados para apoyar las decisiones del administrador. Los requerimientos RF16 a RF18 no crean casos de uso nuevos, sino que amplían la transacción de confirmación y el comprobante: RF16 incorpora en la propia transacción el cálculo del IVA y del precio neto, de modo que el valor que ve el huésped es el que queda registrado en RESERVA, PAGO y COMPROBANTE; RF17 reutiliza el comprobante ya emitido para enviarlo por WhatsApp; y RF18 se apoya en el historial de reservas del huésped para precargar la consulta de disponibilidad y la confirmación, sin omitir la verificación de disponibilidad con bloqueo.</w:t>
       </w:r>
     </w:p>
     <w:p>
@@ -5529,7 +5807,7 @@
         <w:pStyle w:val="APA"/>
       </w:pPr>
       <w:r>
-        <w:t xml:space="preserve">El inventario de habitaciones agrupa las unidades físicas del hotel por tipo y capacidad, y la tarifa fija el precio por noche de cada tipo con un periodo de vigencia, lo que permite conservar el historial de precios. El comprobante es el soporte documental entregado al huésped al confirmar la reserva y constituye la evidencia principal ante una reclamación. El check-in y el check-out son los registros de llegada y salida que vinculan la reserva con la ocupación efectiva de la habitación. Estos conceptos definen el vocabulario con el que se nombraron los casos de uso, las clases y las tablas en las secciones anteriores.</w:t>
+        <w:t xml:space="preserve">El inventario de habitaciones agrupa las unidades físicas del hotel por tipo y capacidad, y la tarifa fija el precio por noche de cada tipo con un periodo de vigencia, lo que permite conservar el historial de precios. El comprobante es el soporte documental entregado al huésped al confirmar la reserva y constituye la evidencia principal ante una reclamación. El check-in y el check-out son los registros de llegada y salida que vinculan la reserva con la ocupación efectiva de la habitación. El precio neto es el valor final que paga el huésped: el subtotal del alojamiento más el impuesto sobre las ventas (IVA), que en Colombia grava los servicios hoteleros con la tarifa general del 19 %, salvo cuando se prestan a extranjeros no residentes, caso en el que el servicio está exento (Presidencia de la República de Colombia, 1989). El huésped frecuente es aquel que ha completado dos o más estadías en el hotel y cuyas preferencias, registradas en sus reservas anteriores, permiten agilizar una nueva reserva. Estos conceptos definen el vocabulario con el que se nombraron los casos de uso, las clases y las tablas en las secciones anteriores.</w:t>
       </w:r>
     </w:p>
     <w:p>
@@ -5772,7 +6050,7 @@
         <w:pStyle w:val="APA"/>
       </w:pPr>
       <w:r>
-        <w:t xml:space="preserve">Hotel Reservas es una aplicación móvil Android, distribuida como APK, conectada a una API y a una base de datos central. Su propósito es administrar el ciclo completo de las reservas de un hotel garantizando la integridad y la trazabilidad de la información. La aplicación gestiona cinco grupos de datos: los usuarios del personal con su perfil, los huéspedes, el inventario de habitaciones con sus tipos y tarifas, las reservas con sus pagos y comprobantes, y la bitácora de cambios. Sus funcionalidades principales, enumeradas en la Tabla 2, son la autenticación, el registro de huéspedes, la consulta de disponibilidad, la creación, modificación y cancelación de reservas, el registro de pagos y comprobantes, el check-in y el check-out, la gestión del inventario y de los usuarios, el historial de reservas y el reporte de ocupación. Desde el punto de vista del usuario, el flujo típico consiste en consultar la disponibilidad de un tipo de habitación para unas fechas, seleccionar una habitación, asociar al huésped, registrar el pago y recibir el comprobante en una sola secuencia de pantallas. El prototipo de la entrega S7 contiene la pantalla de inicio y la navegación entre módulos; las siguientes entregas la conectarán con la API y la base de datos.</w:t>
+        <w:t xml:space="preserve">Hotel Reservas es una aplicación móvil Android, distribuida como APK, conectada a una API y a una base de datos central. Su propósito es administrar el ciclo completo de las reservas de un hotel garantizando la integridad y la trazabilidad de la información. La aplicación gestiona cinco grupos de datos: los usuarios del personal con su perfil, los huéspedes, el inventario de habitaciones con sus tipos y tarifas, las reservas con sus pagos y comprobantes, y la bitácora de cambios. Sus funcionalidades principales, enumeradas en la Tabla 2, son la autenticación, el registro de huéspedes, la consulta de disponibilidad, la creación, modificación y cancelación de reservas, el registro de pagos y comprobantes, el check-in y el check-out, la gestión del inventario y de los usuarios, el historial de reservas y el reporte de ocupación. Desde el punto de vista del usuario, el flujo típico consiste en consultar la disponibilidad de un tipo de habitación para unas fechas, seleccionar una habitación, asociar al huésped, revisar el precio neto con su desglose de impuestos, registrar el pago y recibir el comprobante en una sola secuencia de pantallas. Dos funciones distinguen a la aplicación de otras soluciones de reservas: el comprobante se envía al huésped por WhatsApp en un toque, sin transcribir datos, y el huésped frecuente se reconoce por su documento para repetir su última estadía con los filtros y el medio de pago ya cargados. El prototipo de la entrega S7 contiene la pantalla de inicio y la navegación entre módulos; las siguientes entregas la conectarán con la API y la base de datos.</w:t>
       </w:r>
     </w:p>
     <w:p>
@@ -6735,7 +7013,7 @@
         <w:pStyle w:val="APA"/>
       </w:pPr>
       <w:r>
-        <w:t xml:space="preserve">Esta sección presenta el prototipo de la aplicación móvil y lo relaciona con la arquitectura, el backend y el diseño de datos descritos en las secciones anteriores. El prototipo tiene dos componentes: la pantalla de inicio, construida en .NET MAUI y publicada en el repositorio del proyecto en la entrega S7, y las pantallas de alta fidelidad de las funciones transaccionales y del asistente, elaboradas en esta fase como especificación visual de lo que se construirá en las etapas siguientes. Todas las pantallas comparten la paleta institucional, la barra de pestañas con cinco destinos y la regla de que la aplicación solo muestra datos obtenidos de la API.</w:t>
+        <w:t xml:space="preserve">Esta sección presenta el prototipo de la aplicación móvil y lo relaciona con la arquitectura, el backend y el diseño de datos descritos en las secciones anteriores. El prototipo tiene dos componentes: la pantalla de inicio, construida en .NET MAUI y publicada en el repositorio del proyecto en la entrega S7, y el prototipo funcional de las pantallas transaccionales y del asistente, integrado en la APK (versión 0.3) y disponible también como página interactiva en el repositorio, que simula la API y la base de datos con los datos del script 03 y permite ejecutar la transacción de confirmación, la prueba de concurrencia, el cálculo de impuestos, el comprobante compartible y la reserva rápida. Todas las pantallas comparten la paleta institucional, la barra de pestañas con cinco destinos y la regla de que la aplicación solo muestra datos obtenidos de la API.</w:t>
       </w:r>
     </w:p>
     <w:p>
@@ -6885,7 +7163,7 @@
         <w:pStyle w:val="APA"/>
       </w:pPr>
       <w:r>
-        <w:t xml:space="preserve">Nota. Elaboración propia. Pantalla de alta fidelidad que especifica la interfaz de la Fase III; los datos corresponden a los registros de prueba del script 03 del repositorio.</w:t>
+        <w:t xml:space="preserve">Nota. Elaboración propia. Captura del prototipo funcional; los datos corresponden a los registros de prueba del script 03 del repositorio y los valores mostrados son precios netos con IVA incluido.</w:t>
       </w:r>
     </w:p>
     <w:p>
@@ -6956,23 +7234,23 @@
           <w:b/>
           <w:bCs/>
         </w:rPr>
-        <w:t xml:space="preserve">Figura 11 Prototipo de la pantalla Nueva reserva, confirmación (CU-04, CU-05 y CU-06; RF04 y RF05)</w:t>
-      </w:r>
-    </w:p>
-    <w:p>
-      <w:pPr>
-        <w:pStyle w:val="APA"/>
-      </w:pPr>
-      <w:r>
-        <w:t xml:space="preserve">Nota. Elaboración propia. El mensaje inferior representa la respuesta de la API tras ejecutar la transacción de confirmación.</w:t>
-      </w:r>
-    </w:p>
-    <w:p>
-      <w:pPr>
-        <w:pStyle w:val="APA"/>
-      </w:pPr>
-      <w:r>
-        <w:t xml:space="preserve">La Figura 11 corresponde a la confirmación de la reserva, la transacción crítica del sistema. La pantalla reúne al huésped, la habitación, las fechas, el valor calculado con la tarifa vigente y el pago; al pulsar Confirmar reserva, la API ejecuta en el motor de datos el procedimiento de confirmación descrito en la sección 7.4, que vuelve a verificar la disponibilidad con bloqueo y registra en una sola unidad de trabajo la reserva, el pago, el comprobante y la anotación de bitácora. Si otra sesión tomó la habitación, la API responde con el código 409 y la pantalla informa que la habitación ya no está disponible, sin que quede ningún dato parcial. El código de reserva y el número de comprobante que se muestran provienen de la secuencia y de la tabla COMPROBANTE.</w:t>
+        <w:t xml:space="preserve">Figura 11 Prototipo de la pantalla Nueva reserva, confirmación con desglose de impuestos (CU-04, CU-05 y CU-06; RF04, RF05 y RF16)</w:t>
+      </w:r>
+    </w:p>
+    <w:p>
+      <w:pPr>
+        <w:pStyle w:val="APA"/>
+      </w:pPr>
+      <w:r>
+        <w:t xml:space="preserve">Nota. Elaboración propia. Captura del prototipo funcional incluido en la APK; la etiqueta de huésped frecuente y la casilla de exención del IVA corresponden a RF18 y RF16.</w:t>
+      </w:r>
+    </w:p>
+    <w:p>
+      <w:pPr>
+        <w:pStyle w:val="APA"/>
+      </w:pPr>
+      <w:r>
+        <w:t xml:space="preserve">La Figura 11 corresponde a la confirmación de la reserva, la transacción crítica del sistema. La pantalla reúne al huésped, la habitación, las fechas y el precio calculado con la tarifa vigente, desglosado en subtotal de alojamiento, IVA del 19 % y precio neto, que es el valor que se registra como pago; la casilla de huésped extranjero no residente aplica la exención del IVA y recalcula el neto antes de confirmar (RF16). Al pulsar Confirmar reserva, la API ejecuta en el motor de datos el procedimiento de confirmación descrito en la sección 7.4, que vuelve a verificar la disponibilidad con bloqueo y registra en una sola unidad de trabajo la reserva, el pago, el comprobante y la anotación de bitácora. Si otra sesión tomó la habitación, la API responde con el código 409 y la pantalla informa que la habitación ya no está disponible, sin que quede ningún dato parcial. El código de reserva y el número de comprobante que se muestran provienen de la secuencia y de la tabla COMPROBANTE.</w:t>
       </w:r>
     </w:p>
     <w:p>
@@ -6986,9 +7264,9 @@
       <w:r>
         <w:drawing>
           <wp:inline distT="0" distB="0" distL="0" distR="0">
-            <wp:extent cx="2600000" cy="5631000"/>
+            <wp:extent cx="2600000" cy="5590000"/>
             <wp:effectExtent l="0" t="0" r="0" b="0"/>
-            <wp:docPr id="910" name="Figura 12 asistente"/>
+            <wp:docPr id="911" name="Figura 12 comprobante"/>
             <wp:cNvGraphicFramePr>
               <a:graphicFrameLocks xmlns:a="http://schemas.openxmlformats.org/drawingml/2006/main" noChangeAspect="1"/>
             </wp:cNvGraphicFramePr>
@@ -6996,7 +7274,165 @@
               <a:graphicData uri="http://schemas.openxmlformats.org/drawingml/2006/picture">
                 <pic:pic xmlns:pic="http://schemas.openxmlformats.org/drawingml/2006/picture">
                   <pic:nvPicPr>
-                    <pic:cNvPr id="0" name="Figura 12 asistente"/>
+                    <pic:cNvPr id="0" name="Figura 12 comprobante"/>
+                    <pic:cNvPicPr/>
+                  </pic:nvPicPr>
+                  <pic:blipFill>
+                    <a:blip r:embed="rIdP4"/>
+                    <a:stretch>
+                      <a:fillRect/>
+                    </a:stretch>
+                  </pic:blipFill>
+                  <pic:spPr>
+                    <a:xfrm>
+                      <a:off x="0" y="0"/>
+                      <a:ext cx="2600000" cy="5590000"/>
+                    </a:xfrm>
+                    <a:prstGeom prst="rect">
+                      <a:avLst/>
+                    </a:prstGeom>
+                  </pic:spPr>
+                </pic:pic>
+              </a:graphicData>
+            </a:graphic>
+          </wp:inline>
+        </w:drawing>
+      </w:r>
+    </w:p>
+    <w:p>
+      <w:pPr>
+        <w:pStyle w:val="APA"/>
+        <w:ind w:firstLine="0"/>
+        <w:rPr>
+          <w:b/>
+          <w:bCs/>
+        </w:rPr>
+      </w:pPr>
+      <w:r>
+        <w:rPr>
+          <w:b/>
+          <w:bCs/>
+        </w:rPr>
+        <w:t xml:space="preserve">Figura 12 Prototipo del comprobante compartible por WhatsApp tras la confirmación (RF06 y RF17)</w:t>
+      </w:r>
+    </w:p>
+    <w:p>
+      <w:pPr>
+        <w:pStyle w:val="APA"/>
+      </w:pPr>
+      <w:r>
+        <w:t xml:space="preserve">Nota. Elaboración propia. El texto del comprobante lo genera la API a partir de RESERVA, COMPROBANTE, HUESPED y PAGO; el botón abre WhatsApp con el mensaje dirigido al teléfono registrado del huésped.</w:t>
+      </w:r>
+    </w:p>
+    <w:p>
+      <w:pPr>
+        <w:pStyle w:val="APA"/>
+      </w:pPr>
+      <w:r>
+        <w:t xml:space="preserve">La Figura 12 muestra el resultado de la confirmación: el mensaje de éxito con el código de reserva, el número de comprobante y el precio neto, seguido del comprobante compartible. La aplicación solicita a la API el texto del comprobante, que se construye en el servidor con los datos ya registrados en la transacción (código, huésped, habitación, fechas, subtotal, impuesto, precio neto, medio de pago y estado) y lo entrega a WhatsApp con el número de teléfono del huésped, o lo copia al portapapeles cuando el huésped prefiere otro canal. Esta función responde a la problemática de la Fase I, pues el huésped recibe de inmediato una evidencia escrita de su reserva, y está disponible también desde el historial para cualquier reserva confirmada o en casa.</w:t>
+      </w:r>
+    </w:p>
+    <w:p>
+      <w:pPr>
+        <w:pStyle w:val="APA"/>
+        <w:ind w:firstLine="0"/>
+        <w:jc w:val="center"/>
+        <w:keepNext/>
+        <w:spacing w:line="240" w:lineRule="auto"/>
+      </w:pPr>
+      <w:r>
+        <w:drawing>
+          <wp:inline distT="0" distB="0" distL="0" distR="0">
+            <wp:extent cx="2600000" cy="5590000"/>
+            <wp:effectExtent l="0" t="0" r="0" b="0"/>
+            <wp:docPr id="912" name="Figura 13 reserva rápida"/>
+            <wp:cNvGraphicFramePr>
+              <a:graphicFrameLocks xmlns:a="http://schemas.openxmlformats.org/drawingml/2006/main" noChangeAspect="1"/>
+            </wp:cNvGraphicFramePr>
+            <a:graphic xmlns:a="http://schemas.openxmlformats.org/drawingml/2006/main">
+              <a:graphicData uri="http://schemas.openxmlformats.org/drawingml/2006/picture">
+                <pic:pic xmlns:pic="http://schemas.openxmlformats.org/drawingml/2006/picture">
+                  <pic:nvPicPr>
+                    <pic:cNvPr id="0" name="Figura 13 reserva rápida"/>
+                    <pic:cNvPicPr/>
+                  </pic:nvPicPr>
+                  <pic:blipFill>
+                    <a:blip r:embed="rIdP5"/>
+                    <a:stretch>
+                      <a:fillRect/>
+                    </a:stretch>
+                  </pic:blipFill>
+                  <pic:spPr>
+                    <a:xfrm>
+                      <a:off x="0" y="0"/>
+                      <a:ext cx="2600000" cy="5590000"/>
+                    </a:xfrm>
+                    <a:prstGeom prst="rect">
+                      <a:avLst/>
+                    </a:prstGeom>
+                  </pic:spPr>
+                </pic:pic>
+              </a:graphicData>
+            </a:graphic>
+          </wp:inline>
+        </w:drawing>
+      </w:r>
+    </w:p>
+    <w:p>
+      <w:pPr>
+        <w:pStyle w:val="APA"/>
+        <w:ind w:firstLine="0"/>
+        <w:rPr>
+          <w:b/>
+          <w:bCs/>
+        </w:rPr>
+      </w:pPr>
+      <w:r>
+        <w:rPr>
+          <w:b/>
+          <w:bCs/>
+        </w:rPr>
+        <w:t xml:space="preserve">Figura 13 Prototipo de la reserva rápida para huésped frecuente en la pantalla de inicio (RF18)</w:t>
+      </w:r>
+    </w:p>
+    <w:p>
+      <w:pPr>
+        <w:pStyle w:val="APA"/>
+      </w:pPr>
+      <w:r>
+        <w:t xml:space="preserve">Nota. Elaboración propia. El perfil del huésped y sus preferencias provienen de las reservas anteriores registradas en la base de datos.</w:t>
+      </w:r>
+    </w:p>
+    <w:p>
+      <w:pPr>
+        <w:pStyle w:val="APA"/>
+      </w:pPr>
+      <w:r>
+        <w:t xml:space="preserve">La Figura 13 presenta la reserva rápida para huésped frecuente. El recepcionista digita únicamente el número de documento; la API consulta HUESPED y las reservas anteriores del huésped, determina si es frecuente (dos o más estadías) y devuelve las preferencias de su última estadía: tipo de habitación, número de personas, noches y medio de pago. Con el botón Repetir última estadía la aplicación precarga la consulta de disponibilidad y, al elegir la habitación, la pantalla de confirmación ya tiene seleccionados al huésped y su medio de pago, de modo que una reserva habitual se completa en tres toques. La verificación de disponibilidad con bloqueo y la transacción de confirmación son las mismas de la Figura 11: la simplificación está en la captura de datos, no en el control transaccional.</w:t>
+      </w:r>
+    </w:p>
+    <w:p>
+      <w:pPr>
+        <w:pStyle w:val="APA"/>
+        <w:ind w:firstLine="0"/>
+        <w:jc w:val="center"/>
+        <w:keepNext/>
+        <w:spacing w:line="240" w:lineRule="auto"/>
+      </w:pPr>
+      <w:r>
+        <w:drawing>
+          <wp:inline distT="0" distB="0" distL="0" distR="0">
+            <wp:extent cx="2600000" cy="5631000"/>
+            <wp:effectExtent l="0" t="0" r="0" b="0"/>
+            <wp:docPr id="910" name="Figura 14 asistente"/>
+            <wp:cNvGraphicFramePr>
+              <a:graphicFrameLocks xmlns:a="http://schemas.openxmlformats.org/drawingml/2006/main" noChangeAspect="1"/>
+            </wp:cNvGraphicFramePr>
+            <a:graphic xmlns:a="http://schemas.openxmlformats.org/drawingml/2006/main">
+              <a:graphicData uri="http://schemas.openxmlformats.org/drawingml/2006/picture">
+                <pic:pic xmlns:pic="http://schemas.openxmlformats.org/drawingml/2006/picture">
+                  <pic:nvPicPr>
+                    <pic:cNvPr id="0" name="Figura 14 asistente"/>
                     <pic:cNvPicPr/>
                   </pic:nvPicPr>
                   <pic:blipFill>
@@ -7035,7 +7471,7 @@
           <w:b/>
           <w:bCs/>
         </w:rPr>
-        <w:t xml:space="preserve">Figura 12 Prototipo de la pantalla Asistente de consultas en lenguaje natural</w:t>
+        <w:t xml:space="preserve">Figura 14 Prototipo de la pantalla Asistente de consultas en lenguaje natural</w:t>
       </w:r>
     </w:p>
     <w:p>
@@ -7051,7 +7487,7 @@
         <w:pStyle w:val="APA"/>
       </w:pPr>
       <w:r>
-        <w:t xml:space="preserve">La Figura 12 presenta la pantalla del asistente descrita en la sección 13.3.4. Las preguntas del recepcionista viajan a la API, que las procesa con la lógica de integración de la sección 13.3.3 y responde con texto y datos estructurados; cada respuesta cita la función consultada para que el usuario conozca el origen de la información. La tercera interacción muestra el límite de diseño más importante: ante una solicitud de reservar, el asistente no ejecuta ninguna transacción y orienta al usuario hacia la pantalla de confirmación, de modo que la integridad del núcleo transaccional no depende del modelo de inteligencia artificial.</w:t>
+        <w:t xml:space="preserve">La Figura 14 presenta la pantalla del asistente descrita en la sección 13.3.4. Las preguntas del recepcionista viajan a la API, que las procesa con la lógica de integración de la sección 13.3.3 y responde con texto y datos estructurados; cada respuesta cita la función consultada para que el usuario conozca el origen de la información. La tercera interacción muestra el límite de diseño más importante: ante una solicitud de reservar, el asistente no ejecuta ninguna transacción y orienta al usuario hacia la pantalla de confirmación, de modo que la integridad del núcleo transaccional no depende del modelo de inteligencia artificial.</w:t>
       </w:r>
     </w:p>
     <w:p>
@@ -7092,7 +7528,7 @@
         <w:pStyle w:val="APA"/>
       </w:pPr>
       <w:r>
-        <w:t xml:space="preserve">La Fase III completó esa base con los elementos que hacen verificable el diseño. Los quince requerimientos funcionales reproducen uno a uno los casos de uso, los cinco requerimientos no funcionales fijan criterios comprobables de seguridad, integridad, rendimiento, usabilidad y trazabilidad, y los marcos conceptual y contextual explican los fundamentos transaccionales y el entorno hotelero en que se usará la aplicación. El diseño de datos se completó con el modelo entidad-relación y la arquitectura de la base de datos, que concentra en el motor las reglas de integridad. El marco integrador propone un asistente de consultas en lenguaje natural con Azure OpenAI Service, descrito por sus cinco componentes (modelo de datos, modelo de inteligencia artificial, lógica de integración, interfaz de usuario e infraestructura) y limitado a funciones de lectura, de modo que agiliza la atención sin intervenir en la transacción crítica; el prototipo de pantallas muestra cómo se verán la consulta de disponibilidad, la confirmación de la reserva y el asistente. Las etapas siguientes deberán implementar la base de datos con sus scripts, construir la API con la transacción de confirmación y decidir con pruebas entre el bloqueo pesimista y la concurrencia optimista, conectar la aplicación móvil comenzando por CU-01, CU-03 y CU-04, verificar los criterios de la Tabla 3 mediante pruebas de aceptación y, por último, evaluar la conexión del asistente de inteligencia artificial.</w:t>
+        <w:t xml:space="preserve">La Fase III completó esa base con los elementos que hacen verificable el diseño. Los quince requerimientos funcionales reproducen uno a uno los casos de uso, los cinco requerimientos no funcionales fijan criterios comprobables de seguridad, integridad, rendimiento, usabilidad y trazabilidad, y los marcos conceptual y contextual explican los fundamentos transaccionales y el entorno hotelero en que se usará la aplicación. El diseño de datos se completó con el modelo entidad-relación y la arquitectura de la base de datos, que concentra en el motor las reglas de integridad. El marco integrador propone un asistente de consultas en lenguaje natural con Azure OpenAI Service, descrito por sus cinco componentes (modelo de datos, modelo de inteligencia artificial, lógica de integración, interfaz de usuario e infraestructura) y limitado a funciones de lectura, de modo que agiliza la atención sin intervenir en la transacción crítica; el prototipo funcional muestra la consulta de disponibilidad, la confirmación de la reserva con el desglose de impuestos y el precio neto, el comprobante compartible por WhatsApp, la reserva rápida para huésped frecuente y el asistente. Las etapas siguientes deberán implementar la base de datos con sus scripts, construir la API con la transacción de confirmación y decidir con pruebas entre el bloqueo pesimista y la concurrencia optimista, conectar la aplicación móvil comenzando por CU-01, CU-03 y CU-04, verificar los criterios de la Tabla 3 mediante pruebas de aceptación y, por último, evaluar la conexión del asistente de inteligencia artificial.</w:t>
       </w:r>
     </w:p>
     <w:p>
@@ -7465,6 +7901,24 @@
       </w:r>
       <w:r>
         <w:t xml:space="preserve"> (9.ª ed.). McGraw-Hill.</w:t>
+      </w:r>
+    </w:p>
+    <w:p>
+      <w:pPr>
+        <w:pStyle w:val="APA"/>
+      </w:pPr>
+      <w:r>
+        <w:t xml:space="preserve">Presidencia de la República de Colombia. (1989). Decreto 624 de 1989, por el cual se expide el Estatuto Tributario de los impuestos administrados por la Dirección General de Impuestos Nacionales. </w:t>
+      </w:r>
+      <w:r>
+        <w:rPr>
+          <w:i/>
+          <w:iCs/>
+        </w:rPr>
+        <w:t xml:space="preserve">Diario Oficial</w:t>
+      </w:r>
+      <w:r>
+        <w:t xml:space="preserve">, 38756. Artículo 481, bienes y servicios exentos. https://www.secretariasenado.gov.co/senado/basedoc/estatuto_tributario.html</w:t>
       </w:r>
     </w:p>
     <w:p>

</xml_diff>

<commit_message>
Documento maestro S10-S11-S12: servicio de IA implementado (Tabla 5), recursos de la API (Tabla 6), estado por capas
</commit_message>
<xml_diff>
--- a/docs/FaseII_y_III_Documentacion_Proyecto_Hotel_Reservas.docx
+++ b/docs/FaseII_y_III_Documentacion_Proyecto_Hotel_Reservas.docx
@@ -18,7 +18,7 @@
           <w:b/>
           <w:bCs/>
         </w:rPr>
-        <w:t>FASE II Y FASE III DOCUMENTACIÓN PROYECTO</w:t>
+        <w:t>FASE II Y FASE III DOCUMENTACIÓN PROYECTO S10-S11-S12</w:t>
       </w:r>
     </w:p>
     <w:p>
@@ -147,7 +147,7 @@
         </w:rPr>
         <w:t>BOGOTÁ D.C.</w:t>
         <w:br/>
-        <w:t>11 de octubre de 2026</w:t>
+        <w:t>16 de octubre de 2026</w:t>
       </w:r>
     </w:p>
     <w:p>
@@ -406,7 +406,7 @@
               <w:fldChar w:fldCharType="begin"/>
               <w:instrText xml:space="preserve"> PAGEREF _Toc240726552 \h </w:instrText>
               <w:fldChar w:fldCharType="separate"/>
-              <w:t>19</w:t>
+              <w:t>20</w:t>
               <w:fldChar w:fldCharType="end"/>
             </w:r>
           </w:hyperlink>
@@ -441,7 +441,7 @@
               <w:fldChar w:fldCharType="begin"/>
               <w:instrText xml:space="preserve"> PAGEREF _Toc240726553 \h </w:instrText>
               <w:fldChar w:fldCharType="separate"/>
-              <w:t>23</w:t>
+              <w:t>24</w:t>
               <w:fldChar w:fldCharType="end"/>
             </w:r>
           </w:hyperlink>
@@ -476,7 +476,7 @@
               <w:fldChar w:fldCharType="begin"/>
               <w:instrText xml:space="preserve"> PAGEREF _TocF3S8 \h </w:instrText>
               <w:fldChar w:fldCharType="separate"/>
-              <w:t>30</w:t>
+              <w:t>31</w:t>
               <w:fldChar w:fldCharType="end"/>
             </w:r>
           </w:hyperlink>
@@ -511,7 +511,7 @@
               <w:fldChar w:fldCharType="begin"/>
               <w:instrText xml:space="preserve"> PAGEREF _TocF3RF \h </w:instrText>
               <w:fldChar w:fldCharType="separate"/>
-              <w:t>34</w:t>
+              <w:t>35</w:t>
               <w:fldChar w:fldCharType="end"/>
             </w:r>
           </w:hyperlink>
@@ -546,7 +546,7 @@
               <w:fldChar w:fldCharType="begin"/>
               <w:instrText xml:space="preserve"> PAGEREF _TocF31005 \h </w:instrText>
               <w:fldChar w:fldCharType="separate"/>
-              <w:t>36</w:t>
+              <w:t>37</w:t>
               <w:fldChar w:fldCharType="end"/>
             </w:r>
           </w:hyperlink>
@@ -581,7 +581,7 @@
               <w:fldChar w:fldCharType="begin"/>
               <w:instrText xml:space="preserve"> PAGEREF _TocF31006 \h </w:instrText>
               <w:fldChar w:fldCharType="separate"/>
-              <w:t>38</w:t>
+              <w:t>39</w:t>
               <w:fldChar w:fldCharType="end"/>
             </w:r>
           </w:hyperlink>
@@ -616,7 +616,7 @@
               <w:fldChar w:fldCharType="begin"/>
               <w:instrText xml:space="preserve"> PAGEREF _TocF31011 \h </w:instrText>
               <w:fldChar w:fldCharType="separate"/>
-              <w:t>42</w:t>
+              <w:t>43</w:t>
               <w:fldChar w:fldCharType="end"/>
             </w:r>
           </w:hyperlink>
@@ -651,7 +651,7 @@
               <w:fldChar w:fldCharType="begin"/>
               <w:instrText xml:space="preserve"> PAGEREF _TocF31018 \h </w:instrText>
               <w:fldChar w:fldCharType="separate"/>
-              <w:t>45</w:t>
+              <w:t>46</w:t>
               <w:fldChar w:fldCharType="end"/>
             </w:r>
           </w:hyperlink>
@@ -686,7 +686,7 @@
               <w:fldChar w:fldCharType="begin"/>
               <w:instrText xml:space="preserve"> PAGEREF _TocF31029 \h </w:instrText>
               <w:fldChar w:fldCharType="separate"/>
-              <w:t>52</w:t>
+              <w:t>54</w:t>
               <w:fldChar w:fldCharType="end"/>
             </w:r>
           </w:hyperlink>
@@ -721,7 +721,7 @@
               <w:fldChar w:fldCharType="begin"/>
               <w:instrText xml:space="preserve"> PAGEREF _Toc240726554 \h </w:instrText>
               <w:fldChar w:fldCharType="separate"/>
-              <w:t>63</w:t>
+              <w:t>66</w:t>
               <w:fldChar w:fldCharType="end"/>
             </w:r>
           </w:hyperlink>
@@ -756,7 +756,7 @@
               <w:fldChar w:fldCharType="begin"/>
               <w:instrText xml:space="preserve"> PAGEREF _Toc240726555 \h </w:instrText>
               <w:fldChar w:fldCharType="separate"/>
-              <w:t>65</w:t>
+              <w:t>68</w:t>
               <w:fldChar w:fldCharType="end"/>
             </w:r>
           </w:hyperlink>
@@ -1489,6 +1489,14 @@
     <w:p>
       <w:pPr>
         <w:pStyle w:val="APA"/>
+      </w:pPr>
+      <w:r>
+        <w:t xml:space="preserve">Estado de la implementación en las entregas S10 a S12. Las cuatro capas descritas tienen ya una materialización en el repositorio del proyecto. La capa de presentación es la aplicación .NET MAUI (carpeta HotelReservas, versión 0.3), que incorpora el prototipo funcional de las pantallas transaccionales. Las capas de lógica de negocio y de acceso a datos se implementaron en la API REST HotelReservas.Api, construida con ASP.NET Core 8 y Entity Framework Core: expone los recursos de autenticación (token JWT), disponibilidad, reservas, huéspedes, comprobantes y asistente; la confirmación de reserva ejecuta el procedimiento almacenado con bloqueo y responde con el código 201 cuando la transacción se confirma o 409 cuando otra sesión tomó la habitación, y los cambios de estado aplican concurrencia optimista con la columna ROWVERSION. La capa de almacenamiento son los scripts 01 a 06 de SQL Server. El servicio de inteligencia artificial de la sección 13 se implementó dentro de la API como un componente de la capa de lógica de negocio. La sección 14 relaciona cada recurso de la API con los casos de uso que atiende.</w:t>
+      </w:r>
+    </w:p>
+    <w:p>
+      <w:pPr>
+        <w:pStyle w:val="APA"/>
         <w:jc w:val="center"/>
         <w:outlineLvl w:val="0"/>
         <w:rPr>
@@ -6050,7 +6058,7 @@
         <w:pStyle w:val="APA"/>
       </w:pPr>
       <w:r>
-        <w:t xml:space="preserve">Hotel Reservas es una aplicación móvil Android, distribuida como APK, conectada a una API y a una base de datos central. Su propósito es administrar el ciclo completo de las reservas de un hotel garantizando la integridad y la trazabilidad de la información. La aplicación gestiona cinco grupos de datos: los usuarios del personal con su perfil, los huéspedes, el inventario de habitaciones con sus tipos y tarifas, las reservas con sus pagos y comprobantes, y la bitácora de cambios. Sus funcionalidades principales, enumeradas en la Tabla 2, son la autenticación, el registro de huéspedes, la consulta de disponibilidad, la creación, modificación y cancelación de reservas, el registro de pagos y comprobantes, el check-in y el check-out, la gestión del inventario y de los usuarios, el historial de reservas y el reporte de ocupación. Desde el punto de vista del usuario, el flujo típico consiste en consultar la disponibilidad de un tipo de habitación para unas fechas, seleccionar una habitación, asociar al huésped, revisar el precio neto con su desglose de impuestos, registrar el pago y recibir el comprobante en una sola secuencia de pantallas. Dos funciones distinguen a la aplicación de otras soluciones de reservas: el comprobante se envía al huésped por WhatsApp en un toque, sin transcribir datos, y el huésped frecuente se reconoce por su documento para repetir su última estadía con los filtros y el medio de pago ya cargados. El prototipo de la entrega S7 contiene la pantalla de inicio y la navegación entre módulos; las siguientes entregas la conectarán con la API y la base de datos.</w:t>
+        <w:t xml:space="preserve">Hotel Reservas es una aplicación móvil Android, distribuida como APK, conectada a una API y a una base de datos central. Su propósito es administrar el ciclo completo de las reservas de un hotel garantizando la integridad y la trazabilidad de la información. La aplicación gestiona cinco grupos de datos: los usuarios del personal con su perfil, los huéspedes, el inventario de habitaciones con sus tipos y tarifas, las reservas con sus pagos y comprobantes, y la bitácora de cambios. Sus funcionalidades principales, enumeradas en la Tabla 2, son la autenticación, el registro de huéspedes, la consulta de disponibilidad, la creación, modificación y cancelación de reservas, el registro de pagos y comprobantes, el check-in y el check-out, la gestión del inventario y de los usuarios, el historial de reservas y el reporte de ocupación. Desde el punto de vista del usuario, el flujo típico consiste en consultar la disponibilidad de un tipo de habitación para unas fechas, seleccionar una habitación, asociar al huésped, revisar el precio neto con su desglose de impuestos, registrar el pago y recibir el comprobante en una sola secuencia de pantallas. Dos funciones distinguen a la aplicación de otras soluciones de reservas: el comprobante se envía al huésped por WhatsApp en un toque, sin transcribir datos, y el huésped frecuente se reconoce por su documento para repetir su última estadía con los filtros y el medio de pago ya cargados. El prototipo funcional de la APK (versión 0.3) contiene estas pantallas; la API REST HotelReservas.Api, construida en las entregas S10 a S12, implementa la lógica de negocio y el acceso a datos que las respaldan, y la conexión definitiva de la aplicación móvil a la API es la actividad siguiente.</w:t>
       </w:r>
     </w:p>
     <w:p>
@@ -6076,7 +6084,7 @@
         <w:pStyle w:val="APA"/>
       </w:pPr>
       <w:r>
-        <w:t xml:space="preserve">Durante la etapa académica se desarrollará un sistema para un solo hotel, con un inventario central de habitaciones, dos perfiles de usuario y una habitación por reserva, que cubra el ciclo completo de la reserva y los reportes básicos de ocupación. Los entregables previstos son la base de datos en SQL Server con sus scripts, la API REST con la transacción de confirmación y el control de concurrencia, la aplicación móvil conectada a la API con los casos de uso priorizados, y la demostración de dos usuarios concurrentes sobre la última habitación disponible. Quedan fuera del alcance la integración con pasarelas de pago, con gestores de canales de venta y con plataformas contables, la reserva en línea por parte del huésped y la operación de varios hoteles. El servicio de inteligencia artificial de la sección 13 se documenta y se diseña conceptualmente en esta fase, pero su implementación se considera una ampliación posterior al núcleo transaccional.</w:t>
+        <w:t xml:space="preserve">Durante la etapa académica se desarrollará un sistema para un solo hotel, con un inventario central de habitaciones, dos perfiles de usuario y una habitación por reserva, que cubra el ciclo completo de la reserva y los reportes básicos de ocupación. Los entregables previstos son la base de datos en SQL Server con sus scripts, la API REST con la transacción de confirmación y el control de concurrencia, la aplicación móvil conectada a la API con los casos de uso priorizados, y la demostración de dos usuarios concurrentes sobre la última habitación disponible. Quedan fuera del alcance la integración con pasarelas de pago, con gestores de canales de venta y con plataformas contables, la reserva en línea por parte del huésped y la operación de varios hoteles. El servicio de inteligencia artificial de la sección 13 se diseñó conceptualmente en la Fase III y se implementó en la API REST en las entregas S10 a S12, limitado a funciones de lectura, de modo que no forma parte del núcleo transaccional ni lo modifica.</w:t>
       </w:r>
     </w:p>
     <w:p>
@@ -6112,7 +6120,7 @@
           <w:b/>
           <w:bCs/>
         </w:rPr>
-        <w:t xml:space="preserve">13.1 SERVICIO DE INTELIGENCIA ARTIFICIAL PROPUESTO</w:t>
+        <w:t xml:space="preserve">13.1 SERVICIO DE INTELIGENCIA ARTIFICIAL INCORPORADO</w:t>
       </w:r>
       <w:bookmarkEnd w:id="1019"/>
     </w:p>
@@ -6121,7 +6129,7 @@
         <w:pStyle w:val="APA"/>
       </w:pPr>
       <w:r>
-        <w:t xml:space="preserve">Se propone incorporar un asistente de consultas en lenguaje natural basado en Azure OpenAI Service, el servicio de Microsoft que ofrece acceso, mediante una API, a modelos de lenguaje de gran tamaño como los de la familia GPT-4o (Microsoft, 2024g). La elección se justifica por tres razones: el servicio se integra con la misma plataforma en la que se construyen la API y la base de datos, lo que simplifica la autenticación y el despliegue; dispone de la capacidad de llamada a funciones, que permite al modelo traducir una pregunta en una invocación estructurada a una función definida por el equipo (Microsoft, 2024h); y su política de datos establece que la información enviada no se usa para entrenar los modelos (Microsoft, 2024i), condición necesaria para un sistema que maneja datos de huéspedes.</w:t>
+        <w:t xml:space="preserve">Se incorpora un asistente de consultas en lenguaje natural basado en Azure OpenAI Service, el servicio de Microsoft que ofrece acceso, mediante una API, a modelos de lenguaje de gran tamaño como los de la familia GPT-4o (Microsoft, 2024g). La elección se justifica por tres razones: el servicio se integra con la misma plataforma en la que se construyen la API y la base de datos, lo que simplifica la autenticación y el despliegue; dispone de la capacidad de llamada a funciones, que permite al modelo traducir una pregunta en una invocación estructurada a una función definida por el equipo (Microsoft, 2024h); y su política de datos establece que la información enviada no se usa para entrenar los modelos (Microsoft, 2024i), condición necesaria para un sistema que maneja datos de huéspedes.</w:t>
       </w:r>
     </w:p>
     <w:p>
@@ -6173,7 +6181,7 @@
         <w:pStyle w:val="APA"/>
       </w:pPr>
       <w:r>
-        <w:t xml:space="preserve">La integración del servicio se describe a partir de los cinco componentes que intervienen: el modelo de datos, el modelo de inteligencia artificial, la lógica de integración, la interfaz de usuario y la infraestructura. La Figura 7 los sitúa sobre la arquitectura en capas del prototipo, de modo que puede verse qué elementos ya existen y cuáles se agregan. En síntesis, el servicio se incorpora en la capa de lógica de negocio como un componente adicional de la API, la aplicación móvil solo suma una pantalla de conversación y la base de datos conserva intacto su núcleo transaccional.</w:t>
+        <w:t xml:space="preserve">La integración del servicio se describe a partir de los cinco componentes que intervienen: el modelo de datos, el modelo de inteligencia artificial, la lógica de integración, la interfaz de usuario y la infraestructura. La Figura 7 los sitúa sobre la arquitectura en capas del prototipo, de modo que puede verse qué elementos ya existen y cuáles se agregan. En síntesis, el servicio se incorpora en la capa de lógica de negocio como un componente adicional de la API, la aplicación móvil solo suma una pantalla de conversación y la base de datos conserva intacto su núcleo transaccional. Los cinco componentes fueron implementados en las entregas S10 a S12 en el proyecto HotelReservas.Api del repositorio; al final de la sección 13.3.5, la Tabla 5 indica el archivo que materializa cada uno.</w:t>
       </w:r>
     </w:p>
     <w:p>
@@ -6270,7 +6278,7 @@
         <w:pStyle w:val="APA"/>
       </w:pPr>
       <w:r>
-        <w:t xml:space="preserve">El asistente no modifica las nueve tablas del esquema relacional, pues únicamente las consulta a través de las funciones de lectura. El único cambio en el diseño de datos es una tabla auxiliar, CONSULTA_ASISTENTE, que registra cada consulta realizada: identificador, usuario que la hizo, fecha y hora, texto escrito, función invocada, parámetros interpretados y si la respuesta fue exitosa. Esta tabla cumple dos propósitos: ofrece trazabilidad del uso del servicio, en coherencia con el requerimiento RNF05, y permite medir el resultado esperado de la sección 13.4. Se relaciona con USUARIO mediante una clave foránea y no tiene relación con RESERVA, porque el asistente nunca crea ni altera reservas. Las funciones de lectura devuelven estructuras derivadas de las tablas HABITACION, TIPO_HABITACION, TARIFA y RESERVA, y en ningún caso incluyen columnas de identificación o contacto de HUESPED.</w:t>
+        <w:t xml:space="preserve">El asistente no modifica las nueve tablas del esquema relacional, pues únicamente las consulta a través de las funciones de lectura. El único cambio en el diseño de datos es una tabla auxiliar, CONSULTA_ASISTENTE, que registra cada consulta realizada: identificador, usuario que la hizo, fecha y hora, texto escrito, función invocada, parámetros interpretados y si la respuesta fue exitosa. La tabla se crea con el script 06 del repositorio y registra además el intérprete que atendió la consulta y la duración en milisegundos; una restricción CHECK solo admite los nombres de las cinco funciones del catálogo. Esta tabla cumple dos propósitos: ofrece trazabilidad del uso del servicio, en coherencia con el requerimiento RNF05, y permite medir el resultado esperado de la sección 13.4. Se relaciona con USUARIO mediante una clave foránea y no tiene relación con RESERVA, porque el asistente nunca crea ni altera reservas. Las funciones de lectura devuelven estructuras derivadas de las tablas HABITACION, TIPO_HABITACION, TARIFA y RESERVA, y en ningún caso incluyen columnas de identificación o contacto de HUESPED.</w:t>
       </w:r>
     </w:p>
     <w:p>
@@ -6302,6 +6310,14 @@
     <w:p>
       <w:pPr>
         <w:pStyle w:val="APA"/>
+      </w:pPr>
+      <w:r>
+        <w:t xml:space="preserve">En la implementación, la clase InterpreteAzureOpenAI consume el servicio por su interfaz REST de finalización de chat con temperatura cero, en dos llamadas: la primera entrega la pregunta y la descripción de las funciones y recibe la función elegida con sus parámetros; la segunda entrega el resultado real de la función y recibe la respuesta redactada. El punto de conexión, la clave y el nombre del despliegue se leen de la configuración de la API. Como salvaguarda de disponibilidad, cuando no hay credenciales configuradas o el servicio no responde, la API conmuta de forma automática a un intérprete de reglas (clase InterpreteReglas) que reconoce las mismas consultas mediante expresiones regulares, interpreta las fechas en español (por ejemplo, del 16 al 18 de octubre) y ejecuta el mismo catálogo de funciones; el usuario recibe el mismo tipo de respuesta y la bitácora registra con cuál de los dos intérpretes se atendió cada consulta. Esto permite demostrar el servicio sin conexión a internet y acotar el costo del servicio externo.</w:t>
+      </w:r>
+    </w:p>
+    <w:p>
+      <w:pPr>
+        <w:pStyle w:val="APA"/>
         <w:rPr>
           <w:b/>
           <w:bCs/>
@@ -6322,7 +6338,7 @@
         <w:pStyle w:val="APA"/>
       </w:pPr>
       <w:r>
-        <w:t xml:space="preserve">La lógica de integración reside en la API REST, en el backend del prototipo, y se compone de tres piezas. El controlador /asistente recibe la consulta de la aplicación con el token JWT del usuario y la entrega al orquestador. El orquestador aplica el filtro de datos personales, envía la pregunta al modelo, valida que la función devuelta pertenezca al catálogo de funciones de solo lectura (consultarDisponibilidad, consultarReserva, consultarLlegadas y consultarTarifa), la ejecuta reutilizando los mismos servicios del negocio de los casos de uso CU-03 y CU-12, registra la consulta en CONSULTA_ASISTENTE y devuelve a la aplicación la respuesta redactada junto con los datos estructurados. La Figura 8 muestra la secuencia completa. Tres reglas delimitan esta lógica: el asistente solo accede a funciones de lectura, de manera que nunca crea, modifica ni cancela reservas; la confirmación (CU-04) se realiza siempre desde la pantalla transaccional habitual, con la verificación y el bloqueo descritos en la sección 7.4; y a la API externa se envían únicamente los datos necesarios para la consulta, sin documentos de identidad ni datos de contacto de los huéspedes.</w:t>
+        <w:t xml:space="preserve">La lógica de integración reside en la API REST, en el backend del prototipo, y se compone de tres piezas. El controlador /asistente recibe la consulta de la aplicación con el token JWT del usuario y la entrega al orquestador. El orquestador aplica el filtro de datos personales, envía la pregunta al modelo, valida que la función devuelta pertenezca al catálogo de funciones de solo lectura (consultarDisponibilidad, consultarTarifa, consultarReserva, consultarLlegadas y consultarReservasConfirmadas), la ejecuta reutilizando los mismos servicios del negocio de los casos de uso CU-03 y CU-12, registra la consulta en CONSULTA_ASISTENTE y devuelve a la aplicación la respuesta redactada junto con los datos estructurados. La Figura 8 muestra la secuencia completa. En el código, estas piezas corresponden a las clases AsistenteController, OrquestadorAsistente, FiltroDatosPersonales y CatalogoFunciones; el catálogo se expone también en el recurso /api/asistente/funciones para que pueda auditarse qué funciones recibe el modelo. Tres reglas delimitan esta lógica: el asistente solo accede a funciones de lectura, de manera que nunca crea, modifica ni cancela reservas; la confirmación (CU-04) se realiza siempre desde la pantalla transaccional habitual, con la verificación y el bloqueo descritos en la sección 7.4; y a la API externa se envían únicamente los datos necesarios para la consulta, sin documentos de identidad ni datos de contacto de los huéspedes.</w:t>
       </w:r>
     </w:p>
     <w:p>
@@ -6908,7 +6924,7 @@
         <w:pStyle w:val="APA"/>
       </w:pPr>
       <w:r>
-        <w:t xml:space="preserve">En la aplicación móvil se agrega una pantalla Asistente, accesible desde la barra de pestañas, con un campo de texto, el historial de la conversación y, cuando la respuesta incluye habitaciones, tarjetas con las opciones sugeridas y un botón que conduce a la pantalla de reservas con los datos ya diligenciados. Cada respuesta muestra en letra pequeña la función consultada y la fecha de los datos, para que el recepcionista sepa que la información proviene del repositorio central. La pantalla sigue el patrón MVVM del resto de la aplicación y consume el nuevo recurso de la API por HTTPS. La sección 14 presenta el prototipo de esta pantalla junto con las pantallas transaccionales.</w:t>
+        <w:t xml:space="preserve">En la aplicación móvil se agrega una pantalla Asistente, accesible desde la barra de pestañas, con un campo de texto, el historial de la conversación y, cuando la respuesta incluye habitaciones, tarjetas con las opciones sugeridas y un botón que conduce a la pantalla de reservas con los datos ya diligenciados. Cada respuesta muestra en letra pequeña la función consultada y la fecha de los datos, para que el recepcionista sepa que la información proviene del repositorio central. La pantalla sigue el patrón MVVM del resto de la aplicación y consume el recurso /api/asistente de la API por HTTPS, enviando la consulta en formato JSON y recibiendo la respuesta redactada, la función consultada, los datos estructurados y el intérprete que la atendió. La sección 14 presenta el prototipo de esta pantalla junto con las pantallas transaccionales.</w:t>
       </w:r>
     </w:p>
     <w:p>
@@ -6934,7 +6950,390 @@
         <w:pStyle w:val="APA"/>
       </w:pPr>
       <w:r>
-        <w:t xml:space="preserve">La infraestructura necesaria es mínima respecto de la del prototipo. La API conserva su despliegue habitual y agrega, en su configuración segura, la clave y el punto de conexión del recurso de Azure OpenAI, que nunca se incluyen en la aplicación móvil. El recurso se crea en una región de Azure con disponibilidad del modelo, con límites de consumo mensuales y registro de costos, y la comunicación entre la API y el servicio se realiza por HTTPS. La aplicación móvil no requiere cambios de infraestructura, pues sigue hablando únicamente con la API mediante HTTPS y JWT. La base de datos no necesita recursos adicionales, salvo el espacio de la tabla de consultas.</w:t>
+        <w:t xml:space="preserve">La infraestructura necesaria es mínima respecto de la del prototipo. La API conserva su despliegue habitual y agrega, en su configuración segura, la clave y el punto de conexión del recurso de Azure OpenAI, que nunca se incluyen en la aplicación móvil. El recurso se crea en una región de Azure con disponibilidad del modelo, con límites de consumo mensuales y registro de costos, y la comunicación entre la API y el servicio se realiza por HTTPS. La aplicación móvil no requiere cambios de infraestructura, pues sigue hablando únicamente con la API mediante HTTPS y JWT. La base de datos no necesita recursos adicionales, salvo el espacio de la tabla de consultas. En la implementación, los tres valores (punto de conexión, clave y despliegue) se leen de la sección AzureOpenAI del archivo de configuración de la API o de variables de entorno del servidor, y el archivo publicado en el repositorio los deja vacíos, de modo que el servicio de reglas atiende las consultas hasta que el administrador los configure.</w:t>
+      </w:r>
+    </w:p>
+    <w:p>
+      <w:pPr>
+        <w:pStyle w:val="APA"/>
+        <w:ind w:firstLine="0"/>
+        <w:rPr>
+          <w:b/>
+          <w:bCs/>
+        </w:rPr>
+      </w:pPr>
+      <w:r>
+        <w:rPr>
+          <w:b/>
+          <w:bCs/>
+        </w:rPr>
+        <w:t xml:space="preserve">Tabla 5 Correspondencia entre los componentes del servicio de inteligencia artificial y su implementación</w:t>
+      </w:r>
+    </w:p>
+    <w:tbl>
+      <w:tblPr>
+        <w:tblStyle w:val="Tablaconcuadrcula"/>
+        <w:tblW w:w="9350" w:type="dxa"/>
+        <w:jc w:val="center"/>
+        <w:tblLook w:val="04A0" w:firstRow="1" w:lastRow="0" w:firstColumn="1" w:lastColumn="0" w:noHBand="0" w:noVBand="1"/>
+      </w:tblPr>
+      <w:tblGrid>
+        <w:gridCol w:w="1900"/>
+        <w:gridCol w:w="3500"/>
+        <w:gridCol w:w="3950"/>
+      </w:tblGrid>
+      <w:tr>
+        <w:trPr>
+          <w:tblHeader/>
+        </w:trPr>
+        <w:tc>
+          <w:tcPr>
+            <w:tcW w:w="1900" w:type="dxa"/>
+            <w:shd w:val="clear" w:color="auto" w:fill="EEF3FA"/>
+          </w:tcPr>
+          <w:p>
+            <w:pPr>
+              <w:spacing w:before="40" w:after="40" w:line="240" w:lineRule="auto"/>
+            </w:pPr>
+            <w:r>
+              <w:rPr>
+                <w:b/>
+                <w:bCs/>
+                <w:sz w:val="20"/>
+                <w:szCs w:val="20"/>
+              </w:rPr>
+              <w:t xml:space="preserve">Componente</w:t>
+            </w:r>
+          </w:p>
+        </w:tc>
+        <w:tc>
+          <w:tcPr>
+            <w:tcW w:w="3500" w:type="dxa"/>
+            <w:shd w:val="clear" w:color="auto" w:fill="EEF3FA"/>
+          </w:tcPr>
+          <w:p>
+            <w:pPr>
+              <w:spacing w:before="40" w:after="40" w:line="240" w:lineRule="auto"/>
+            </w:pPr>
+            <w:r>
+              <w:rPr>
+                <w:b/>
+                <w:bCs/>
+                <w:sz w:val="20"/>
+                <w:szCs w:val="20"/>
+              </w:rPr>
+              <w:t xml:space="preserve">Archivos del repositorio</w:t>
+            </w:r>
+          </w:p>
+        </w:tc>
+        <w:tc>
+          <w:tcPr>
+            <w:tcW w:w="3950" w:type="dxa"/>
+            <w:shd w:val="clear" w:color="auto" w:fill="EEF3FA"/>
+          </w:tcPr>
+          <w:p>
+            <w:pPr>
+              <w:spacing w:before="40" w:after="40" w:line="240" w:lineRule="auto"/>
+            </w:pPr>
+            <w:r>
+              <w:rPr>
+                <w:b/>
+                <w:bCs/>
+                <w:sz w:val="20"/>
+                <w:szCs w:val="20"/>
+              </w:rPr>
+              <w:t xml:space="preserve">Qué implementan</w:t>
+            </w:r>
+          </w:p>
+        </w:tc>
+      </w:tr>
+      <w:tr>
+        <w:trPr>
+          <w:cantSplit/>
+        </w:trPr>
+        <w:tc>
+          <w:tcPr>
+            <w:tcW w:w="1900" w:type="dxa"/>
+          </w:tcPr>
+          <w:p>
+            <w:pPr>
+              <w:spacing w:before="40" w:after="40" w:line="240" w:lineRule="auto"/>
+            </w:pPr>
+            <w:r>
+              <w:rPr>
+                <w:sz w:val="20"/>
+                <w:szCs w:val="20"/>
+              </w:rPr>
+              <w:t xml:space="preserve">Modelo de datos</w:t>
+            </w:r>
+          </w:p>
+        </w:tc>
+        <w:tc>
+          <w:tcPr>
+            <w:tcW w:w="3500" w:type="dxa"/>
+          </w:tcPr>
+          <w:p>
+            <w:pPr>
+              <w:spacing w:before="40" w:after="40" w:line="240" w:lineRule="auto"/>
+            </w:pPr>
+            <w:r>
+              <w:rPr>
+                <w:sz w:val="20"/>
+                <w:szCs w:val="20"/>
+              </w:rPr>
+              <w:t xml:space="preserve">database/06_consulta_asistente.sql; Data/Entidades.cs y Data/HotelReservasContext.cs</w:t>
+            </w:r>
+          </w:p>
+        </w:tc>
+        <w:tc>
+          <w:tcPr>
+            <w:tcW w:w="3950" w:type="dxa"/>
+          </w:tcPr>
+          <w:p>
+            <w:pPr>
+              <w:spacing w:before="40" w:after="40" w:line="240" w:lineRule="auto"/>
+            </w:pPr>
+            <w:r>
+              <w:rPr>
+                <w:sz w:val="20"/>
+                <w:szCs w:val="20"/>
+              </w:rPr>
+              <w:t xml:space="preserve">Tabla CONSULTA_ASISTENTE y su mapeo en Entity Framework Core; el asistente solo lee las demás tablas.</w:t>
+            </w:r>
+          </w:p>
+        </w:tc>
+      </w:tr>
+      <w:tr>
+        <w:trPr>
+          <w:cantSplit/>
+        </w:trPr>
+        <w:tc>
+          <w:tcPr>
+            <w:tcW w:w="1900" w:type="dxa"/>
+          </w:tcPr>
+          <w:p>
+            <w:pPr>
+              <w:spacing w:before="40" w:after="40" w:line="240" w:lineRule="auto"/>
+            </w:pPr>
+            <w:r>
+              <w:rPr>
+                <w:sz w:val="20"/>
+                <w:szCs w:val="20"/>
+              </w:rPr>
+              <w:t xml:space="preserve">Modelo de inteligencia artificial</w:t>
+            </w:r>
+          </w:p>
+        </w:tc>
+        <w:tc>
+          <w:tcPr>
+            <w:tcW w:w="3500" w:type="dxa"/>
+          </w:tcPr>
+          <w:p>
+            <w:pPr>
+              <w:spacing w:before="40" w:after="40" w:line="240" w:lineRule="auto"/>
+            </w:pPr>
+            <w:r>
+              <w:rPr>
+                <w:sz w:val="20"/>
+                <w:szCs w:val="20"/>
+              </w:rPr>
+              <w:t xml:space="preserve">Asistente/InterpreteAzureOpenAI.cs; Asistente/InterpreteReglas.cs</w:t>
+            </w:r>
+          </w:p>
+        </w:tc>
+        <w:tc>
+          <w:tcPr>
+            <w:tcW w:w="3950" w:type="dxa"/>
+          </w:tcPr>
+          <w:p>
+            <w:pPr>
+              <w:spacing w:before="40" w:after="40" w:line="240" w:lineRule="auto"/>
+            </w:pPr>
+            <w:r>
+              <w:rPr>
+                <w:sz w:val="20"/>
+                <w:szCs w:val="20"/>
+              </w:rPr>
+              <w:t xml:space="preserve">GPT-4o por Azure OpenAI Service con llamada a funciones y mensaje de sistema fijo; intérprete de reglas de respaldo.</w:t>
+            </w:r>
+          </w:p>
+        </w:tc>
+      </w:tr>
+      <w:tr>
+        <w:trPr>
+          <w:cantSplit/>
+        </w:trPr>
+        <w:tc>
+          <w:tcPr>
+            <w:tcW w:w="1900" w:type="dxa"/>
+          </w:tcPr>
+          <w:p>
+            <w:pPr>
+              <w:spacing w:before="40" w:after="40" w:line="240" w:lineRule="auto"/>
+            </w:pPr>
+            <w:r>
+              <w:rPr>
+                <w:sz w:val="20"/>
+                <w:szCs w:val="20"/>
+              </w:rPr>
+              <w:t xml:space="preserve">Lógica de integración</w:t>
+            </w:r>
+          </w:p>
+        </w:tc>
+        <w:tc>
+          <w:tcPr>
+            <w:tcW w:w="3500" w:type="dxa"/>
+          </w:tcPr>
+          <w:p>
+            <w:pPr>
+              <w:spacing w:before="40" w:after="40" w:line="240" w:lineRule="auto"/>
+            </w:pPr>
+            <w:r>
+              <w:rPr>
+                <w:sz w:val="20"/>
+                <w:szCs w:val="20"/>
+              </w:rPr>
+              <w:t xml:space="preserve">Controllers/AsistenteController.cs; Asistente/OrquestadorAsistente.cs; Asistente/CatalogoFunciones.cs</w:t>
+            </w:r>
+          </w:p>
+        </w:tc>
+        <w:tc>
+          <w:tcPr>
+            <w:tcW w:w="3950" w:type="dxa"/>
+          </w:tcPr>
+          <w:p>
+            <w:pPr>
+              <w:spacing w:before="40" w:after="40" w:line="240" w:lineRule="auto"/>
+            </w:pPr>
+            <w:r>
+              <w:rPr>
+                <w:sz w:val="20"/>
+                <w:szCs w:val="20"/>
+              </w:rPr>
+              <w:t xml:space="preserve">Recurso /api/asistente con JWT, filtro de datos personales, validación contra el catálogo, ejecución y registro.</w:t>
+            </w:r>
+          </w:p>
+        </w:tc>
+      </w:tr>
+      <w:tr>
+        <w:trPr>
+          <w:cantSplit/>
+        </w:trPr>
+        <w:tc>
+          <w:tcPr>
+            <w:tcW w:w="1900" w:type="dxa"/>
+          </w:tcPr>
+          <w:p>
+            <w:pPr>
+              <w:spacing w:before="40" w:after="40" w:line="240" w:lineRule="auto"/>
+            </w:pPr>
+            <w:r>
+              <w:rPr>
+                <w:sz w:val="20"/>
+                <w:szCs w:val="20"/>
+              </w:rPr>
+              <w:t xml:space="preserve">Interfaz de usuario</w:t>
+            </w:r>
+          </w:p>
+        </w:tc>
+        <w:tc>
+          <w:tcPr>
+            <w:tcW w:w="3500" w:type="dxa"/>
+          </w:tcPr>
+          <w:p>
+            <w:pPr>
+              <w:spacing w:before="40" w:after="40" w:line="240" w:lineRule="auto"/>
+            </w:pPr>
+            <w:r>
+              <w:rPr>
+                <w:sz w:val="20"/>
+                <w:szCs w:val="20"/>
+              </w:rPr>
+              <w:t xml:space="preserve">HotelReservas/Resources/Raw/prototipo.html (pantalla Asistente)</w:t>
+            </w:r>
+          </w:p>
+        </w:tc>
+        <w:tc>
+          <w:tcPr>
+            <w:tcW w:w="3950" w:type="dxa"/>
+          </w:tcPr>
+          <w:p>
+            <w:pPr>
+              <w:spacing w:before="40" w:after="40" w:line="240" w:lineRule="auto"/>
+            </w:pPr>
+            <w:r>
+              <w:rPr>
+                <w:sz w:val="20"/>
+                <w:szCs w:val="20"/>
+              </w:rPr>
+              <w:t xml:space="preserve">Conversación, chips de consultas frecuentes y cita de la función consultada; conexión a la API pendiente.</w:t>
+            </w:r>
+          </w:p>
+        </w:tc>
+      </w:tr>
+      <w:tr>
+        <w:trPr>
+          <w:cantSplit/>
+        </w:trPr>
+        <w:tc>
+          <w:tcPr>
+            <w:tcW w:w="1900" w:type="dxa"/>
+          </w:tcPr>
+          <w:p>
+            <w:pPr>
+              <w:spacing w:before="40" w:after="40" w:line="240" w:lineRule="auto"/>
+            </w:pPr>
+            <w:r>
+              <w:rPr>
+                <w:sz w:val="20"/>
+                <w:szCs w:val="20"/>
+              </w:rPr>
+              <w:t xml:space="preserve">Infraestructura</w:t>
+            </w:r>
+          </w:p>
+        </w:tc>
+        <w:tc>
+          <w:tcPr>
+            <w:tcW w:w="3500" w:type="dxa"/>
+          </w:tcPr>
+          <w:p>
+            <w:pPr>
+              <w:spacing w:before="40" w:after="40" w:line="240" w:lineRule="auto"/>
+            </w:pPr>
+            <w:r>
+              <w:rPr>
+                <w:sz w:val="20"/>
+                <w:szCs w:val="20"/>
+              </w:rPr>
+              <w:t xml:space="preserve">HotelReservas.Api/appsettings.json (sección AzureOpenAI); Program.cs</w:t>
+            </w:r>
+          </w:p>
+        </w:tc>
+        <w:tc>
+          <w:tcPr>
+            <w:tcW w:w="3950" w:type="dxa"/>
+          </w:tcPr>
+          <w:p>
+            <w:pPr>
+              <w:spacing w:before="40" w:after="40" w:line="240" w:lineRule="auto"/>
+            </w:pPr>
+            <w:r>
+              <w:rPr>
+                <w:sz w:val="20"/>
+                <w:szCs w:val="20"/>
+              </w:rPr>
+              <w:t xml:space="preserve">Credenciales en la configuración de la API, HTTPS, tiempo máximo de espera y conmutación automática al respaldo.</w:t>
+            </w:r>
+          </w:p>
+        </w:tc>
+      </w:tr>
+    </w:tbl>
+    <w:p>
+      <w:pPr>
+        <w:pStyle w:val="APA"/>
+      </w:pPr>
+      <w:r>
+        <w:t xml:space="preserve">Nota. Elaboración propia. Rutas relativas a la carpeta HotelReservas.Api del repositorio, salvo donde se indica otra carpeta.</w:t>
       </w:r>
     </w:p>
     <w:p>
@@ -6986,7 +7385,7 @@
         <w:pStyle w:val="APA"/>
       </w:pPr>
       <w:r>
-        <w:t xml:space="preserve">La propuesta reconoce tres riesgos y la manera de mitigarlos. El primero es que el modelo produzca respuestas no fundamentadas; se mitiga al obligarlo a responder únicamente a partir del resultado de las funciones, sin acceso directo a la base de datos. El segundo es la protección de los datos personales de los huéspedes, atendida con la regla de enviar solo la información indispensable y con la política de no entrenamiento del servicio (Microsoft, 2024i), en coherencia con la Ley 1581 de 2012. El tercero es el costo por consumo del servicio, que se controla limitando el uso al personal autenticado y registrando cada consulta en la bitácora del sistema. Conforme a la guía de esta actividad, en la presente fase el servicio se documenta y se diseña conceptualmente; su conexión efectiva con la API se evaluará una vez construido el núcleo transaccional.</w:t>
+        <w:t xml:space="preserve">La propuesta reconoce tres riesgos y la manera de mitigarlos. El primero es que el modelo produzca respuestas no fundamentadas; se mitiga al obligarlo a responder únicamente a partir del resultado de las funciones, sin acceso directo a la base de datos. El segundo es la protección de los datos personales de los huéspedes, atendida con la regla de enviar solo la información indispensable y con la política de no entrenamiento del servicio (Microsoft, 2024i), en coherencia con la Ley 1581 de 2012. El tercero es el costo por consumo del servicio, que se controla limitando el uso al personal autenticado y registrando cada consulta en la bitácora del sistema. En las entregas S10 a S12 el servicio quedó implementado en la API con las tres salvaguardas descritas y con el intérprete de reglas como respaldo; las actividades siguientes son conectar la pantalla móvil al recurso, configurar el recurso de Azure OpenAI y medir con usuarios los indicadores de la sección 13.4.</w:t>
       </w:r>
     </w:p>
     <w:p>
@@ -7013,7 +7412,558 @@
         <w:pStyle w:val="APA"/>
       </w:pPr>
       <w:r>
-        <w:t xml:space="preserve">Esta sección presenta el prototipo de la aplicación móvil y lo relaciona con la arquitectura, el backend y el diseño de datos descritos en las secciones anteriores. El prototipo tiene dos componentes: la pantalla de inicio, construida en .NET MAUI y publicada en el repositorio del proyecto en la entrega S7, y el prototipo funcional de las pantallas transaccionales y del asistente, integrado en la APK (versión 0.3) y disponible también como página interactiva en el repositorio, que simula la API y la base de datos con los datos del script 03 y permite ejecutar la transacción de confirmación, la prueba de concurrencia, el cálculo de impuestos, el comprobante compartible y la reserva rápida. Todas las pantallas comparten la paleta institucional, la barra de pestañas con cinco destinos y la regla de que la aplicación solo muestra datos obtenidos de la API.</w:t>
+        <w:t xml:space="preserve">Esta sección presenta el prototipo de la aplicación móvil y lo relaciona con la arquitectura, el backend y el diseño de datos descritos en las secciones anteriores. El prototipo tiene dos componentes: la pantalla de inicio, construida en .NET MAUI y publicada en el repositorio del proyecto en la entrega S7, y el prototipo funcional de las pantallas transaccionales y del asistente, integrado en la APK (versión 0.3) y disponible también como página interactiva en el repositorio, que simula la API y la base de datos con los datos del script 03 y permite ejecutar la transacción de confirmación, la prueba de concurrencia, el cálculo de impuestos, el comprobante compartible y la reserva rápida. Todas las pantallas comparten la paleta institucional, la barra de pestañas con cinco destinos y la regla de que la aplicación solo muestra datos obtenidos de la API. Dicha API, HotelReservas.Api, forma parte del prototipo desde las entregas S10 a S12: la Tabla 6 relaciona sus recursos con los casos de uso y requerimientos que atienden, de modo que cada pantalla descrita a continuación tiene un recurso del servidor que la respalda.</w:t>
+      </w:r>
+    </w:p>
+    <w:p>
+      <w:pPr>
+        <w:pStyle w:val="APA"/>
+        <w:ind w:firstLine="0"/>
+        <w:rPr>
+          <w:b/>
+          <w:bCs/>
+        </w:rPr>
+      </w:pPr>
+      <w:r>
+        <w:rPr>
+          <w:b/>
+          <w:bCs/>
+        </w:rPr>
+        <w:t xml:space="preserve">Tabla 6 Recursos de la API REST HotelReservas.Api y casos de uso que atienden</w:t>
+      </w:r>
+    </w:p>
+    <w:tbl>
+      <w:tblPr>
+        <w:tblStyle w:val="Tablaconcuadrcula"/>
+        <w:tblW w:w="9350" w:type="dxa"/>
+        <w:jc w:val="center"/>
+        <w:tblLook w:val="04A0" w:firstRow="1" w:lastRow="0" w:firstColumn="1" w:lastColumn="0" w:noHBand="0" w:noVBand="1"/>
+      </w:tblPr>
+      <w:tblGrid>
+        <w:gridCol w:w="2900"/>
+        <w:gridCol w:w="2250"/>
+        <w:gridCol w:w="4200"/>
+      </w:tblGrid>
+      <w:tr>
+        <w:trPr>
+          <w:tblHeader/>
+        </w:trPr>
+        <w:tc>
+          <w:tcPr>
+            <w:tcW w:w="2900" w:type="dxa"/>
+            <w:shd w:val="clear" w:color="auto" w:fill="EEF3FA"/>
+          </w:tcPr>
+          <w:p>
+            <w:pPr>
+              <w:spacing w:before="40" w:after="40" w:line="240" w:lineRule="auto"/>
+            </w:pPr>
+            <w:r>
+              <w:rPr>
+                <w:b/>
+                <w:bCs/>
+                <w:sz w:val="20"/>
+                <w:szCs w:val="20"/>
+              </w:rPr>
+              <w:t xml:space="preserve">Recurso</w:t>
+            </w:r>
+          </w:p>
+        </w:tc>
+        <w:tc>
+          <w:tcPr>
+            <w:tcW w:w="2250" w:type="dxa"/>
+            <w:shd w:val="clear" w:color="auto" w:fill="EEF3FA"/>
+          </w:tcPr>
+          <w:p>
+            <w:pPr>
+              <w:spacing w:before="40" w:after="40" w:line="240" w:lineRule="auto"/>
+            </w:pPr>
+            <w:r>
+              <w:rPr>
+                <w:b/>
+                <w:bCs/>
+                <w:sz w:val="20"/>
+                <w:szCs w:val="20"/>
+              </w:rPr>
+              <w:t xml:space="preserve">Casos de uso y requerimientos</w:t>
+            </w:r>
+          </w:p>
+        </w:tc>
+        <w:tc>
+          <w:tcPr>
+            <w:tcW w:w="4200" w:type="dxa"/>
+            <w:shd w:val="clear" w:color="auto" w:fill="EEF3FA"/>
+          </w:tcPr>
+          <w:p>
+            <w:pPr>
+              <w:spacing w:before="40" w:after="40" w:line="240" w:lineRule="auto"/>
+            </w:pPr>
+            <w:r>
+              <w:rPr>
+                <w:b/>
+                <w:bCs/>
+                <w:sz w:val="20"/>
+                <w:szCs w:val="20"/>
+              </w:rPr>
+              <w:t xml:space="preserve">Función</w:t>
+            </w:r>
+          </w:p>
+        </w:tc>
+      </w:tr>
+      <w:tr>
+        <w:trPr>
+          <w:cantSplit/>
+        </w:trPr>
+        <w:tc>
+          <w:tcPr>
+            <w:tcW w:w="2900" w:type="dxa"/>
+          </w:tcPr>
+          <w:p>
+            <w:pPr>
+              <w:spacing w:before="40" w:after="40" w:line="240" w:lineRule="auto"/>
+            </w:pPr>
+            <w:r>
+              <w:rPr>
+                <w:sz w:val="20"/>
+                <w:szCs w:val="20"/>
+              </w:rPr>
+              <w:t xml:space="preserve">POST /api/auth/login</w:t>
+            </w:r>
+          </w:p>
+        </w:tc>
+        <w:tc>
+          <w:tcPr>
+            <w:tcW w:w="2250" w:type="dxa"/>
+          </w:tcPr>
+          <w:p>
+            <w:pPr>
+              <w:spacing w:before="40" w:after="40" w:line="240" w:lineRule="auto"/>
+            </w:pPr>
+            <w:r>
+              <w:rPr>
+                <w:sz w:val="20"/>
+                <w:szCs w:val="20"/>
+              </w:rPr>
+              <w:t xml:space="preserve">CU-01, RF01, RNF01</w:t>
+            </w:r>
+          </w:p>
+        </w:tc>
+        <w:tc>
+          <w:tcPr>
+            <w:tcW w:w="4200" w:type="dxa"/>
+          </w:tcPr>
+          <w:p>
+            <w:pPr>
+              <w:spacing w:before="40" w:after="40" w:line="240" w:lineRule="auto"/>
+            </w:pPr>
+            <w:r>
+              <w:rPr>
+                <w:sz w:val="20"/>
+                <w:szCs w:val="20"/>
+              </w:rPr>
+              <w:t xml:space="preserve">Valida correo y contraseña (hash PBKDF2) y emite el token JWT con el perfil.</w:t>
+            </w:r>
+          </w:p>
+        </w:tc>
+      </w:tr>
+      <w:tr>
+        <w:trPr>
+          <w:cantSplit/>
+        </w:trPr>
+        <w:tc>
+          <w:tcPr>
+            <w:tcW w:w="2900" w:type="dxa"/>
+          </w:tcPr>
+          <w:p>
+            <w:pPr>
+              <w:spacing w:before="40" w:after="40" w:line="240" w:lineRule="auto"/>
+            </w:pPr>
+            <w:r>
+              <w:rPr>
+                <w:sz w:val="20"/>
+                <w:szCs w:val="20"/>
+              </w:rPr>
+              <w:t xml:space="preserve">GET /api/disponibilidad</w:t>
+            </w:r>
+          </w:p>
+        </w:tc>
+        <w:tc>
+          <w:tcPr>
+            <w:tcW w:w="2250" w:type="dxa"/>
+          </w:tcPr>
+          <w:p>
+            <w:pPr>
+              <w:spacing w:before="40" w:after="40" w:line="240" w:lineRule="auto"/>
+            </w:pPr>
+            <w:r>
+              <w:rPr>
+                <w:sz w:val="20"/>
+                <w:szCs w:val="20"/>
+              </w:rPr>
+              <w:t xml:space="preserve">CU-03, RF03, RF16</w:t>
+            </w:r>
+          </w:p>
+        </w:tc>
+        <w:tc>
+          <w:tcPr>
+            <w:tcW w:w="4200" w:type="dxa"/>
+          </w:tcPr>
+          <w:p>
+            <w:pPr>
+              <w:spacing w:before="40" w:after="40" w:line="240" w:lineRule="auto"/>
+            </w:pPr>
+            <w:r>
+              <w:rPr>
+                <w:sz w:val="20"/>
+                <w:szCs w:val="20"/>
+              </w:rPr>
+              <w:t xml:space="preserve">Habitaciones libres, reservadas y en mantenimiento para un tipo y un intervalo, con subtotal, IVA y precio neto.</w:t>
+            </w:r>
+          </w:p>
+        </w:tc>
+      </w:tr>
+      <w:tr>
+        <w:trPr>
+          <w:cantSplit/>
+        </w:trPr>
+        <w:tc>
+          <w:tcPr>
+            <w:tcW w:w="2900" w:type="dxa"/>
+          </w:tcPr>
+          <w:p>
+            <w:pPr>
+              <w:spacing w:before="40" w:after="40" w:line="240" w:lineRule="auto"/>
+            </w:pPr>
+            <w:r>
+              <w:rPr>
+                <w:sz w:val="20"/>
+                <w:szCs w:val="20"/>
+              </w:rPr>
+              <w:t xml:space="preserve">POST /api/reservas</w:t>
+            </w:r>
+          </w:p>
+        </w:tc>
+        <w:tc>
+          <w:tcPr>
+            <w:tcW w:w="2250" w:type="dxa"/>
+          </w:tcPr>
+          <w:p>
+            <w:pPr>
+              <w:spacing w:before="40" w:after="40" w:line="240" w:lineRule="auto"/>
+            </w:pPr>
+            <w:r>
+              <w:rPr>
+                <w:sz w:val="20"/>
+                <w:szCs w:val="20"/>
+              </w:rPr>
+              <w:t xml:space="preserve">CU-04, CU-05, CU-06, RF04, RF05, RF06, RF16, RNF02</w:t>
+            </w:r>
+          </w:p>
+        </w:tc>
+        <w:tc>
+          <w:tcPr>
+            <w:tcW w:w="4200" w:type="dxa"/>
+          </w:tcPr>
+          <w:p>
+            <w:pPr>
+              <w:spacing w:before="40" w:after="40" w:line="240" w:lineRule="auto"/>
+            </w:pPr>
+            <w:r>
+              <w:rPr>
+                <w:sz w:val="20"/>
+                <w:szCs w:val="20"/>
+              </w:rPr>
+              <w:t xml:space="preserve">Ejecuta sp_ConfirmarReserva; responde 201 con código y comprobante o 409 si la habitación ya no está disponible.</w:t>
+            </w:r>
+          </w:p>
+        </w:tc>
+      </w:tr>
+      <w:tr>
+        <w:trPr>
+          <w:cantSplit/>
+        </w:trPr>
+        <w:tc>
+          <w:tcPr>
+            <w:tcW w:w="2900" w:type="dxa"/>
+          </w:tcPr>
+          <w:p>
+            <w:pPr>
+              <w:spacing w:before="40" w:after="40" w:line="240" w:lineRule="auto"/>
+            </w:pPr>
+            <w:r>
+              <w:rPr>
+                <w:sz w:val="20"/>
+                <w:szCs w:val="20"/>
+              </w:rPr>
+              <w:t xml:space="preserve">GET /api/reservas, GET /api/reservas/{codigo}</w:t>
+            </w:r>
+          </w:p>
+        </w:tc>
+        <w:tc>
+          <w:tcPr>
+            <w:tcW w:w="2250" w:type="dxa"/>
+          </w:tcPr>
+          <w:p>
+            <w:pPr>
+              <w:spacing w:before="40" w:after="40" w:line="240" w:lineRule="auto"/>
+            </w:pPr>
+            <w:r>
+              <w:rPr>
+                <w:sz w:val="20"/>
+                <w:szCs w:val="20"/>
+              </w:rPr>
+              <w:t xml:space="preserve">CU-12, RF12, RNF05</w:t>
+            </w:r>
+          </w:p>
+        </w:tc>
+        <w:tc>
+          <w:tcPr>
+            <w:tcW w:w="4200" w:type="dxa"/>
+          </w:tcPr>
+          <w:p>
+            <w:pPr>
+              <w:spacing w:before="40" w:after="40" w:line="240" w:lineRule="auto"/>
+            </w:pPr>
+            <w:r>
+              <w:rPr>
+                <w:sz w:val="20"/>
+                <w:szCs w:val="20"/>
+              </w:rPr>
+              <w:t xml:space="preserve">Historial y detalle con pagos, comprobante y bitácora.</w:t>
+            </w:r>
+          </w:p>
+        </w:tc>
+      </w:tr>
+      <w:tr>
+        <w:trPr>
+          <w:cantSplit/>
+        </w:trPr>
+        <w:tc>
+          <w:tcPr>
+            <w:tcW w:w="2900" w:type="dxa"/>
+          </w:tcPr>
+          <w:p>
+            <w:pPr>
+              <w:spacing w:before="40" w:after="40" w:line="240" w:lineRule="auto"/>
+            </w:pPr>
+            <w:r>
+              <w:rPr>
+                <w:sz w:val="20"/>
+                <w:szCs w:val="20"/>
+              </w:rPr>
+              <w:t xml:space="preserve">PUT /api/reservas/{codigo}/checkin, /checkout, /cancelar</w:t>
+            </w:r>
+          </w:p>
+        </w:tc>
+        <w:tc>
+          <w:tcPr>
+            <w:tcW w:w="2250" w:type="dxa"/>
+          </w:tcPr>
+          <w:p>
+            <w:pPr>
+              <w:spacing w:before="40" w:after="40" w:line="240" w:lineRule="auto"/>
+            </w:pPr>
+            <w:r>
+              <w:rPr>
+                <w:sz w:val="20"/>
+                <w:szCs w:val="20"/>
+              </w:rPr>
+              <w:t xml:space="preserve">CU-08, CU-09, CU-10, RF08 a RF10</w:t>
+            </w:r>
+          </w:p>
+        </w:tc>
+        <w:tc>
+          <w:tcPr>
+            <w:tcW w:w="4200" w:type="dxa"/>
+          </w:tcPr>
+          <w:p>
+            <w:pPr>
+              <w:spacing w:before="40" w:after="40" w:line="240" w:lineRule="auto"/>
+            </w:pPr>
+            <w:r>
+              <w:rPr>
+                <w:sz w:val="20"/>
+                <w:szCs w:val="20"/>
+              </w:rPr>
+              <w:t xml:space="preserve">Cambios de estado con concurrencia optimista (ROWVERSION); 409 si otra sesión modificó la reserva.</w:t>
+            </w:r>
+          </w:p>
+        </w:tc>
+      </w:tr>
+      <w:tr>
+        <w:trPr>
+          <w:cantSplit/>
+        </w:trPr>
+        <w:tc>
+          <w:tcPr>
+            <w:tcW w:w="2900" w:type="dxa"/>
+          </w:tcPr>
+          <w:p>
+            <w:pPr>
+              <w:spacing w:before="40" w:after="40" w:line="240" w:lineRule="auto"/>
+            </w:pPr>
+            <w:r>
+              <w:rPr>
+                <w:sz w:val="20"/>
+                <w:szCs w:val="20"/>
+              </w:rPr>
+              <w:t xml:space="preserve">GET y POST /api/huespedes</w:t>
+            </w:r>
+          </w:p>
+        </w:tc>
+        <w:tc>
+          <w:tcPr>
+            <w:tcW w:w="2250" w:type="dxa"/>
+          </w:tcPr>
+          <w:p>
+            <w:pPr>
+              <w:spacing w:before="40" w:after="40" w:line="240" w:lineRule="auto"/>
+            </w:pPr>
+            <w:r>
+              <w:rPr>
+                <w:sz w:val="20"/>
+                <w:szCs w:val="20"/>
+              </w:rPr>
+              <w:t xml:space="preserve">CU-02, RF02, RF18</w:t>
+            </w:r>
+          </w:p>
+        </w:tc>
+        <w:tc>
+          <w:tcPr>
+            <w:tcW w:w="4200" w:type="dxa"/>
+          </w:tcPr>
+          <w:p>
+            <w:pPr>
+              <w:spacing w:before="40" w:after="40" w:line="240" w:lineRule="auto"/>
+            </w:pPr>
+            <w:r>
+              <w:rPr>
+                <w:sz w:val="20"/>
+                <w:szCs w:val="20"/>
+              </w:rPr>
+              <w:t xml:space="preserve">Registro de huéspedes y perfil del huésped frecuente con las preferencias de su última estadía.</w:t>
+            </w:r>
+          </w:p>
+        </w:tc>
+      </w:tr>
+      <w:tr>
+        <w:trPr>
+          <w:cantSplit/>
+        </w:trPr>
+        <w:tc>
+          <w:tcPr>
+            <w:tcW w:w="2900" w:type="dxa"/>
+          </w:tcPr>
+          <w:p>
+            <w:pPr>
+              <w:spacing w:before="40" w:after="40" w:line="240" w:lineRule="auto"/>
+            </w:pPr>
+            <w:r>
+              <w:rPr>
+                <w:sz w:val="20"/>
+                <w:szCs w:val="20"/>
+              </w:rPr>
+              <w:t xml:space="preserve">GET /api/comprobantes/{numero}/compartir</w:t>
+            </w:r>
+          </w:p>
+        </w:tc>
+        <w:tc>
+          <w:tcPr>
+            <w:tcW w:w="2250" w:type="dxa"/>
+          </w:tcPr>
+          <w:p>
+            <w:pPr>
+              <w:spacing w:before="40" w:after="40" w:line="240" w:lineRule="auto"/>
+            </w:pPr>
+            <w:r>
+              <w:rPr>
+                <w:sz w:val="20"/>
+                <w:szCs w:val="20"/>
+              </w:rPr>
+              <w:t xml:space="preserve">CU-06, RF17</w:t>
+            </w:r>
+          </w:p>
+        </w:tc>
+        <w:tc>
+          <w:tcPr>
+            <w:tcW w:w="4200" w:type="dxa"/>
+          </w:tcPr>
+          <w:p>
+            <w:pPr>
+              <w:spacing w:before="40" w:after="40" w:line="240" w:lineRule="auto"/>
+            </w:pPr>
+            <w:r>
+              <w:rPr>
+                <w:sz w:val="20"/>
+                <w:szCs w:val="20"/>
+              </w:rPr>
+              <w:t xml:space="preserve">Texto del comprobante y enlace de WhatsApp al teléfono del huésped.</w:t>
+            </w:r>
+          </w:p>
+        </w:tc>
+      </w:tr>
+      <w:tr>
+        <w:trPr>
+          <w:cantSplit/>
+        </w:trPr>
+        <w:tc>
+          <w:tcPr>
+            <w:tcW w:w="2900" w:type="dxa"/>
+          </w:tcPr>
+          <w:p>
+            <w:pPr>
+              <w:spacing w:before="40" w:after="40" w:line="240" w:lineRule="auto"/>
+            </w:pPr>
+            <w:r>
+              <w:rPr>
+                <w:sz w:val="20"/>
+                <w:szCs w:val="20"/>
+              </w:rPr>
+              <w:t xml:space="preserve">POST /api/asistente</w:t>
+            </w:r>
+          </w:p>
+        </w:tc>
+        <w:tc>
+          <w:tcPr>
+            <w:tcW w:w="2250" w:type="dxa"/>
+          </w:tcPr>
+          <w:p>
+            <w:pPr>
+              <w:spacing w:before="40" w:after="40" w:line="240" w:lineRule="auto"/>
+            </w:pPr>
+            <w:r>
+              <w:rPr>
+                <w:sz w:val="20"/>
+                <w:szCs w:val="20"/>
+              </w:rPr>
+              <w:t xml:space="preserve">Sección 13</w:t>
+            </w:r>
+          </w:p>
+        </w:tc>
+        <w:tc>
+          <w:tcPr>
+            <w:tcW w:w="4200" w:type="dxa"/>
+          </w:tcPr>
+          <w:p>
+            <w:pPr>
+              <w:spacing w:before="40" w:after="40" w:line="240" w:lineRule="auto"/>
+            </w:pPr>
+            <w:r>
+              <w:rPr>
+                <w:sz w:val="20"/>
+                <w:szCs w:val="20"/>
+              </w:rPr>
+              <w:t xml:space="preserve">Consulta en lenguaje natural atendida por el servicio de inteligencia artificial (solo lectura).</w:t>
+            </w:r>
+          </w:p>
+        </w:tc>
+      </w:tr>
+    </w:tbl>
+    <w:p>
+      <w:pPr>
+        <w:pStyle w:val="APA"/>
+      </w:pPr>
+      <w:r>
+        <w:t xml:space="preserve">Nota. Elaboración propia. Todos los recursos, salvo el inicio de sesión, exigen el token JWT; la documentación interactiva (Swagger) y el archivo de pruebas HotelReservas.Api.http acompañan al proyecto en el repositorio.</w:t>
       </w:r>
     </w:p>
     <w:p>
@@ -7487,7 +8437,7 @@
         <w:pStyle w:val="APA"/>
       </w:pPr>
       <w:r>
-        <w:t xml:space="preserve">La Figura 14 presenta la pantalla del asistente descrita en la sección 13.3.4. Las preguntas del recepcionista viajan a la API, que las procesa con la lógica de integración de la sección 13.3.3 y responde con texto y datos estructurados; cada respuesta cita la función consultada para que el usuario conozca el origen de la información. La tercera interacción muestra el límite de diseño más importante: ante una solicitud de reservar, el asistente no ejecuta ninguna transacción y orienta al usuario hacia la pantalla de confirmación, de modo que la integridad del núcleo transaccional no depende del modelo de inteligencia artificial.</w:t>
+        <w:t xml:space="preserve">La Figura 14 presenta la pantalla del asistente descrita en la sección 13.3.4. Las preguntas del recepcionista viajan a la API, que las procesa con la lógica de integración de la sección 13.3.3 y responde con texto y datos estructurados; cada respuesta cita la función consultada para que el usuario conozca el origen de la información. La tercera interacción muestra el límite de diseño más importante: ante una solicitud de reservar, el asistente no ejecuta ninguna transacción y orienta al usuario hacia la pantalla de confirmación, de modo que la integridad del núcleo transaccional no depende del modelo de inteligencia artificial. En la versión actual del prototipo incluido en la APK, la pantalla simula localmente estas respuestas con las mismas reglas del intérprete de respaldo; su conexión al recurso /api/asistente de la API, ya implementado, es la actividad siguiente.</w:t>
       </w:r>
     </w:p>
     <w:p>
@@ -7528,7 +8478,7 @@
         <w:pStyle w:val="APA"/>
       </w:pPr>
       <w:r>
-        <w:t xml:space="preserve">La Fase III completó esa base con los elementos que hacen verificable el diseño. Los quince requerimientos funcionales reproducen uno a uno los casos de uso, los cinco requerimientos no funcionales fijan criterios comprobables de seguridad, integridad, rendimiento, usabilidad y trazabilidad, y los marcos conceptual y contextual explican los fundamentos transaccionales y el entorno hotelero en que se usará la aplicación. El diseño de datos se completó con el modelo entidad-relación y la arquitectura de la base de datos, que concentra en el motor las reglas de integridad. El marco integrador propone un asistente de consultas en lenguaje natural con Azure OpenAI Service, descrito por sus cinco componentes (modelo de datos, modelo de inteligencia artificial, lógica de integración, interfaz de usuario e infraestructura) y limitado a funciones de lectura, de modo que agiliza la atención sin intervenir en la transacción crítica; el prototipo funcional muestra la consulta de disponibilidad, la confirmación de la reserva con el desglose de impuestos y el precio neto, el comprobante compartible por WhatsApp, la reserva rápida para huésped frecuente y el asistente. Las etapas siguientes deberán implementar la base de datos con sus scripts, construir la API con la transacción de confirmación y decidir con pruebas entre el bloqueo pesimista y la concurrencia optimista, conectar la aplicación móvil comenzando por CU-01, CU-03 y CU-04, verificar los criterios de la Tabla 3 mediante pruebas de aceptación y, por último, evaluar la conexión del asistente de inteligencia artificial.</w:t>
+        <w:t xml:space="preserve">La Fase III completó esa base con los elementos que hacen verificable el diseño. Los quince requerimientos funcionales reproducen uno a uno los casos de uso, los cinco requerimientos no funcionales fijan criterios comprobables de seguridad, integridad, rendimiento, usabilidad y trazabilidad, y los marcos conceptual y contextual explican los fundamentos transaccionales y el entorno hotelero en que se usará la aplicación. El diseño de datos se completó con el modelo entidad-relación y la arquitectura de la base de datos, que concentra en el motor las reglas de integridad. El marco integrador propone un asistente de consultas en lenguaje natural con Azure OpenAI Service, descrito por sus cinco componentes (modelo de datos, modelo de inteligencia artificial, lógica de integración, interfaz de usuario e infraestructura) y limitado a funciones de lectura, de modo que agiliza la atención sin intervenir en la transacción crítica; el prototipo funcional muestra la consulta de disponibilidad, la confirmación de la reserva con el desglose de impuestos y el precio neto, el comprobante compartible por WhatsApp, la reserva rápida para huésped frecuente y el asistente. En las entregas S10 a S12 se construyó la API REST HotelReservas.Api con la transacción de confirmación sobre el procedimiento almacenado, el control de concurrencia pesimista en la confirmación y optimista en los cambios de estado, los recursos de huésped frecuente y comprobante compartible, y el servicio de inteligencia artificial implementado como componente de la lógica de negocio, con un intérprete de reglas de respaldo que garantiza su funcionamiento sin conexión. Las etapas siguientes deberán conectar la aplicación móvil a la API comenzando por CU-01, CU-03 y CU-04, verificar los criterios de la Tabla 3 mediante pruebas de aceptación, incluida la prueba de dos sesiones concurrentes sobre la API, y configurar el recurso de Azure OpenAI para medir con usuarios el resultado esperado del asistente.</w:t>
       </w:r>
     </w:p>
     <w:p>

</xml_diff>

<commit_message>
Documento maestro: conclusiones resumidas en dos párrafos
</commit_message>
<xml_diff>
--- a/docs/FaseII_y_III_Documentacion_Proyecto_Hotel_Reservas.docx
+++ b/docs/FaseII_y_III_Documentacion_Proyecto_Hotel_Reservas.docx
@@ -756,7 +756,7 @@
               <w:fldChar w:fldCharType="begin"/>
               <w:instrText xml:space="preserve"> PAGEREF _Toc240726555 \h </w:instrText>
               <w:fldChar w:fldCharType="separate"/>
-              <w:t>68</w:t>
+              <w:t>67</w:t>
               <w:fldChar w:fldCharType="end"/>
             </w:r>
           </w:hyperlink>
@@ -8470,15 +8470,15 @@
         <w:pStyle w:val="APA"/>
       </w:pPr>
       <w:r>
-        <w:t>El trabajo de análisis y diseño de esta etapa convirtió la propuesta formulada en la Fase I en una solución organizada. El objetivo general responde directamente al problema y los cinco objetivos específicos se desarrollan dentro del documento. La arquitectura concentra las transacciones en el servidor y la base de datos; el modelo de casos de uso reúne quince funciones distribuidas entre dos actores y sitúa la confirmación de reservas como proceso central; el diagrama de clases estructura esas funciones por medio de las entidades, relaciones y operaciones del dominio; el modelo relacional las traduce en nueve tablas de SQL Server con claves y reglas destinadas a impedir superposiciones; y la matriz demuestra la correspondencia entre las decisiones de diseño y las necesidades detectadas. En síntesis, la prevención de reservas duplicadas queda incorporada a la solución técnica y deja de depender únicamente del cuidado de los colaboradores.</w:t>
-      </w:r>
-    </w:p>
-    <w:p>
-      <w:pPr>
-        <w:pStyle w:val="APA"/>
-      </w:pPr>
-      <w:r>
-        <w:t xml:space="preserve">La Fase III completó esa base con los elementos que hacen verificable el diseño. Los quince requerimientos funcionales reproducen uno a uno los casos de uso, los cinco requerimientos no funcionales fijan criterios comprobables de seguridad, integridad, rendimiento, usabilidad y trazabilidad, y los marcos conceptual y contextual explican los fundamentos transaccionales y el entorno hotelero en que se usará la aplicación. El diseño de datos se completó con el modelo entidad-relación y la arquitectura de la base de datos, que concentra en el motor las reglas de integridad. El marco integrador propone un asistente de consultas en lenguaje natural con Azure OpenAI Service, descrito por sus cinco componentes (modelo de datos, modelo de inteligencia artificial, lógica de integración, interfaz de usuario e infraestructura) y limitado a funciones de lectura, de modo que agiliza la atención sin intervenir en la transacción crítica; el prototipo funcional muestra la consulta de disponibilidad, la confirmación de la reserva con el desglose de impuestos y el precio neto, el comprobante compartible por WhatsApp, la reserva rápida para huésped frecuente y el asistente. En las entregas S10 a S12 se construyó la API REST HotelReservas.Api con la transacción de confirmación sobre el procedimiento almacenado, el control de concurrencia pesimista en la confirmación y optimista en los cambios de estado, los recursos de huésped frecuente y comprobante compartible, y el servicio de inteligencia artificial implementado como componente de la lógica de negocio, con un intérprete de reglas de respaldo que garantiza su funcionamiento sin conexión. Las etapas siguientes deberán conectar la aplicación móvil a la API comenzando por CU-01, CU-03 y CU-04, verificar los criterios de la Tabla 3 mediante pruebas de aceptación, incluida la prueba de dos sesiones concurrentes sobre la API, y configurar el recurso de Azure OpenAI para medir con usuarios el resultado esperado del asistente.</w:t>
+        <w:t xml:space="preserve">El análisis y diseño de las Fases II y III convirtió la propuesta de la Fase I en una solución verificable. El objetivo general responde al problema de la sobreventa y los objetivos específicos se desarrollan en el documento: la arquitectura en capas concentra las transacciones en la API y en SQL Server; los quince casos de uso, el diagrama de clases, el modelo entidad-relación y las nueve tablas comparten las mismas entidades y cardinalidades; los dieciocho requerimientos funcionales y los cinco no funcionales fijan criterios comprobables de seguridad, integridad, rendimiento, usabilidad y trazabilidad; y los marcos conceptual y contextual sustentan las decisiones en los fundamentos transaccionales y en el entorno hotelero. De este modo, la prevención de reservas duplicadas queda incorporada en el motor de datos y deja de depender del cuidado de los colaboradores.</w:t>
+      </w:r>
+    </w:p>
+    <w:p>
+      <w:pPr>
+        <w:pStyle w:val="APA"/>
+      </w:pPr>
+      <w:r>
+        <w:t xml:space="preserve">Las entregas S10 a S12 llevaron ese diseño a la implementación. El prototipo funcional de la APK incorpora el desglose de impuestos y el precio neto, el comprobante compartible por WhatsApp y la reserva rápida para huésped frecuente; la API REST HotelReservas.Api materializa la lógica de negocio y el acceso a datos, con la confirmación sobre el procedimiento almacenado con bloqueo, concurrencia optimista en los cambios de estado y seguridad por token; y el servicio de inteligencia artificial, descrito por sus cinco componentes, quedó implementado como un asistente de solo lectura con un intérprete de reglas de respaldo, de manera que agiliza la atención sin intervenir en la transacción crítica. Las actividades siguientes son conectar la aplicación móvil a la API, verificar los criterios de la Tabla 3 mediante pruebas de aceptación, incluida la de dos sesiones concurrentes, y configurar el recurso de Azure OpenAI para medir con usuarios el resultado esperado del asistente.</w:t>
       </w:r>
     </w:p>
     <w:p>

</xml_diff>

<commit_message>
Entrega S12: documento maestro con inicio de sesión, roles, total con IVA y módulo de administración
</commit_message>
<xml_diff>
--- a/docs/FaseII_y_III_Documentacion_Proyecto_Hotel_Reservas.docx
+++ b/docs/FaseII_y_III_Documentacion_Proyecto_Hotel_Reservas.docx
@@ -147,7 +147,7 @@
         </w:rPr>
         <w:t>BOGOTÁ D.C.</w:t>
         <w:br/>
-        <w:t>16 de octubre de 2026</w:t>
+        <w:t>18 de octubre de 2026</w:t>
       </w:r>
     </w:p>
     <w:p>
@@ -546,7 +546,7 @@
               <w:fldChar w:fldCharType="begin"/>
               <w:instrText xml:space="preserve"> PAGEREF _TocF31005 \h </w:instrText>
               <w:fldChar w:fldCharType="separate"/>
-              <w:t>37</w:t>
+              <w:t>38</w:t>
               <w:fldChar w:fldCharType="end"/>
             </w:r>
           </w:hyperlink>
@@ -721,7 +721,7 @@
               <w:fldChar w:fldCharType="begin"/>
               <w:instrText xml:space="preserve"> PAGEREF _Toc240726554 \h </w:instrText>
               <w:fldChar w:fldCharType="separate"/>
-              <w:t>66</w:t>
+              <w:t>72</w:t>
               <w:fldChar w:fldCharType="end"/>
             </w:r>
           </w:hyperlink>
@@ -756,7 +756,7 @@
               <w:fldChar w:fldCharType="begin"/>
               <w:instrText xml:space="preserve"> PAGEREF _Toc240726555 \h </w:instrText>
               <w:fldChar w:fldCharType="separate"/>
-              <w:t>67</w:t>
+              <w:t>73</w:t>
               <w:fldChar w:fldCharType="end"/>
             </w:r>
           </w:hyperlink>
@@ -3647,7 +3647,7 @@
                 <w:sz w:val="20"/>
                 <w:szCs w:val="20"/>
               </w:rPr>
-              <w:t xml:space="preserve">Permitir el inicio de sesión con correo y contraseña y asignar las funciones disponibles según el perfil (recepcionista o administrador).</w:t>
+              <w:t xml:space="preserve">Permitir el inicio de sesión con correo y contraseña y asignar las funciones disponibles según el perfil (recepcionista o administrador); rechazar las credenciales incorrectas y cerrar la sesión a petición del usuario.</w:t>
             </w:r>
           </w:p>
         </w:tc>
@@ -3681,7 +3681,7 @@
                 <w:sz w:val="20"/>
                 <w:szCs w:val="20"/>
               </w:rPr>
-              <w:t xml:space="preserve">Sesión iniciada con un token válido y un menú acorde con el perfil (CU-01).</w:t>
+              <w:t xml:space="preserve">Sesión iniciada con un token válido y un menú acorde con el perfil: el módulo Administración y la cancelación de reservas solo aparecen al administrador (CU-01).</w:t>
             </w:r>
           </w:p>
         </w:tc>
@@ -3720,7 +3720,7 @@
                 <w:sz w:val="20"/>
                 <w:szCs w:val="20"/>
               </w:rPr>
-              <w:t xml:space="preserve">Registrar huésped</w:t>
+              <w:t xml:space="preserve">Registrar y gestionar huéspedes</w:t>
             </w:r>
           </w:p>
         </w:tc>
@@ -3737,7 +3737,7 @@
                 <w:sz w:val="20"/>
                 <w:szCs w:val="20"/>
               </w:rPr>
-              <w:t xml:space="preserve">Capturar tipo y número de documento, nombres, apellidos, teléfono y correo del huésped, impidiendo documentos duplicados.</w:t>
+              <w:t xml:space="preserve">Capturar tipo y número de documento, nombres, apellidos, teléfono y condición de extranjero no residente del huésped, impidiendo documentos duplicados; permitir al administrador consultar, editar y eliminar clientes, sin borrar los que tengan reservas registradas.</w:t>
             </w:r>
           </w:p>
         </w:tc>
@@ -3754,7 +3754,7 @@
                 <w:sz w:val="20"/>
                 <w:szCs w:val="20"/>
               </w:rPr>
-              <w:t xml:space="preserve">Recepcionista</w:t>
+              <w:t xml:space="preserve">Recepcionista, administrador</w:t>
             </w:r>
           </w:p>
         </w:tc>
@@ -3771,7 +3771,7 @@
                 <w:sz w:val="20"/>
                 <w:szCs w:val="20"/>
               </w:rPr>
-              <w:t xml:space="preserve">Huésped almacenado con identificador único y disponible para asociarse a reservas (CU-02).</w:t>
+              <w:t xml:space="preserve">Huésped almacenado con identificador único y disponible para asociarse a reservas; cliente con reservas conservado para no perder el historial (CU-02).</w:t>
             </w:r>
           </w:p>
         </w:tc>
@@ -4817,7 +4817,7 @@
                 <w:sz w:val="20"/>
                 <w:szCs w:val="20"/>
               </w:rPr>
-              <w:t xml:space="preserve">Crear, activar o desactivar cuentas del personal y asignarles el perfil.</w:t>
+              <w:t xml:space="preserve">Crear, consultar, editar, eliminar, desactivar y reactivar las cuentas del personal y asignarles el perfil, con contraseña protegida mediante hash; un usuario con movimientos en la bitácora se desactiva en lugar de borrarse y la cuenta de administrador está protegida contra la eliminación y el cambio de rol.</w:t>
             </w:r>
           </w:p>
         </w:tc>
@@ -4851,7 +4851,7 @@
                 <w:sz w:val="20"/>
                 <w:szCs w:val="20"/>
               </w:rPr>
-              <w:t xml:space="preserve">Usuarios registrados con perfil y estado (CU-14).</w:t>
+              <w:t xml:space="preserve">Usuarios registrados con perfil y estado; trazabilidad de la bitácora conservada y al menos la cuenta de administrador siempre disponible (CU-14).</w:t>
             </w:r>
           </w:p>
         </w:tc>
@@ -8192,15 +8192,15 @@
         <w:pStyle w:val="APA"/>
       </w:pPr>
       <w:r>
-        <w:t xml:space="preserve">Nota. Elaboración propia. Captura del prototipo funcional incluido en la APK; la etiqueta de huésped frecuente y la casilla de exención del IVA corresponden a RF18 y RF16.</w:t>
-      </w:r>
-    </w:p>
-    <w:p>
-      <w:pPr>
-        <w:pStyle w:val="APA"/>
-      </w:pPr>
-      <w:r>
-        <w:t xml:space="preserve">La Figura 11 corresponde a la confirmación de la reserva, la transacción crítica del sistema. La pantalla reúne al huésped, la habitación, las fechas y el precio calculado con la tarifa vigente, desglosado en subtotal de alojamiento, IVA del 19 % y precio neto, que es el valor que se registra como pago; la casilla de huésped extranjero no residente aplica la exención del IVA y recalcula el neto antes de confirmar (RF16). Al pulsar Confirmar reserva, la API ejecuta en el motor de datos el procedimiento de confirmación descrito en la sección 7.4, que vuelve a verificar la disponibilidad con bloqueo y registra en una sola unidad de trabajo la reserva, el pago, el comprobante y la anotación de bitácora. Si otra sesión tomó la habitación, la API responde con el código 409 y la pantalla informa que la habitación ya no está disponible, sin que quede ningún dato parcial. El código de reserva y el número de comprobante que se muestran provienen de la secuencia y de la tabla COMPROBANTE.</w:t>
+        <w:t xml:space="preserve">Nota. Elaboración propia. Captura del prototipo funcional incluido en la APK (versión 0.4); la fila Total con IVA y el campo Total a pagar muestran el valor final que se registra como pago, y la casilla de exención del IVA corresponde a RF16.</w:t>
+      </w:r>
+    </w:p>
+    <w:p>
+      <w:pPr>
+        <w:pStyle w:val="APA"/>
+      </w:pPr>
+      <w:r>
+        <w:t xml:space="preserve">La Figura 11 corresponde a la confirmación de la reserva, la transacción crítica del sistema. La pantalla reúne al huésped, la habitación, las fechas y el precio calculado con la tarifa vigente, desglosado en subtotal de alojamiento, IVA del 19 % y total con IVA, que es el valor que se registra como pago y se repite en el campo Total a pagar y en el mensaje de confirmación; la casilla de huésped extranjero no residente aplica la exención del IVA y recalcula el neto antes de confirmar (RF16). Al pulsar Confirmar reserva, la API ejecuta en el motor de datos el procedimiento de confirmación descrito en la sección 7.4, que vuelve a verificar la disponibilidad con bloqueo y registra en una sola unidad de trabajo la reserva, el pago, el comprobante y la anotación de bitácora. Si otra sesión tomó la habitación, la API responde con el código 409 y la pantalla informa que la habitación ya no está disponible, sin que quede ningún dato parcial. El código de reserva y el número de comprobante que se muestran provienen de la secuencia y de la tabla COMPROBANTE.</w:t>
       </w:r>
     </w:p>
     <w:p>
@@ -8279,7 +8279,7 @@
         <w:pStyle w:val="APA"/>
       </w:pPr>
       <w:r>
-        <w:t xml:space="preserve">La Figura 12 muestra el resultado de la confirmación: el mensaje de éxito con el código de reserva, el número de comprobante y el precio neto, seguido del comprobante compartible. La aplicación solicita a la API el texto del comprobante, que se construye en el servidor con los datos ya registrados en la transacción (código, huésped, habitación, fechas, subtotal, impuesto, precio neto, medio de pago y estado) y lo entrega a WhatsApp con el número de teléfono del huésped, o lo copia al portapapeles cuando el huésped prefiere otro canal. Esta función responde a la problemática de la Fase I, pues el huésped recibe de inmediato una evidencia escrita de su reserva, y está disponible también desde el historial para cualquier reserva confirmada o en casa.</w:t>
+        <w:t xml:space="preserve">La Figura 12 muestra el resultado de la confirmación: el mensaje de éxito con el código de reserva, el número de comprobante y el desglose subtotal más IVA igual a total con IVA, seguido del comprobante compartible. La aplicación solicita a la API el texto del comprobante, que se construye en el servidor con los datos ya registrados en la transacción (código, huésped, habitación, fechas, subtotal, impuesto, total con IVA, medio de pago y estado) y lo entrega a WhatsApp con el número de teléfono del huésped, o lo copia al portapapeles cuando el huésped prefiere otro canal. Esta función responde a la problemática de la Fase I, pues el huésped recibe de inmediato una evidencia escrita de su reserva, y está disponible también desde el historial para cualquier reserva confirmada o en casa.</w:t>
       </w:r>
     </w:p>
     <w:p>
@@ -8443,6 +8443,243 @@
     <w:p>
       <w:pPr>
         <w:pStyle w:val="APA"/>
+        <w:ind w:firstLine="0"/>
+        <w:jc w:val="center"/>
+        <w:keepNext/>
+        <w:spacing w:line="240" w:lineRule="auto"/>
+      </w:pPr>
+      <w:r>
+        <w:drawing>
+          <wp:inline distT="0" distB="0" distL="0" distR="0">
+            <wp:extent cx="2600000" cy="5631000"/>
+            <wp:effectExtent l="0" t="0" r="0" b="0"/>
+            <wp:docPr id="913" name="Figura 15 inicio de sesión"/>
+            <wp:cNvGraphicFramePr>
+              <a:graphicFrameLocks xmlns:a="http://schemas.openxmlformats.org/drawingml/2006/main" noChangeAspect="1"/>
+            </wp:cNvGraphicFramePr>
+            <a:graphic xmlns:a="http://schemas.openxmlformats.org/drawingml/2006/main">
+              <a:graphicData uri="http://schemas.openxmlformats.org/drawingml/2006/picture">
+                <pic:pic xmlns:pic="http://schemas.openxmlformats.org/drawingml/2006/picture">
+                  <pic:nvPicPr>
+                    <pic:cNvPr id="0" name="Figura 15 inicio de sesión"/>
+                    <pic:cNvPicPr/>
+                  </pic:nvPicPr>
+                  <pic:blipFill>
+                    <a:blip r:embed="rIdP6"/>
+                    <a:stretch>
+                      <a:fillRect/>
+                    </a:stretch>
+                  </pic:blipFill>
+                  <pic:spPr>
+                    <a:xfrm>
+                      <a:off x="0" y="0"/>
+                      <a:ext cx="2600000" cy="5631000"/>
+                    </a:xfrm>
+                    <a:prstGeom prst="rect">
+                      <a:avLst/>
+                    </a:prstGeom>
+                  </pic:spPr>
+                </pic:pic>
+              </a:graphicData>
+            </a:graphic>
+          </wp:inline>
+        </w:drawing>
+      </w:r>
+    </w:p>
+    <w:p>
+      <w:pPr>
+        <w:pStyle w:val="APA"/>
+        <w:ind w:firstLine="0"/>
+        <w:rPr>
+          <w:b/>
+          <w:bCs/>
+        </w:rPr>
+      </w:pPr>
+      <w:r>
+        <w:rPr>
+          <w:b/>
+          <w:bCs/>
+        </w:rPr>
+        <w:t xml:space="preserve">Figura 15 Prototipo de la pantalla Iniciar sesión con los dos perfiles del sistema (CU-01, RF01, RNF01)</w:t>
+      </w:r>
+    </w:p>
+    <w:p>
+      <w:pPr>
+        <w:pStyle w:val="APA"/>
+      </w:pPr>
+      <w:r>
+        <w:t xml:space="preserve">Nota. Elaboración propia. Captura del prototipo funcional incluido en la APK (versión 0.4). Los usuarios de prueba corresponden al script 06 del repositorio, que almacena las contraseñas como hash PBKDF2.</w:t>
+      </w:r>
+    </w:p>
+    <w:p>
+      <w:pPr>
+        <w:pStyle w:val="APA"/>
+      </w:pPr>
+      <w:r>
+        <w:t xml:space="preserve">La Figura 15 presenta la pantalla de inicio de sesión, que en la versión 0.4 del prototipo es la primera que ve el usuario y la única accesible sin autenticarse. El recepcionista o el administrador digita su correo y su contraseña; la aplicación envía las credenciales al recurso /api/auth/login, que busca el usuario activo en la tabla USUARIO, verifica el hash PBKDF2 de la contraseña y, si coincide, emite un token JWT con el nombre y el rol del usuario; si no coincide, responde con el código 401 y la pantalla informa que el correo o la contraseña son incorrectos. A partir de ese momento el rol determina lo que la aplicación muestra: ambos perfiles acceden a reservas, habitaciones, historial y asistente, mientras que el módulo Administración y el botón de cancelar reserva aparecen únicamente al administrador, en correspondencia con RNF01. La tarjeta Sesión de la pantalla de inicio muestra el nombre y el perfil del usuario autenticado y permite cerrar la sesión, y cada movimiento que se registra en la bitácora queda asociado al usuario de la sesión activa.</w:t>
+      </w:r>
+    </w:p>
+    <w:p>
+      <w:pPr>
+        <w:pStyle w:val="APA"/>
+        <w:ind w:firstLine="0"/>
+        <w:jc w:val="center"/>
+        <w:keepNext/>
+        <w:spacing w:line="240" w:lineRule="auto"/>
+      </w:pPr>
+      <w:r>
+        <w:drawing>
+          <wp:inline distT="0" distB="0" distL="0" distR="0">
+            <wp:extent cx="2600000" cy="5631000"/>
+            <wp:effectExtent l="0" t="0" r="0" b="0"/>
+            <wp:docPr id="914" name="Figura 16 administración de usuarios"/>
+            <wp:cNvGraphicFramePr>
+              <a:graphicFrameLocks xmlns:a="http://schemas.openxmlformats.org/drawingml/2006/main" noChangeAspect="1"/>
+            </wp:cNvGraphicFramePr>
+            <a:graphic xmlns:a="http://schemas.openxmlformats.org/drawingml/2006/main">
+              <a:graphicData uri="http://schemas.openxmlformats.org/drawingml/2006/picture">
+                <pic:pic xmlns:pic="http://schemas.openxmlformats.org/drawingml/2006/picture">
+                  <pic:nvPicPr>
+                    <pic:cNvPr id="0" name="Figura 16 administración de usuarios"/>
+                    <pic:cNvPicPr/>
+                  </pic:nvPicPr>
+                  <pic:blipFill>
+                    <a:blip r:embed="rIdP7"/>
+                    <a:stretch>
+                      <a:fillRect/>
+                    </a:stretch>
+                  </pic:blipFill>
+                  <pic:spPr>
+                    <a:xfrm>
+                      <a:off x="0" y="0"/>
+                      <a:ext cx="2600000" cy="5631000"/>
+                    </a:xfrm>
+                    <a:prstGeom prst="rect">
+                      <a:avLst/>
+                    </a:prstGeom>
+                  </pic:spPr>
+                </pic:pic>
+              </a:graphicData>
+            </a:graphic>
+          </wp:inline>
+        </w:drawing>
+      </w:r>
+    </w:p>
+    <w:p>
+      <w:pPr>
+        <w:pStyle w:val="APA"/>
+        <w:ind w:firstLine="0"/>
+        <w:rPr>
+          <w:b/>
+          <w:bCs/>
+        </w:rPr>
+      </w:pPr>
+      <w:r>
+        <w:rPr>
+          <w:b/>
+          <w:bCs/>
+        </w:rPr>
+        <w:t xml:space="preserve">Figura 16 Prototipo del módulo Administración, gestión de usuarios del sistema (CU-14, RF14)</w:t>
+      </w:r>
+    </w:p>
+    <w:p>
+      <w:pPr>
+        <w:pStyle w:val="APA"/>
+      </w:pPr>
+      <w:r>
+        <w:t xml:space="preserve">Nota. Elaboración propia. La cuenta de administrador aparece con el botón de eliminación deshabilitado; los recepcionistas se pueden editar, eliminar, desactivar y reactivar.</w:t>
+      </w:r>
+    </w:p>
+    <w:p>
+      <w:pPr>
+        <w:pStyle w:val="APA"/>
+      </w:pPr>
+      <w:r>
+        <w:t xml:space="preserve">La Figura 16 corresponde a la gestión de usuarios del módulo Administración, disponible solo para el perfil administrador. La lista muestra cada cuenta con su correo, su rol, su estado y el número de movimientos que ha dejado en la bitácora, y ofrece las operaciones de crear, editar y eliminar sobre los recursos /api/usuarios. Al crear o editar, la aplicación valida que el nombre y el correo estén presentes, que el correo no esté repetido (la API responde 409 cuando viola la restricción de unicidad) y que la contraseña tenga al menos ocho caracteres; la contraseña nunca se almacena en claro, sino como hash PBKDF2. La eliminación aplica dos reglas de integridad: un recepcionista que ya registró reservas o cambios de estado no se borra físicamente, porque las claves foráneas de RESERVA y de BITACORA_RESERVA lo impiden y se perdería la trazabilidad exigida por RNF05, sino que se desactiva y deja de poder iniciar sesión, con la posibilidad de reactivarlo; y la cuenta de administrador está protegida, de modo que no puede eliminarse, desactivarse ni cambiar de rol, lo que garantiza que el hotel conserve siempre un usuario capaz de administrar el sistema.</w:t>
+      </w:r>
+    </w:p>
+    <w:p>
+      <w:pPr>
+        <w:pStyle w:val="APA"/>
+        <w:ind w:firstLine="0"/>
+        <w:jc w:val="center"/>
+        <w:keepNext/>
+        <w:spacing w:line="240" w:lineRule="auto"/>
+      </w:pPr>
+      <w:r>
+        <w:drawing>
+          <wp:inline distT="0" distB="0" distL="0" distR="0">
+            <wp:extent cx="2600000" cy="5631000"/>
+            <wp:effectExtent l="0" t="0" r="0" b="0"/>
+            <wp:docPr id="915" name="Figura 17 administración de clientes"/>
+            <wp:cNvGraphicFramePr>
+              <a:graphicFrameLocks xmlns:a="http://schemas.openxmlformats.org/drawingml/2006/main" noChangeAspect="1"/>
+            </wp:cNvGraphicFramePr>
+            <a:graphic xmlns:a="http://schemas.openxmlformats.org/drawingml/2006/main">
+              <a:graphicData uri="http://schemas.openxmlformats.org/drawingml/2006/picture">
+                <pic:pic xmlns:pic="http://schemas.openxmlformats.org/drawingml/2006/picture">
+                  <pic:nvPicPr>
+                    <pic:cNvPr id="0" name="Figura 17 administración de clientes"/>
+                    <pic:cNvPicPr/>
+                  </pic:nvPicPr>
+                  <pic:blipFill>
+                    <a:blip r:embed="rIdP8"/>
+                    <a:stretch>
+                      <a:fillRect/>
+                    </a:stretch>
+                  </pic:blipFill>
+                  <pic:spPr>
+                    <a:xfrm>
+                      <a:off x="0" y="0"/>
+                      <a:ext cx="2600000" cy="5631000"/>
+                    </a:xfrm>
+                    <a:prstGeom prst="rect">
+                      <a:avLst/>
+                    </a:prstGeom>
+                  </pic:spPr>
+                </pic:pic>
+              </a:graphicData>
+            </a:graphic>
+          </wp:inline>
+        </w:drawing>
+      </w:r>
+    </w:p>
+    <w:p>
+      <w:pPr>
+        <w:pStyle w:val="APA"/>
+        <w:ind w:firstLine="0"/>
+        <w:rPr>
+          <w:b/>
+          <w:bCs/>
+        </w:rPr>
+      </w:pPr>
+      <w:r>
+        <w:rPr>
+          <w:b/>
+          <w:bCs/>
+        </w:rPr>
+        <w:t xml:space="preserve">Figura 17 Prototipo del módulo Administración, gestión de clientes o huéspedes (CU-02, RF02)</w:t>
+      </w:r>
+    </w:p>
+    <w:p>
+      <w:pPr>
+        <w:pStyle w:val="APA"/>
+      </w:pPr>
+      <w:r>
+        <w:t xml:space="preserve">Nota. Elaboración propia. Las etiquetas de huésped frecuente y de exención del IVA se calculan a partir de las reservas registradas y de la condición de extranjero no residente.</w:t>
+      </w:r>
+    </w:p>
+    <w:p>
+      <w:pPr>
+        <w:pStyle w:val="APA"/>
+      </w:pPr>
+      <w:r>
+        <w:t xml:space="preserve">La Figura 17 muestra la gestión de clientes del mismo módulo. El administrador consulta la lista de huéspedes con su documento, su teléfono, su número de estadías y sus reservas activas, y puede crear, editar y eliminar registros mediante los recursos /api/huespedes. El formulario captura el nombre, el tipo y número de documento, el teléfono al que se envía el comprobante por WhatsApp y la condición de extranjero no residente que activa la exención del IVA de RF16; el documento es único, por lo que un duplicado se rechaza con el código 409. Un cliente con reservas registradas no se puede eliminar, porque la clave foránea de RESERVA lo referencia y su historial sustenta la reserva rápida de RF18; en ese caso la aplicación lo informa y permite corregir sus datos. Los clientes creados desde este módulo quedan disponibles de inmediato en la lista de huéspedes de la pantalla de confirmación de la Figura 11.</w:t>
+      </w:r>
+    </w:p>
+    <w:p>
+      <w:pPr>
+        <w:pStyle w:val="APA"/>
         <w:jc w:val="center"/>
         <w:outlineLvl w:val="0"/>
         <w:rPr>
@@ -8470,15 +8707,15 @@
         <w:pStyle w:val="APA"/>
       </w:pPr>
       <w:r>
-        <w:t xml:space="preserve">El análisis y diseño de las Fases II y III convirtió la propuesta de la Fase I en una solución verificable. El objetivo general responde al problema de la sobreventa y los objetivos específicos se desarrollan en el documento: la arquitectura en capas concentra las transacciones en la API y en SQL Server; los quince casos de uso, el diagrama de clases, el modelo entidad-relación y las nueve tablas comparten las mismas entidades y cardinalidades; los dieciocho requerimientos funcionales y los cinco no funcionales fijan criterios comprobables de seguridad, integridad, rendimiento, usabilidad y trazabilidad; y los marcos conceptual y contextual sustentan las decisiones en los fundamentos transaccionales y en el entorno hotelero. De este modo, la prevención de reservas duplicadas queda incorporada en el motor de datos y deja de depender del cuidado de los colaboradores.</w:t>
-      </w:r>
-    </w:p>
-    <w:p>
-      <w:pPr>
-        <w:pStyle w:val="APA"/>
-      </w:pPr>
-      <w:r>
-        <w:t xml:space="preserve">Las entregas S10 a S12 llevaron ese diseño a la implementación. El prototipo funcional de la APK incorpora el desglose de impuestos y el precio neto, el comprobante compartible por WhatsApp y la reserva rápida para huésped frecuente; la API REST HotelReservas.Api materializa la lógica de negocio y el acceso a datos, con la confirmación sobre el procedimiento almacenado con bloqueo, concurrencia optimista en los cambios de estado y seguridad por token; y el servicio de inteligencia artificial, descrito por sus cinco componentes, quedó implementado como un asistente de solo lectura con un intérprete de reglas de respaldo, de manera que agiliza la atención sin intervenir en la transacción crítica. Las actividades siguientes son conectar la aplicación móvil a la API, verificar los criterios de la Tabla 3 mediante pruebas de aceptación, incluida la de dos sesiones concurrentes, y configurar el recurso de Azure OpenAI para medir con usuarios el resultado esperado del asistente.</w:t>
+        <w:t xml:space="preserve">El análisis y diseño de las Fases II y III convirtió la propuesta de la Fase I en una solución verificable. El objetivo general responde al problema de la sobreventa y los objetivos específicos se desarrollan en el documento: la arquitectura en capas concentra las transacciones en la API y en SQL Server; los quince casos de uso, el diagrama de clases, el modelo entidad-relación y las nueve tablas comparten las mismas entidades y cardinalidades; los dieciocho requerimientos funcionales y los cinco no funcionales fijan criterios comprobables de seguridad, integridad, rendimiento, usabilidad y trazabilidad; y los marcos conceptual y contextual sustentan las decisiones en los fundamentos transaccionales y en el entorno hotelero. Así, la prevención de reservas duplicadas queda incorporada en el motor de datos.</w:t>
+      </w:r>
+    </w:p>
+    <w:p>
+      <w:pPr>
+        <w:pStyle w:val="APA"/>
+      </w:pPr>
+      <w:r>
+        <w:t xml:space="preserve">Las entregas S10 a S12 llevaron ese diseño a la implementación. El prototipo funcional de la APK incorpora el inicio de sesión con los perfiles de recepcionista y administrador, el desglose de impuestos con el total con IVA, el comprobante compartible por WhatsApp, la reserva rápida para huésped frecuente y el módulo de administración de usuarios y clientes reservado al administrador; la API REST HotelReservas.Api materializa la lógica de negocio y el acceso a datos, con la confirmación sobre el procedimiento almacenado con bloqueo, concurrencia optimista y seguridad por token; y el servicio de inteligencia artificial quedó implementado como un asistente de solo lectura con un intérprete de reglas de respaldo, que agiliza la atención sin intervenir en la transacción crítica. Las actividades siguientes son conectar la aplicación móvil a la API, verificar los criterios de la Tabla 3 con pruebas de aceptación, incluida la de dos sesiones concurrentes, y configurar Azure OpenAI para medir con usuarios el resultado del asistente.</w:t>
       </w:r>
     </w:p>
     <w:p>

</xml_diff>